<commit_message>
feat(comercial): proposta PTC — só o serviço ofertado, docs, CQ e dias
Fecha o conteúdo da proposta conforme o padrão:
- Fontes pretas (some o vermelho de revisão do template).
- Blocos de descrição condicionais: só entra o serviço selecionado (corte,
  solda, jato, pintura) — os demais somem. Escopo idem.
- "Documentos referentes" traz os nomes dos arquivos anexados (loop).
- Descrição do corte lista os perfis usados (W200x… × barras) + material/espessura.
- Controle de qualidade por serviço: corte → "dimensional"; solda →
  "dimensional e visual de soldagem".
- Tabela comercial só com as linhas dos serviços ofertados (loop, numeração ok).
- Dias de pagamento: campo no Resumo (OrcamentoServico.diasPagamento via SQL)
  entra no texto de pagamentos.

Template re-tagueado com docxtemplater (condicionais/loops); render validado.

Co-Authored-By: Claude Opus 4.8 (1M context) <noreply@anthropic.com>
</commit_message>
<xml_diff>
--- a/templates/proposta-servico.docx
+++ b/templates/proposta-servico.docx
@@ -15,87 +15,87 @@
       <w:r>
         <w:rPr>
           <w:rFonts w:ascii="Arial" w:hAnsi="Arial" w:cs="Arial"/>
+          <w:color w:val="000000"/>
+          <w:sz w:val="20"/>
+        </w:rPr>
+        <w:t>Proposta {numeroPtc}</w:t>
+      </w:r>
+      <w:r>
+        <w:rPr>
+          <w:rFonts w:ascii="Arial" w:hAnsi="Arial" w:cs="Arial"/>
+          <w:color w:val="000000"/>
+          <w:sz w:val="20"/>
+        </w:rPr>
+      </w:r>
+      <w:r>
+        <w:rPr>
+          <w:rFonts w:ascii="Arial" w:hAnsi="Arial" w:cs="Arial"/>
+          <w:color w:val="000000"/>
+          <w:sz w:val="20"/>
+        </w:rPr>
+      </w:r>
+      <w:r>
+        <w:rPr>
+          <w:rFonts w:ascii="Arial" w:hAnsi="Arial" w:cs="Arial"/>
+          <w:color w:val="000000"/>
+          <w:sz w:val="20"/>
+          <w:lang w:val="pt-BR"/>
+        </w:rPr>
+      </w:r>
+      <w:r>
+        <w:rPr>
+          <w:rFonts w:ascii="Arial" w:hAnsi="Arial" w:cs="Arial"/>
+          <w:color w:val="000000"/>
+          <w:sz w:val="20"/>
+        </w:rPr>
+      </w:r>
+      <w:r>
+        <w:rPr>
+          <w:rFonts w:ascii="Arial" w:hAnsi="Arial" w:cs="Arial"/>
+          <w:color w:val="000000"/>
+          <w:sz w:val="20"/>
+          <w:lang w:val="pt-BR"/>
+        </w:rPr>
+      </w:r>
+    </w:p>
+    <w:p>
+      <w:pPr>
+        <w:pStyle w:val="Ttulo5"/>
+        <w:rPr>
+          <w:rFonts w:ascii="Arial" w:hAnsi="Arial" w:cs="Arial"/>
           <w:color w:val="FF0000"/>
           <w:sz w:val="20"/>
-        </w:rPr>
-        <w:t>Proposta {numeroPtc}</w:t>
-      </w:r>
-      <w:r>
-        <w:rPr>
-          <w:rFonts w:ascii="Arial" w:hAnsi="Arial" w:cs="Arial"/>
-          <w:color w:val="FF0000"/>
-          <w:sz w:val="20"/>
-        </w:rPr>
-      </w:r>
-      <w:r>
-        <w:rPr>
-          <w:rFonts w:ascii="Arial" w:hAnsi="Arial" w:cs="Arial"/>
-          <w:color w:val="FF0000"/>
-          <w:sz w:val="20"/>
-        </w:rPr>
-      </w:r>
-      <w:r>
-        <w:rPr>
-          <w:rFonts w:ascii="Arial" w:hAnsi="Arial" w:cs="Arial"/>
-          <w:color w:val="FF0000"/>
-          <w:sz w:val="20"/>
           <w:lang w:val="pt-BR"/>
         </w:rPr>
-      </w:r>
-      <w:r>
-        <w:rPr>
-          <w:rFonts w:ascii="Arial" w:hAnsi="Arial" w:cs="Arial"/>
-          <w:color w:val="FF0000"/>
-          <w:sz w:val="20"/>
-        </w:rPr>
-      </w:r>
-      <w:r>
-        <w:rPr>
-          <w:rFonts w:ascii="Arial" w:hAnsi="Arial" w:cs="Arial"/>
-          <w:color w:val="FF0000"/>
+      </w:pPr>
+      <w:r>
+        <w:rPr>
+          <w:rFonts w:ascii="Arial" w:hAnsi="Arial" w:cs="Arial"/>
+          <w:color w:val="000000"/>
           <w:sz w:val="20"/>
           <w:lang w:val="pt-BR"/>
         </w:rPr>
-      </w:r>
-    </w:p>
-    <w:p>
-      <w:pPr>
-        <w:pStyle w:val="Ttulo5"/>
-        <w:rPr>
-          <w:rFonts w:ascii="Arial" w:hAnsi="Arial" w:cs="Arial"/>
-          <w:color w:val="FF0000"/>
+        <w:t>Conchal, {dataProposta}</w:t>
+      </w:r>
+      <w:r>
+        <w:rPr>
+          <w:rFonts w:ascii="Arial" w:hAnsi="Arial" w:cs="Arial"/>
+          <w:color w:val="000000"/>
+          <w:sz w:val="20"/>
+        </w:rPr>
+      </w:r>
+      <w:r>
+        <w:rPr>
+          <w:rFonts w:ascii="Arial" w:hAnsi="Arial" w:cs="Arial"/>
+          <w:color w:val="000000"/>
           <w:sz w:val="20"/>
           <w:lang w:val="pt-BR"/>
         </w:rPr>
-      </w:pPr>
-      <w:r>
-        <w:rPr>
-          <w:rFonts w:ascii="Arial" w:hAnsi="Arial" w:cs="Arial"/>
-          <w:color w:val="FF0000"/>
-          <w:sz w:val="20"/>
-          <w:lang w:val="pt-BR"/>
-        </w:rPr>
-        <w:t>Conchal, {dataProposta}</w:t>
-      </w:r>
-      <w:r>
-        <w:rPr>
-          <w:rFonts w:ascii="Arial" w:hAnsi="Arial" w:cs="Arial"/>
-          <w:color w:val="FF0000"/>
-          <w:sz w:val="20"/>
-        </w:rPr>
-      </w:r>
-      <w:r>
-        <w:rPr>
-          <w:rFonts w:ascii="Arial" w:hAnsi="Arial" w:cs="Arial"/>
-          <w:color w:val="FF0000"/>
-          <w:sz w:val="20"/>
-          <w:lang w:val="pt-BR"/>
-        </w:rPr>
-      </w:r>
-      <w:r>
-        <w:rPr>
-          <w:rFonts w:ascii="Arial" w:hAnsi="Arial" w:cs="Arial"/>
-          <w:color w:val="FF0000"/>
+      </w:r>
+      <w:r>
+        <w:rPr>
+          <w:rFonts w:ascii="Arial" w:hAnsi="Arial" w:cs="Arial"/>
+          <w:color w:val="000000"/>
           <w:sz w:val="20"/>
           <w:lang w:val="pt-BR"/>
         </w:rPr>
@@ -139,6 +139,7 @@
       <w:r>
         <w:rPr>
           <w:rFonts w:ascii="Arial" w:hAnsi="Arial" w:cs="Arial"/>
+          <w:color w:val="000000"/>
           <w:sz w:val="20"/>
           <w:szCs w:val="20"/>
         </w:rPr>
@@ -166,7 +167,7 @@
           <w:rFonts w:ascii="Arial" w:hAnsi="Arial" w:cs="Arial"/>
           <w:b/>
           <w:bCs/>
-          <w:color w:val="FF0000"/>
+          <w:color w:val="000000"/>
           <w:sz w:val="20"/>
           <w:szCs w:val="20"/>
         </w:rPr>
@@ -190,7 +191,7 @@
       <w:r>
         <w:rPr>
           <w:rFonts w:ascii="Arial" w:hAnsi="Arial" w:cs="Arial"/>
-          <w:color w:val="FF0000"/>
+          <w:color w:val="000000"/>
           <w:sz w:val="20"/>
           <w:szCs w:val="20"/>
         </w:rPr>
@@ -214,7 +215,7 @@
       <w:r>
         <w:rPr>
           <w:rFonts w:ascii="Arial" w:hAnsi="Arial" w:cs="Arial"/>
-          <w:color w:val="FF0000"/>
+          <w:color w:val="000000"/>
           <w:sz w:val="20"/>
           <w:szCs w:val="20"/>
         </w:rPr>
@@ -301,7 +302,7 @@
                 <w:rFonts w:ascii="Arial" w:hAnsi="Arial" w:cs="Arial"/>
                 <w:bCs/>
                 <w:iCs/>
-                <w:color w:val="FF0000"/>
+                <w:color w:val="000000"/>
                 <w:sz w:val="20"/>
                 <w:szCs w:val="20"/>
               </w:rPr>
@@ -332,7 +333,7 @@
               <w:rPr>
                 <w:rFonts w:ascii="Arial" w:hAnsi="Arial" w:cs="Arial"/>
                 <w:bCs/>
-                <w:color w:val="FF0000"/>
+                <w:color w:val="000000"/>
                 <w:sz w:val="20"/>
                 <w:szCs w:val="20"/>
               </w:rPr>
@@ -388,7 +389,7 @@
               <w:rPr>
                 <w:rFonts w:ascii="Arial" w:hAnsi="Arial" w:cs="Arial"/>
                 <w:bCs/>
-                <w:color w:val="FF0000"/>
+                <w:color w:val="000000"/>
                 <w:sz w:val="20"/>
                 <w:szCs w:val="20"/>
               </w:rPr>
@@ -445,7 +446,7 @@
                 <w:rFonts w:ascii="Arial" w:hAnsi="Arial" w:cs="Arial"/>
                 <w:bCs/>
                 <w:iCs/>
-                <w:color w:val="FF0000"/>
+                <w:color w:val="000000"/>
                 <w:sz w:val="20"/>
                 <w:szCs w:val="20"/>
               </w:rPr>
@@ -455,7 +456,7 @@
               <w:rPr>
                 <w:rFonts w:ascii="Arial" w:hAnsi="Arial" w:cs="Arial"/>
                 <w:bCs/>
-                <w:color w:val="FF0000"/>
+                <w:color w:val="000000"/>
                 <w:sz w:val="20"/>
                 <w:szCs w:val="20"/>
               </w:rPr>
@@ -476,6 +477,7 @@
       <w:r>
         <w:rPr>
           <w:rFonts w:ascii="Arial" w:hAnsi="Arial" w:cs="Arial"/>
+          <w:color w:val="000000"/>
           <w:sz w:val="20"/>
           <w:szCs w:val="20"/>
         </w:rPr>
@@ -484,6 +486,7 @@
       <w:r>
         <w:rPr>
           <w:rFonts w:ascii="Arial" w:hAnsi="Arial" w:cs="Arial"/>
+          <w:color w:val="000000"/>
           <w:sz w:val="20"/>
           <w:szCs w:val="20"/>
         </w:rPr>
@@ -554,6 +557,7 @@
                 <w:rFonts w:ascii="Arial" w:hAnsi="Arial" w:cs="Arial"/>
                 <w:bCs/>
                 <w:iCs/>
+                <w:color w:val="000000"/>
                 <w:sz w:val="20"/>
                 <w:szCs w:val="20"/>
               </w:rPr>
@@ -584,7 +588,7 @@
             <w:r>
               <w:rPr>
                 <w:rFonts w:ascii="Arial" w:hAnsi="Arial" w:cs="Arial"/>
-                <w:color w:val="FF0000"/>
+                <w:color w:val="000000"/>
                 <w:sz w:val="20"/>
                 <w:szCs w:val="20"/>
               </w:rPr>
@@ -636,7 +640,7 @@
             <w:r>
               <w:rPr>
                 <w:rFonts w:ascii="Arial" w:hAnsi="Arial" w:cs="Arial"/>
-                <w:color w:val="FF0000"/>
+                <w:color w:val="000000"/>
                 <w:sz w:val="20"/>
                 <w:szCs w:val="20"/>
               </w:rPr>
@@ -645,7 +649,7 @@
             <w:r>
               <w:rPr>
                 <w:rFonts w:ascii="Arial" w:hAnsi="Arial" w:cs="Arial"/>
-                <w:color w:val="FF0000"/>
+                <w:color w:val="000000"/>
                 <w:sz w:val="20"/>
                 <w:szCs w:val="20"/>
               </w:rPr>
@@ -653,7 +657,7 @@
             <w:r>
               <w:rPr>
                 <w:rFonts w:ascii="Arial" w:hAnsi="Arial" w:cs="Arial"/>
-                <w:color w:val="FF0000"/>
+                <w:color w:val="000000"/>
                 <w:sz w:val="20"/>
                 <w:szCs w:val="20"/>
               </w:rPr>
@@ -737,7 +741,7 @@
               <w:rPr>
                 <w:rFonts w:ascii="Arial" w:hAnsi="Arial" w:cs="Arial"/>
                 <w:b/>
-                <w:color w:val="FF0000"/>
+                <w:color w:val="000000"/>
                 <w:sz w:val="20"/>
                 <w:szCs w:val="20"/>
               </w:rPr>
@@ -767,7 +771,7 @@
               <w:rPr>
                 <w:rFonts w:ascii="Arial" w:hAnsi="Arial" w:cs="Arial"/>
                 <w:b/>
-                <w:color w:val="FF0000"/>
+                <w:color w:val="000000"/>
                 <w:sz w:val="20"/>
                 <w:szCs w:val="20"/>
               </w:rPr>
@@ -797,7 +801,7 @@
               <w:rPr>
                 <w:rFonts w:ascii="Arial" w:hAnsi="Arial" w:cs="Arial"/>
                 <w:b/>
-                <w:color w:val="FF0000"/>
+                <w:color w:val="000000"/>
                 <w:sz w:val="20"/>
                 <w:szCs w:val="20"/>
               </w:rPr>
@@ -828,7 +832,7 @@
             <w:r>
               <w:rPr>
                 <w:rFonts w:ascii="Arial" w:hAnsi="Arial" w:cs="Arial"/>
-                <w:color w:val="FF0000"/>
+                <w:color w:val="000000"/>
                 <w:sz w:val="20"/>
                 <w:szCs w:val="20"/>
               </w:rPr>
@@ -857,7 +861,7 @@
             <w:r>
               <w:rPr>
                 <w:rFonts w:ascii="Arial" w:hAnsi="Arial" w:cs="Arial"/>
-                <w:color w:val="FF0000"/>
+                <w:color w:val="000000"/>
                 <w:sz w:val="20"/>
                 <w:szCs w:val="20"/>
               </w:rPr>
@@ -886,7 +890,7 @@
             <w:r>
               <w:rPr>
                 <w:rFonts w:ascii="Arial" w:hAnsi="Arial" w:cs="Arial"/>
-                <w:color w:val="FF0000"/>
+                <w:color w:val="000000"/>
                 <w:sz w:val="20"/>
                 <w:szCs w:val="20"/>
               </w:rPr>
@@ -928,6 +932,7 @@
       <w:r>
         <w:rPr>
           <w:rFonts w:ascii="Arial" w:hAnsi="Arial" w:cs="Arial"/>
+          <w:color w:val="000000"/>
           <w:sz w:val="20"/>
           <w:szCs w:val="20"/>
         </w:rPr>
@@ -936,6 +941,7 @@
       <w:r>
         <w:rPr>
           <w:rFonts w:ascii="Arial" w:hAnsi="Arial" w:cs="Arial"/>
+          <w:color w:val="000000"/>
           <w:sz w:val="20"/>
           <w:szCs w:val="20"/>
         </w:rPr>
@@ -944,6 +950,7 @@
       <w:r>
         <w:rPr>
           <w:rFonts w:ascii="Arial" w:hAnsi="Arial" w:cs="Arial"/>
+          <w:color w:val="000000"/>
           <w:sz w:val="20"/>
           <w:szCs w:val="20"/>
         </w:rPr>
@@ -952,6 +959,7 @@
       <w:r>
         <w:rPr>
           <w:rFonts w:ascii="Arial" w:hAnsi="Arial" w:cs="Arial"/>
+          <w:color w:val="000000"/>
           <w:sz w:val="20"/>
           <w:szCs w:val="20"/>
         </w:rPr>
@@ -960,6 +968,7 @@
       <w:r>
         <w:rPr>
           <w:rFonts w:ascii="Arial" w:hAnsi="Arial" w:cs="Arial"/>
+          <w:color w:val="000000"/>
           <w:sz w:val="20"/>
           <w:szCs w:val="20"/>
         </w:rPr>
@@ -968,6 +977,7 @@
       <w:r>
         <w:rPr>
           <w:rFonts w:ascii="Arial" w:hAnsi="Arial" w:cs="Arial"/>
+          <w:color w:val="000000"/>
           <w:sz w:val="20"/>
           <w:szCs w:val="20"/>
         </w:rPr>
@@ -976,6 +986,7 @@
       <w:r>
         <w:rPr>
           <w:rFonts w:ascii="Arial" w:hAnsi="Arial" w:cs="Arial"/>
+          <w:color w:val="000000"/>
           <w:sz w:val="20"/>
           <w:szCs w:val="20"/>
         </w:rPr>
@@ -984,6 +995,7 @@
       <w:r>
         <w:rPr>
           <w:rFonts w:ascii="Arial" w:hAnsi="Arial" w:cs="Arial"/>
+          <w:color w:val="000000"/>
           <w:sz w:val="20"/>
           <w:szCs w:val="20"/>
         </w:rPr>
@@ -992,6 +1004,7 @@
       <w:r>
         <w:rPr>
           <w:rFonts w:ascii="Arial" w:hAnsi="Arial" w:cs="Arial"/>
+          <w:color w:val="000000"/>
           <w:sz w:val="20"/>
           <w:szCs w:val="20"/>
         </w:rPr>
@@ -1000,6 +1013,7 @@
       <w:r>
         <w:rPr>
           <w:rFonts w:ascii="Arial" w:hAnsi="Arial" w:cs="Arial"/>
+          <w:color w:val="000000"/>
           <w:sz w:val="20"/>
           <w:szCs w:val="20"/>
         </w:rPr>
@@ -1018,6 +1032,7 @@
       <w:r>
         <w:rPr>
           <w:rFonts w:ascii="Arial" w:hAnsi="Arial" w:cs="Arial"/>
+          <w:color w:val="000000"/>
           <w:sz w:val="20"/>
           <w:szCs w:val="20"/>
         </w:rPr>
@@ -1063,6 +1078,7 @@
         <w:rPr>
           <w:rFonts w:ascii="Arial" w:hAnsi="Arial" w:cs="Arial"/>
           <w:b/>
+          <w:color w:val="000000"/>
           <w:sz w:val="20"/>
           <w:szCs w:val="20"/>
         </w:rPr>
@@ -1119,79 +1135,75 @@
       <w:r>
         <w:rPr>
           <w:rFonts w:ascii="Arial" w:hAnsi="Arial" w:cs="Arial"/>
-          <w:sz w:val="20"/>
-          <w:szCs w:val="20"/>
-        </w:rPr>
-        <w:t>Serviços de</w:t>
-      </w:r>
-      <w:r>
-        <w:rPr>
-          <w:rFonts w:ascii="Arial" w:hAnsi="Arial" w:cs="Arial"/>
-          <w:sz w:val="20"/>
-          <w:szCs w:val="20"/>
-        </w:rPr>
-        <w:t xml:space="preserve"> </w:t>
-      </w:r>
-      <w:r>
-        <w:rPr>
-          <w:rFonts w:ascii="Arial" w:hAnsi="Arial" w:cs="Arial"/>
-          <w:color w:val="EE0000"/>
-          <w:sz w:val="20"/>
-          <w:szCs w:val="20"/>
-        </w:rPr>
-        <w:t>c</w:t>
-      </w:r>
-      <w:r>
-        <w:rPr>
-          <w:rFonts w:ascii="Arial" w:hAnsi="Arial" w:cs="Arial"/>
-          <w:color w:val="EE0000"/>
-          <w:sz w:val="20"/>
-          <w:szCs w:val="20"/>
-        </w:rPr>
-        <w:t xml:space="preserve">orte a laser, furação e recorte, solda de componentes, </w:t>
-      </w:r>
-      <w:r>
-        <w:rPr>
-          <w:rFonts w:ascii="Arial" w:hAnsi="Arial" w:cs="Arial"/>
-          <w:color w:val="EE0000"/>
-          <w:sz w:val="20"/>
-          <w:szCs w:val="20"/>
-        </w:rPr>
-        <w:t>jateamento de peças, pintura de peças met</w:t>
-      </w:r>
-      <w:r>
-        <w:rPr>
-          <w:rFonts w:ascii="Arial" w:hAnsi="Arial" w:cs="Arial"/>
-          <w:color w:val="EE0000"/>
-          <w:sz w:val="20"/>
-          <w:szCs w:val="20"/>
-        </w:rPr>
-        <w:t>á</w:t>
-      </w:r>
-      <w:r>
-        <w:rPr>
-          <w:rFonts w:ascii="Arial" w:hAnsi="Arial" w:cs="Arial"/>
-          <w:color w:val="EE0000"/>
-          <w:sz w:val="20"/>
-          <w:szCs w:val="20"/>
-        </w:rPr>
-        <w:t xml:space="preserve">licas conforme projetos, documento </w:t>
-      </w:r>
-      <w:r>
-        <w:rPr>
-          <w:rFonts w:ascii="Arial" w:hAnsi="Arial" w:cs="Arial"/>
-          <w:sz w:val="20"/>
-          <w:szCs w:val="20"/>
-        </w:rPr>
-        <w:t>enviado para orçamento</w:t>
-      </w:r>
-      <w:r>
-        <w:rPr>
-          <w:rFonts w:ascii="Arial" w:hAnsi="Arial" w:cs="Arial"/>
-          <w:sz w:val="20"/>
-          <w:szCs w:val="20"/>
-        </w:rPr>
-        <w:t>:</w:t>
+          <w:color w:val="000000"/>
+          <w:sz w:val="20"/>
+          <w:szCs w:val="20"/>
+        </w:rPr>
+        <w:t>Serviços de {escopo}, conforme projetos, documentos e planilhas enviados por V.Sas.</w:t>
+      </w:r>
+      <w:r>
+        <w:rPr>
+          <w:rFonts w:ascii="Arial" w:hAnsi="Arial" w:cs="Arial"/>
+          <w:color w:val="000000"/>
+          <w:sz w:val="20"/>
+          <w:szCs w:val="20"/>
+        </w:rPr>
+      </w:r>
+      <w:r>
+        <w:rPr>
+          <w:rFonts w:ascii="Arial" w:hAnsi="Arial" w:cs="Arial"/>
+          <w:color w:val="000000"/>
+          <w:sz w:val="20"/>
+          <w:szCs w:val="20"/>
+        </w:rPr>
+      </w:r>
+      <w:r>
+        <w:rPr>
+          <w:rFonts w:ascii="Arial" w:hAnsi="Arial" w:cs="Arial"/>
+          <w:color w:val="000000"/>
+          <w:sz w:val="20"/>
+          <w:szCs w:val="20"/>
+        </w:rPr>
+      </w:r>
+      <w:r>
+        <w:rPr>
+          <w:rFonts w:ascii="Arial" w:hAnsi="Arial" w:cs="Arial"/>
+          <w:color w:val="000000"/>
+          <w:sz w:val="20"/>
+          <w:szCs w:val="20"/>
+        </w:rPr>
+      </w:r>
+      <w:r>
+        <w:rPr>
+          <w:rFonts w:ascii="Arial" w:hAnsi="Arial" w:cs="Arial"/>
+          <w:color w:val="000000"/>
+          <w:sz w:val="20"/>
+          <w:szCs w:val="20"/>
+        </w:rPr>
+      </w:r>
+      <w:r>
+        <w:rPr>
+          <w:rFonts w:ascii="Arial" w:hAnsi="Arial" w:cs="Arial"/>
+          <w:color w:val="000000"/>
+          <w:sz w:val="20"/>
+          <w:szCs w:val="20"/>
+        </w:rPr>
+      </w:r>
+      <w:r>
+        <w:rPr>
+          <w:rFonts w:ascii="Arial" w:hAnsi="Arial" w:cs="Arial"/>
+          <w:color w:val="000000"/>
+          <w:sz w:val="20"/>
+          <w:szCs w:val="20"/>
+        </w:rPr>
+      </w:r>
+      <w:r>
+        <w:rPr>
+          <w:rFonts w:ascii="Arial" w:hAnsi="Arial" w:cs="Arial"/>
+          <w:color w:val="000000"/>
+          <w:sz w:val="20"/>
+          <w:szCs w:val="20"/>
+        </w:rPr>
       </w:r>
     </w:p>
     <w:p>
@@ -1204,6 +1216,108 @@
           <w:szCs w:val="20"/>
         </w:rPr>
       </w:pPr>
+    </w:p>
+    <w:p>
+      <w:pPr>
+        <w:ind w:left="567"/>
+        <w:jc w:val="both"/>
+        <w:rPr>
+          <w:rFonts w:ascii="Arial" w:hAnsi="Arial" w:cs="Arial"/>
+          <w:sz w:val="20"/>
+          <w:szCs w:val="20"/>
+        </w:rPr>
+      </w:pPr>
+    </w:p>
+    <w:p>
+      <w:pPr>
+        <w:ind w:left="567"/>
+        <w:jc w:val="both"/>
+        <w:rPr>
+          <w:rFonts w:ascii="Arial" w:hAnsi="Arial" w:cs="Arial"/>
+          <w:sz w:val="20"/>
+          <w:szCs w:val="20"/>
+        </w:rPr>
+      </w:pPr>
+      <w:r>
+        <w:rPr>
+          <w:rFonts w:ascii="Arial" w:hAnsi="Arial" w:cs="Arial"/>
+          <w:color w:val="000000"/>
+          <w:sz w:val="20"/>
+          <w:szCs w:val="20"/>
+        </w:rPr>
+        <w:t xml:space="preserve">Para as especificações e quantitativos foram utilizados como base os </w:t>
+      </w:r>
+      <w:r>
+        <w:rPr>
+          <w:rFonts w:ascii="Arial" w:hAnsi="Arial" w:cs="Arial"/>
+          <w:color w:val="000000"/>
+          <w:sz w:val="20"/>
+          <w:szCs w:val="20"/>
+        </w:rPr>
+        <w:t>projetos, documentos e planilhas</w:t>
+      </w:r>
+      <w:r>
+        <w:rPr>
+          <w:rFonts w:ascii="Arial" w:hAnsi="Arial" w:cs="Arial"/>
+          <w:color w:val="000000"/>
+          <w:sz w:val="20"/>
+          <w:szCs w:val="20"/>
+        </w:rPr>
+        <w:t xml:space="preserve"> fornecidos por V.Sas.</w:t>
+      </w:r>
+    </w:p>
+    <w:p>
+      <w:pPr>
+        <w:ind w:left="567"/>
+        <w:jc w:val="both"/>
+        <w:rPr>
+          <w:rFonts w:ascii="Arial" w:hAnsi="Arial" w:cs="Arial"/>
+          <w:sz w:val="20"/>
+          <w:szCs w:val="20"/>
+        </w:rPr>
+      </w:pPr>
+    </w:p>
+    <w:p>
+      <w:pPr>
+        <w:ind w:left="567"/>
+        <w:jc w:val="both"/>
+        <w:rPr>
+          <w:rFonts w:ascii="Arial" w:hAnsi="Arial" w:cs="Arial"/>
+          <w:bCs/>
+          <w:sz w:val="20"/>
+          <w:szCs w:val="20"/>
+          <w:u w:val="single"/>
+        </w:rPr>
+      </w:pPr>
+      <w:r>
+        <w:rPr>
+          <w:rFonts w:ascii="Arial" w:hAnsi="Arial" w:cs="Arial"/>
+          <w:bCs/>
+          <w:color w:val="000000"/>
+          <w:sz w:val="20"/>
+          <w:szCs w:val="20"/>
+          <w:u w:val="single"/>
+        </w:rPr>
+        <w:t xml:space="preserve">Documentos referentes: </w:t>
+      </w:r>
+    </w:p>
+    <w:p>
+      <w:pPr>
+        <w:ind w:left="567"/>
+        <w:jc w:val="both"/>
+        <w:rPr>
+          <w:rFonts w:ascii="Arial" w:hAnsi="Arial" w:cs="Arial"/>
+          <w:b/>
+          <w:sz w:val="20"/>
+          <w:szCs w:val="20"/>
+          <w:u w:val="single"/>
+        </w:rPr>
+      </w:pPr>
+    </w:p>
+    <w:p>
+      <w:r>
+        <w:t>{#docs}</w:t>
+      </w:r>
     </w:p>
     <w:p>
       <w:pPr>
@@ -1215,137 +1329,24 @@
         <w:jc w:val="both"/>
         <w:rPr>
           <w:rFonts w:ascii="Arial" w:hAnsi="Arial" w:cs="Arial"/>
-          <w:sz w:val="20"/>
-          <w:szCs w:val="20"/>
-        </w:rPr>
-      </w:pPr>
-      <w:r>
-        <w:rPr>
-          <w:rFonts w:ascii="Arial" w:hAnsi="Arial" w:cs="Arial"/>
           <w:color w:val="FF0000"/>
           <w:sz w:val="20"/>
           <w:szCs w:val="20"/>
         </w:rPr>
-        <w:t xml:space="preserve">XXXXXX </w:t>
-      </w:r>
-    </w:p>
-    <w:p>
-      <w:pPr>
-        <w:ind w:left="567"/>
-        <w:jc w:val="both"/>
-        <w:rPr>
-          <w:rFonts w:ascii="Arial" w:hAnsi="Arial" w:cs="Arial"/>
-          <w:sz w:val="20"/>
-          <w:szCs w:val="20"/>
-        </w:rPr>
-      </w:pPr>
-    </w:p>
-    <w:p>
-      <w:pPr>
-        <w:ind w:left="567"/>
-        <w:jc w:val="both"/>
-        <w:rPr>
-          <w:rFonts w:ascii="Arial" w:hAnsi="Arial" w:cs="Arial"/>
-          <w:sz w:val="20"/>
-          <w:szCs w:val="20"/>
-        </w:rPr>
-      </w:pPr>
-      <w:r>
-        <w:rPr>
-          <w:rFonts w:ascii="Arial" w:hAnsi="Arial" w:cs="Arial"/>
-          <w:sz w:val="20"/>
-          <w:szCs w:val="20"/>
-        </w:rPr>
-        <w:t xml:space="preserve">Para as especificações e quantitativos foram utilizados como base os </w:t>
-      </w:r>
-      <w:r>
-        <w:rPr>
-          <w:rFonts w:ascii="Arial" w:hAnsi="Arial" w:cs="Arial"/>
-          <w:color w:val="FF0000"/>
-          <w:sz w:val="20"/>
-          <w:szCs w:val="20"/>
-        </w:rPr>
-        <w:t>projetos, documentos e planilhas</w:t>
-      </w:r>
-      <w:r>
-        <w:rPr>
-          <w:rFonts w:ascii="Arial" w:hAnsi="Arial" w:cs="Arial"/>
-          <w:sz w:val="20"/>
-          <w:szCs w:val="20"/>
-        </w:rPr>
-        <w:t xml:space="preserve"> fornecidos por V.Sas.</w:t>
-      </w:r>
-    </w:p>
-    <w:p>
-      <w:pPr>
-        <w:ind w:left="567"/>
-        <w:jc w:val="both"/>
-        <w:rPr>
-          <w:rFonts w:ascii="Arial" w:hAnsi="Arial" w:cs="Arial"/>
-          <w:sz w:val="20"/>
-          <w:szCs w:val="20"/>
-        </w:rPr>
-      </w:pPr>
-    </w:p>
-    <w:p>
-      <w:pPr>
-        <w:ind w:left="567"/>
-        <w:jc w:val="both"/>
-        <w:rPr>
-          <w:rFonts w:ascii="Arial" w:hAnsi="Arial" w:cs="Arial"/>
-          <w:bCs/>
-          <w:sz w:val="20"/>
-          <w:szCs w:val="20"/>
-          <w:u w:val="single"/>
-        </w:rPr>
-      </w:pPr>
-      <w:r>
-        <w:rPr>
-          <w:rFonts w:ascii="Arial" w:hAnsi="Arial" w:cs="Arial"/>
-          <w:bCs/>
-          <w:sz w:val="20"/>
-          <w:szCs w:val="20"/>
-          <w:u w:val="single"/>
-        </w:rPr>
-        <w:t xml:space="preserve">Documentos referentes: </w:t>
-      </w:r>
-    </w:p>
-    <w:p>
-      <w:pPr>
-        <w:ind w:left="567"/>
-        <w:jc w:val="both"/>
-        <w:rPr>
-          <w:rFonts w:ascii="Arial" w:hAnsi="Arial" w:cs="Arial"/>
-          <w:b/>
-          <w:sz w:val="20"/>
-          <w:szCs w:val="20"/>
-          <w:u w:val="single"/>
-        </w:rPr>
-      </w:pPr>
-    </w:p>
-    <w:p>
-      <w:pPr>
-        <w:pStyle w:val="PargrafodaLista"/>
-        <w:numPr>
-          <w:ilvl w:val="0"/>
-          <w:numId w:val="10"/>
-        </w:numPr>
-        <w:jc w:val="both"/>
-        <w:rPr>
-          <w:rFonts w:ascii="Arial" w:hAnsi="Arial" w:cs="Arial"/>
-          <w:color w:val="FF0000"/>
-          <w:sz w:val="20"/>
-          <w:szCs w:val="20"/>
-        </w:rPr>
-      </w:pPr>
-      <w:r>
-        <w:rPr>
-          <w:rFonts w:ascii="Arial" w:hAnsi="Arial" w:cs="Arial"/>
-          <w:color w:val="FF0000"/>
-          <w:sz w:val="20"/>
-          <w:szCs w:val="20"/>
-        </w:rPr>
-        <w:t>XXXXXX;</w:t>
+      </w:pPr>
+      <w:r>
+        <w:rPr>
+          <w:rFonts w:ascii="Arial" w:hAnsi="Arial" w:cs="Arial"/>
+          <w:color w:val="000000"/>
+          <w:sz w:val="20"/>
+          <w:szCs w:val="20"/>
+        </w:rPr>
+        <w:t>{doc}</w:t>
+      </w:r>
+    </w:p>
+    <w:p>
+      <w:r>
+        <w:t>{/docs}</w:t>
       </w:r>
     </w:p>
     <w:p>
@@ -1378,6 +1379,7 @@
         <w:rPr>
           <w:rFonts w:ascii="Arial" w:hAnsi="Arial" w:cs="Arial"/>
           <w:b/>
+          <w:color w:val="000000"/>
           <w:sz w:val="20"/>
           <w:szCs w:val="20"/>
         </w:rPr>
@@ -1387,6 +1389,7 @@
         <w:rPr>
           <w:rFonts w:ascii="Arial" w:hAnsi="Arial" w:cs="Arial"/>
           <w:b/>
+          <w:color w:val="000000"/>
           <w:sz w:val="20"/>
           <w:szCs w:val="20"/>
         </w:rPr>
@@ -1402,6 +1405,11 @@
           <w:szCs w:val="20"/>
         </w:rPr>
       </w:pPr>
+    </w:p>
+    <w:p>
+      <w:r>
+        <w:t>{#s_corte}</w:t>
+      </w:r>
     </w:p>
     <w:p>
       <w:pPr>
@@ -1426,13 +1434,22 @@
           <w:rFonts w:ascii="Arial" w:hAnsi="Arial" w:cs="Arial"/>
           <w:b/>
           <w:i/>
+          <w:color w:val="000000"/>
+          <w:sz w:val="20"/>
+          <w:szCs w:val="20"/>
+          <w:u w:val="single"/>
+        </w:rPr>
+        <w:t>CORTE A LASER</w:t>
+      </w:r>
+    </w:p>
+    <w:p>
+      <w:pPr>
+        <w:rPr>
+          <w:rFonts w:ascii="Arial" w:hAnsi="Arial" w:cs="Arial"/>
           <w:color w:val="EE0000"/>
           <w:sz w:val="20"/>
-          <w:szCs w:val="20"/>
-          <w:u w:val="single"/>
-        </w:rPr>
-        <w:t>CORTE A LASER</w:t>
-      </w:r>
+        </w:rPr>
+      </w:pPr>
     </w:p>
     <w:p>
       <w:pPr>
@@ -1442,6 +1459,32 @@
           <w:sz w:val="20"/>
         </w:rPr>
       </w:pPr>
+      <w:r>
+        <w:rPr>
+          <w:rFonts w:ascii="Arial" w:hAnsi="Arial" w:cs="Arial"/>
+          <w:color w:val="000000"/>
+          <w:sz w:val="20"/>
+        </w:rPr>
+        <w:t>Serviço de corte a laser de chapas e peças metálicas, incluindo furação e recortes, executado conforme desenhos e arquivos eletrônicos fornecidos pela contratante, com programação de aproveitamento de chapas (</w:t>
+      </w:r>
+      <w:proofErr w:type="spellStart"/>
+      <w:r>
+        <w:rPr>
+          <w:rFonts w:ascii="Arial" w:hAnsi="Arial" w:cs="Arial"/>
+          <w:color w:val="000000"/>
+          <w:sz w:val="20"/>
+        </w:rPr>
+        <w:t>nesting</w:t>
+      </w:r>
+      <w:proofErr w:type="spellEnd"/>
+      <w:r>
+        <w:rPr>
+          <w:rFonts w:ascii="Arial" w:hAnsi="Arial" w:cs="Arial"/>
+          <w:color w:val="000000"/>
+          <w:sz w:val="20"/>
+        </w:rPr>
+        <w:t>) e conferência dimensional das peças.</w:t>
+      </w:r>
     </w:p>
     <w:p>
       <w:pPr>
@@ -1451,31 +1494,142 @@
           <w:sz w:val="20"/>
         </w:rPr>
       </w:pPr>
-      <w:r>
+    </w:p>
+    <w:p>
+      <w:pPr>
         <w:rPr>
           <w:rFonts w:ascii="Arial" w:hAnsi="Arial" w:cs="Arial"/>
           <w:color w:val="EE0000"/>
           <w:sz w:val="20"/>
         </w:rPr>
-        <w:t>Serviço de corte a laser de chapas e peças metálicas, incluindo furação e recortes, executado conforme desenhos e arquivos eletrônicos fornecidos pela contratante, com programação de aproveitamento de chapas (</w:t>
+      </w:pPr>
+      <w:r>
+        <w:rPr>
+          <w:rFonts w:ascii="Arial" w:hAnsi="Arial" w:cs="Arial"/>
+          <w:color w:val="000000"/>
+          <w:sz w:val="20"/>
+        </w:rPr>
+        <w:t>- Material: {corte_material};</w:t>
+      </w:r>
+    </w:p>
+    <w:p>
+      <w:pPr>
+        <w:rPr>
+          <w:rFonts w:ascii="Arial" w:hAnsi="Arial" w:cs="Arial"/>
+          <w:color w:val="EE0000"/>
+          <w:sz w:val="20"/>
+        </w:rPr>
+      </w:pPr>
+      <w:r>
+        <w:rPr>
+          <w:rFonts w:ascii="Arial" w:hAnsi="Arial" w:cs="Arial"/>
+          <w:color w:val="000000"/>
+          <w:sz w:val="20"/>
+        </w:rPr>
+        <w:t>- Espessura: {corte_espessura};</w:t>
       </w:r>
       <w:proofErr w:type="spellStart"/>
       <w:r>
         <w:rPr>
           <w:rFonts w:ascii="Arial" w:hAnsi="Arial" w:cs="Arial"/>
+          <w:color w:val="000000"/>
+          <w:sz w:val="20"/>
+        </w:rPr>
+      </w:r>
+      <w:proofErr w:type="spellEnd"/>
+      <w:r>
+        <w:rPr>
+          <w:rFonts w:ascii="Arial" w:hAnsi="Arial" w:cs="Arial"/>
+          <w:color w:val="000000"/>
+          <w:sz w:val="20"/>
+        </w:rPr>
+      </w:r>
+    </w:p>
+    <w:p>
+      <w:pPr>
+        <w:rPr>
+          <w:rFonts w:ascii="Arial" w:hAnsi="Arial" w:cs="Arial"/>
           <w:color w:val="EE0000"/>
           <w:sz w:val="20"/>
         </w:rPr>
-        <w:t>nesting</w:t>
-      </w:r>
-      <w:proofErr w:type="spellEnd"/>
-      <w:r>
+      </w:pPr>
+      <w:r>
+        <w:rPr>
+          <w:rFonts w:ascii="Arial" w:hAnsi="Arial" w:cs="Arial"/>
+          <w:color w:val="000000"/>
+          <w:sz w:val="20"/>
+        </w:rPr>
+        <w:t>- Quantidade de peças: {corte_qtd};</w:t>
+      </w:r>
+    </w:p>
+    <w:p>
+      <w:pPr>
         <w:rPr>
           <w:rFonts w:ascii="Arial" w:hAnsi="Arial" w:cs="Arial"/>
           <w:color w:val="EE0000"/>
           <w:sz w:val="20"/>
         </w:rPr>
-        <w:t>) e conferência dimensional das peças.</w:t>
+      </w:pPr>
+      <w:r>
+        <w:rPr>
+          <w:rFonts w:ascii="Arial" w:hAnsi="Arial" w:cs="Arial"/>
+          <w:color w:val="000000"/>
+          <w:sz w:val="20"/>
+        </w:rPr>
+        <w:t>- Modalidade de medição: {corte_modalidade}</w:t>
+      </w:r>
+      <w:proofErr w:type="gramStart"/>
+      <w:r>
+        <w:rPr>
+          <w:rFonts w:ascii="Arial" w:hAnsi="Arial" w:cs="Arial"/>
+          <w:color w:val="000000"/>
+          <w:sz w:val="20"/>
+        </w:rPr>
+      </w:r>
+      <w:proofErr w:type="gramEnd"/>
+      <w:r>
+        <w:rPr>
+          <w:rFonts w:ascii="Arial" w:hAnsi="Arial" w:cs="Arial"/>
+          <w:color w:val="000000"/>
+          <w:sz w:val="20"/>
+        </w:rPr>
+      </w:r>
+      <w:proofErr w:type="gramStart"/>
+      <w:r>
+        <w:rPr>
+          <w:rFonts w:ascii="Arial" w:hAnsi="Arial" w:cs="Arial"/>
+          <w:color w:val="000000"/>
+          <w:sz w:val="20"/>
+        </w:rPr>
+      </w:r>
+      <w:proofErr w:type="gramEnd"/>
+      <w:r>
+        <w:rPr>
+          <w:rFonts w:ascii="Arial" w:hAnsi="Arial" w:cs="Arial"/>
+          <w:color w:val="000000"/>
+          <w:sz w:val="20"/>
+        </w:rPr>
+      </w:r>
+      <w:proofErr w:type="gramStart"/>
+      <w:r>
+        <w:rPr>
+          <w:rFonts w:ascii="Arial" w:hAnsi="Arial" w:cs="Arial"/>
+          <w:color w:val="000000"/>
+          <w:sz w:val="20"/>
+        </w:rPr>
+      </w:r>
+      <w:proofErr w:type="gramEnd"/>
+      <w:r>
+        <w:rPr>
+          <w:rFonts w:ascii="Arial" w:hAnsi="Arial" w:cs="Arial"/>
+          <w:color w:val="000000"/>
+          <w:sz w:val="20"/>
+        </w:rPr>
+      </w:r>
+    </w:p>
+    <w:p>
+      <w:r>
+        <w:t>{/s_corte}</w:t>
       </w:r>
     </w:p>
     <w:p>
@@ -1488,145 +1642,9 @@
       </w:pPr>
     </w:p>
     <w:p>
-      <w:pPr>
-        <w:rPr>
-          <w:rFonts w:ascii="Arial" w:hAnsi="Arial" w:cs="Arial"/>
-          <w:color w:val="EE0000"/>
-          <w:sz w:val="20"/>
-        </w:rPr>
-      </w:pPr>
-      <w:r>
-        <w:rPr>
-          <w:rFonts w:ascii="Arial" w:hAnsi="Arial" w:cs="Arial"/>
-          <w:color w:val="EE0000"/>
-          <w:sz w:val="20"/>
-        </w:rPr>
-        <w:t>- Material: {corte_material};</w:t>
-      </w:r>
-    </w:p>
-    <w:p>
-      <w:pPr>
-        <w:rPr>
-          <w:rFonts w:ascii="Arial" w:hAnsi="Arial" w:cs="Arial"/>
-          <w:color w:val="EE0000"/>
-          <w:sz w:val="20"/>
-        </w:rPr>
-      </w:pPr>
-      <w:r>
-        <w:rPr>
-          <w:rFonts w:ascii="Arial" w:hAnsi="Arial" w:cs="Arial"/>
-          <w:color w:val="EE0000"/>
-          <w:sz w:val="20"/>
-        </w:rPr>
-        <w:t>- Espessura: {corte_espessura};</w:t>
-      </w:r>
-      <w:proofErr w:type="spellStart"/>
-      <w:r>
-        <w:rPr>
-          <w:rFonts w:ascii="Arial" w:hAnsi="Arial" w:cs="Arial"/>
-          <w:color w:val="EE0000"/>
-          <w:sz w:val="20"/>
-        </w:rPr>
-      </w:r>
-      <w:proofErr w:type="spellEnd"/>
-      <w:r>
-        <w:rPr>
-          <w:rFonts w:ascii="Arial" w:hAnsi="Arial" w:cs="Arial"/>
-          <w:color w:val="EE0000"/>
-          <w:sz w:val="20"/>
-        </w:rPr>
-      </w:r>
-    </w:p>
-    <w:p>
-      <w:pPr>
-        <w:rPr>
-          <w:rFonts w:ascii="Arial" w:hAnsi="Arial" w:cs="Arial"/>
-          <w:color w:val="EE0000"/>
-          <w:sz w:val="20"/>
-        </w:rPr>
-      </w:pPr>
-      <w:r>
-        <w:rPr>
-          <w:rFonts w:ascii="Arial" w:hAnsi="Arial" w:cs="Arial"/>
-          <w:color w:val="EE0000"/>
-          <w:sz w:val="20"/>
-        </w:rPr>
-        <w:t>- Quantidade de peças: {corte_qtd};</w:t>
-      </w:r>
-    </w:p>
-    <w:p>
-      <w:pPr>
-        <w:rPr>
-          <w:rFonts w:ascii="Arial" w:hAnsi="Arial" w:cs="Arial"/>
-          <w:color w:val="EE0000"/>
-          <w:sz w:val="20"/>
-        </w:rPr>
-      </w:pPr>
-      <w:r>
-        <w:rPr>
-          <w:rFonts w:ascii="Arial" w:hAnsi="Arial" w:cs="Arial"/>
-          <w:color w:val="EE0000"/>
-          <w:sz w:val="20"/>
-        </w:rPr>
-        <w:t>- Modalidade de medição: {corte_modalidade}</w:t>
-      </w:r>
-      <w:proofErr w:type="gramStart"/>
-      <w:r>
-        <w:rPr>
-          <w:rFonts w:ascii="Arial" w:hAnsi="Arial" w:cs="Arial"/>
-          <w:color w:val="EE0000"/>
-          <w:sz w:val="20"/>
-        </w:rPr>
-      </w:r>
-      <w:proofErr w:type="gramEnd"/>
-      <w:r>
-        <w:rPr>
-          <w:rFonts w:ascii="Arial" w:hAnsi="Arial" w:cs="Arial"/>
-          <w:color w:val="EE0000"/>
-          <w:sz w:val="20"/>
-        </w:rPr>
-      </w:r>
-      <w:proofErr w:type="gramStart"/>
-      <w:r>
-        <w:rPr>
-          <w:rFonts w:ascii="Arial" w:hAnsi="Arial" w:cs="Arial"/>
-          <w:color w:val="EE0000"/>
-          <w:sz w:val="20"/>
-        </w:rPr>
-      </w:r>
-      <w:proofErr w:type="gramEnd"/>
-      <w:r>
-        <w:rPr>
-          <w:rFonts w:ascii="Arial" w:hAnsi="Arial" w:cs="Arial"/>
-          <w:color w:val="EE0000"/>
-          <w:sz w:val="20"/>
-        </w:rPr>
-      </w:r>
-      <w:proofErr w:type="gramStart"/>
-      <w:r>
-        <w:rPr>
-          <w:rFonts w:ascii="Arial" w:hAnsi="Arial" w:cs="Arial"/>
-          <w:color w:val="EE0000"/>
-          <w:sz w:val="20"/>
-        </w:rPr>
-      </w:r>
-      <w:proofErr w:type="gramEnd"/>
-      <w:r>
-        <w:rPr>
-          <w:rFonts w:ascii="Arial" w:hAnsi="Arial" w:cs="Arial"/>
-          <w:color w:val="EE0000"/>
-          <w:sz w:val="20"/>
-        </w:rPr>
-      </w:r>
-    </w:p>
-    <w:p>
-      <w:pPr>
-        <w:rPr>
-          <w:rFonts w:ascii="Arial" w:hAnsi="Arial" w:cs="Arial"/>
-          <w:color w:val="EE0000"/>
-          <w:sz w:val="20"/>
-        </w:rPr>
-      </w:pPr>
+      <w:r>
+        <w:t>{#s_solda}</w:t>
+      </w:r>
     </w:p>
     <w:p>
       <w:pPr>
@@ -1651,13 +1669,22 @@
           <w:rFonts w:ascii="Arial" w:hAnsi="Arial" w:cs="Arial"/>
           <w:b/>
           <w:i/>
+          <w:color w:val="000000"/>
+          <w:sz w:val="20"/>
+          <w:szCs w:val="20"/>
+          <w:u w:val="single"/>
+        </w:rPr>
+        <w:t>SOLDA</w:t>
+      </w:r>
+    </w:p>
+    <w:p>
+      <w:pPr>
+        <w:rPr>
+          <w:rFonts w:ascii="Arial" w:hAnsi="Arial" w:cs="Arial"/>
           <w:color w:val="EE0000"/>
           <w:sz w:val="20"/>
-          <w:szCs w:val="20"/>
-          <w:u w:val="single"/>
-        </w:rPr>
-        <w:t>SOLDA</w:t>
-      </w:r>
+        </w:rPr>
+      </w:pPr>
     </w:p>
     <w:p>
       <w:pPr>
@@ -1667,6 +1694,14 @@
           <w:sz w:val="20"/>
         </w:rPr>
       </w:pPr>
+      <w:r>
+        <w:rPr>
+          <w:rFonts w:ascii="Arial" w:hAnsi="Arial" w:cs="Arial"/>
+          <w:color w:val="000000"/>
+          <w:sz w:val="20"/>
+        </w:rPr>
+        <w:t>Serviço de solda de componentes e conjuntos metálicos pelo processo GMAW (MIG/MAG), conforme AWS D1.1 – material de adição ER70S6, executado por soldadores qualificados, com inspeção visual de soldagem em linha de produção.</w:t>
+      </w:r>
     </w:p>
     <w:p>
       <w:pPr>
@@ -1676,13 +1711,22 @@
           <w:sz w:val="20"/>
         </w:rPr>
       </w:pPr>
-      <w:r>
+    </w:p>
+    <w:p>
+      <w:pPr>
         <w:rPr>
           <w:rFonts w:ascii="Arial" w:hAnsi="Arial" w:cs="Arial"/>
           <w:color w:val="EE0000"/>
           <w:sz w:val="20"/>
         </w:rPr>
-        <w:t>Serviço de solda de componentes e conjuntos metálicos pelo processo GMAW (MIG/MAG), conforme AWS D1.1 – material de adição ER70S6, executado por soldadores qualificados, com inspeção visual de soldagem em linha de produção.</w:t>
+      </w:pPr>
+      <w:r>
+        <w:rPr>
+          <w:rFonts w:ascii="Arial" w:hAnsi="Arial" w:cs="Arial"/>
+          <w:color w:val="000000"/>
+          <w:sz w:val="20"/>
+        </w:rPr>
+        <w:t>- Componentes/conjuntos: XXXXXX;</w:t>
       </w:r>
     </w:p>
     <w:p>
@@ -1693,6 +1737,14 @@
           <w:sz w:val="20"/>
         </w:rPr>
       </w:pPr>
+      <w:r>
+        <w:rPr>
+          <w:rFonts w:ascii="Arial" w:hAnsi="Arial" w:cs="Arial"/>
+          <w:color w:val="000000"/>
+          <w:sz w:val="20"/>
+        </w:rPr>
+        <w:t>- Quantidade: XXXXXX;</w:t>
+      </w:r>
     </w:p>
     <w:p>
       <w:pPr>
@@ -1705,108 +1757,84 @@
       <w:r>
         <w:rPr>
           <w:rFonts w:ascii="Arial" w:hAnsi="Arial" w:cs="Arial"/>
+          <w:color w:val="000000"/>
+          <w:sz w:val="20"/>
+        </w:rPr>
+        <w:t xml:space="preserve">- Modalidade de medição: </w:t>
+      </w:r>
+      <w:proofErr w:type="gramStart"/>
+      <w:r>
+        <w:rPr>
+          <w:rFonts w:ascii="Arial" w:hAnsi="Arial" w:cs="Arial"/>
+          <w:color w:val="000000"/>
+          <w:sz w:val="20"/>
+        </w:rPr>
+        <w:t xml:space="preserve">(  </w:t>
+      </w:r>
+      <w:proofErr w:type="gramEnd"/>
+      <w:r>
+        <w:rPr>
+          <w:rFonts w:ascii="Arial" w:hAnsi="Arial" w:cs="Arial"/>
+          <w:color w:val="000000"/>
+          <w:sz w:val="20"/>
+        </w:rPr>
+        <w:t xml:space="preserve"> ) por peça</w:t>
+      </w:r>
+      <w:proofErr w:type="gramStart"/>
+      <w:r>
+        <w:rPr>
+          <w:rFonts w:ascii="Arial" w:hAnsi="Arial" w:cs="Arial"/>
+          <w:color w:val="000000"/>
+          <w:sz w:val="20"/>
+        </w:rPr>
+        <w:t xml:space="preserve">   (</w:t>
+      </w:r>
+      <w:proofErr w:type="gramEnd"/>
+      <w:r>
+        <w:rPr>
+          <w:rFonts w:ascii="Arial" w:hAnsi="Arial" w:cs="Arial"/>
+          <w:color w:val="000000"/>
+          <w:sz w:val="20"/>
+        </w:rPr>
+        <w:t xml:space="preserve"> </w:t>
+      </w:r>
+      <w:proofErr w:type="gramStart"/>
+      <w:r>
+        <w:rPr>
+          <w:rFonts w:ascii="Arial" w:hAnsi="Arial" w:cs="Arial"/>
+          <w:color w:val="000000"/>
+          <w:sz w:val="20"/>
+        </w:rPr>
+        <w:t xml:space="preserve">  )</w:t>
+      </w:r>
+      <w:proofErr w:type="gramEnd"/>
+      <w:r>
+        <w:rPr>
+          <w:rFonts w:ascii="Arial" w:hAnsi="Arial" w:cs="Arial"/>
+          <w:color w:val="000000"/>
+          <w:sz w:val="20"/>
+        </w:rPr>
+        <w:t xml:space="preserve"> por kg.</w:t>
+      </w:r>
+    </w:p>
+    <w:p>
+      <w:r>
+        <w:t>{/s_solda}</w:t>
+      </w:r>
+    </w:p>
+    <w:p>
+      <w:pPr>
+        <w:rPr>
+          <w:rFonts w:ascii="Arial" w:hAnsi="Arial" w:cs="Arial"/>
           <w:color w:val="EE0000"/>
           <w:sz w:val="20"/>
         </w:rPr>
-        <w:t>- Componentes/conjuntos: XXXXXX;</w:t>
-      </w:r>
-    </w:p>
-    <w:p>
-      <w:pPr>
-        <w:rPr>
-          <w:rFonts w:ascii="Arial" w:hAnsi="Arial" w:cs="Arial"/>
-          <w:color w:val="EE0000"/>
-          <w:sz w:val="20"/>
-        </w:rPr>
-      </w:pPr>
-      <w:r>
-        <w:rPr>
-          <w:rFonts w:ascii="Arial" w:hAnsi="Arial" w:cs="Arial"/>
-          <w:color w:val="EE0000"/>
-          <w:sz w:val="20"/>
-        </w:rPr>
-        <w:t>- Quantidade: XXXXXX;</w:t>
-      </w:r>
-    </w:p>
-    <w:p>
-      <w:pPr>
-        <w:rPr>
-          <w:rFonts w:ascii="Arial" w:hAnsi="Arial" w:cs="Arial"/>
-          <w:color w:val="EE0000"/>
-          <w:sz w:val="20"/>
-        </w:rPr>
-      </w:pPr>
-      <w:r>
-        <w:rPr>
-          <w:rFonts w:ascii="Arial" w:hAnsi="Arial" w:cs="Arial"/>
-          <w:color w:val="EE0000"/>
-          <w:sz w:val="20"/>
-        </w:rPr>
-        <w:t xml:space="preserve">- Modalidade de medição: </w:t>
-      </w:r>
-      <w:proofErr w:type="gramStart"/>
-      <w:r>
-        <w:rPr>
-          <w:rFonts w:ascii="Arial" w:hAnsi="Arial" w:cs="Arial"/>
-          <w:color w:val="EE0000"/>
-          <w:sz w:val="20"/>
-        </w:rPr>
-        <w:t xml:space="preserve">(  </w:t>
-      </w:r>
-      <w:proofErr w:type="gramEnd"/>
-      <w:r>
-        <w:rPr>
-          <w:rFonts w:ascii="Arial" w:hAnsi="Arial" w:cs="Arial"/>
-          <w:color w:val="EE0000"/>
-          <w:sz w:val="20"/>
-        </w:rPr>
-        <w:t xml:space="preserve"> ) por peça</w:t>
-      </w:r>
-      <w:proofErr w:type="gramStart"/>
-      <w:r>
-        <w:rPr>
-          <w:rFonts w:ascii="Arial" w:hAnsi="Arial" w:cs="Arial"/>
-          <w:color w:val="EE0000"/>
-          <w:sz w:val="20"/>
-        </w:rPr>
-        <w:t xml:space="preserve">   (</w:t>
-      </w:r>
-      <w:proofErr w:type="gramEnd"/>
-      <w:r>
-        <w:rPr>
-          <w:rFonts w:ascii="Arial" w:hAnsi="Arial" w:cs="Arial"/>
-          <w:color w:val="EE0000"/>
-          <w:sz w:val="20"/>
-        </w:rPr>
-        <w:t xml:space="preserve"> </w:t>
-      </w:r>
-      <w:proofErr w:type="gramStart"/>
-      <w:r>
-        <w:rPr>
-          <w:rFonts w:ascii="Arial" w:hAnsi="Arial" w:cs="Arial"/>
-          <w:color w:val="EE0000"/>
-          <w:sz w:val="20"/>
-        </w:rPr>
-        <w:t xml:space="preserve">  )</w:t>
-      </w:r>
-      <w:proofErr w:type="gramEnd"/>
-      <w:r>
-        <w:rPr>
-          <w:rFonts w:ascii="Arial" w:hAnsi="Arial" w:cs="Arial"/>
-          <w:color w:val="EE0000"/>
-          <w:sz w:val="20"/>
-        </w:rPr>
-        <w:t xml:space="preserve"> por kg.</w:t>
-      </w:r>
-    </w:p>
-    <w:p>
-      <w:pPr>
-        <w:rPr>
-          <w:rFonts w:ascii="Arial" w:hAnsi="Arial" w:cs="Arial"/>
-          <w:color w:val="EE0000"/>
-          <w:sz w:val="20"/>
-        </w:rPr>
-      </w:pPr>
+      </w:pPr>
+    </w:p>
+    <w:p>
+      <w:r>
+        <w:t>{#s_jato}</w:t>
+      </w:r>
     </w:p>
     <w:p>
       <w:pPr>
@@ -1826,11 +1854,20 @@
         <w:rPr>
           <w:rFonts w:ascii="Arial" w:hAnsi="Arial" w:cs="Arial"/>
           <w:b/>
+          <w:color w:val="000000"/>
+          <w:sz w:val="20"/>
+        </w:rPr>
+        <w:t>JATEAMENTO</w:t>
+      </w:r>
+    </w:p>
+    <w:p>
+      <w:pPr>
+        <w:rPr>
+          <w:rFonts w:ascii="Arial" w:hAnsi="Arial" w:cs="Arial"/>
           <w:color w:val="EE0000"/>
           <w:sz w:val="20"/>
         </w:rPr>
-        <w:t>JATEAMENTO</w:t>
-      </w:r>
+      </w:pPr>
     </w:p>
     <w:p>
       <w:pPr>
@@ -1840,6 +1877,14 @@
           <w:sz w:val="20"/>
         </w:rPr>
       </w:pPr>
+      <w:r>
+        <w:rPr>
+          <w:rFonts w:ascii="Arial" w:hAnsi="Arial" w:cs="Arial"/>
+          <w:color w:val="000000"/>
+          <w:sz w:val="20"/>
+        </w:rPr>
+        <w:t>Serviço de jateamento abrasivo de peças metálicas ao metal quase branco, padrão Sa 2.1/2, removendo-se carepas de laminação, elementos oleosos e possíveis pontos de ferrugem, deixando a superfície preparada para aplicação do sistema de pintura.</w:t>
+      </w:r>
     </w:p>
     <w:p>
       <w:pPr>
@@ -1849,13 +1894,22 @@
           <w:sz w:val="20"/>
         </w:rPr>
       </w:pPr>
-      <w:r>
+    </w:p>
+    <w:p>
+      <w:pPr>
         <w:rPr>
           <w:rFonts w:ascii="Arial" w:hAnsi="Arial" w:cs="Arial"/>
           <w:color w:val="EE0000"/>
           <w:sz w:val="20"/>
         </w:rPr>
-        <w:t>Serviço de jateamento abrasivo de peças metálicas ao metal quase branco, padrão Sa 2.1/2, removendo-se carepas de laminação, elementos oleosos e possíveis pontos de ferrugem, deixando a superfície preparada para aplicação do sistema de pintura.</w:t>
+      </w:pPr>
+      <w:r>
+        <w:rPr>
+          <w:rFonts w:ascii="Arial" w:hAnsi="Arial" w:cs="Arial"/>
+          <w:color w:val="000000"/>
+          <w:sz w:val="20"/>
+        </w:rPr>
+        <w:t>- Peças: XXXXXX;</w:t>
       </w:r>
     </w:p>
     <w:p>
@@ -1866,6 +1920,14 @@
           <w:sz w:val="20"/>
         </w:rPr>
       </w:pPr>
+      <w:r>
+        <w:rPr>
+          <w:rFonts w:ascii="Arial" w:hAnsi="Arial" w:cs="Arial"/>
+          <w:color w:val="000000"/>
+          <w:sz w:val="20"/>
+        </w:rPr>
+        <w:t>- Quantidade: XXXXXX;</w:t>
+      </w:r>
     </w:p>
     <w:p>
       <w:pPr>
@@ -1878,108 +1940,84 @@
       <w:r>
         <w:rPr>
           <w:rFonts w:ascii="Arial" w:hAnsi="Arial" w:cs="Arial"/>
+          <w:color w:val="000000"/>
+          <w:sz w:val="20"/>
+        </w:rPr>
+        <w:t xml:space="preserve">- Modalidade de medição: </w:t>
+      </w:r>
+      <w:proofErr w:type="gramStart"/>
+      <w:r>
+        <w:rPr>
+          <w:rFonts w:ascii="Arial" w:hAnsi="Arial" w:cs="Arial"/>
+          <w:color w:val="000000"/>
+          <w:sz w:val="20"/>
+        </w:rPr>
+        <w:t xml:space="preserve">(  </w:t>
+      </w:r>
+      <w:proofErr w:type="gramEnd"/>
+      <w:r>
+        <w:rPr>
+          <w:rFonts w:ascii="Arial" w:hAnsi="Arial" w:cs="Arial"/>
+          <w:color w:val="000000"/>
+          <w:sz w:val="20"/>
+        </w:rPr>
+        <w:t xml:space="preserve"> ) por peça</w:t>
+      </w:r>
+      <w:proofErr w:type="gramStart"/>
+      <w:r>
+        <w:rPr>
+          <w:rFonts w:ascii="Arial" w:hAnsi="Arial" w:cs="Arial"/>
+          <w:color w:val="000000"/>
+          <w:sz w:val="20"/>
+        </w:rPr>
+        <w:t xml:space="preserve">   (</w:t>
+      </w:r>
+      <w:proofErr w:type="gramEnd"/>
+      <w:r>
+        <w:rPr>
+          <w:rFonts w:ascii="Arial" w:hAnsi="Arial" w:cs="Arial"/>
+          <w:color w:val="000000"/>
+          <w:sz w:val="20"/>
+        </w:rPr>
+        <w:t xml:space="preserve"> </w:t>
+      </w:r>
+      <w:proofErr w:type="gramStart"/>
+      <w:r>
+        <w:rPr>
+          <w:rFonts w:ascii="Arial" w:hAnsi="Arial" w:cs="Arial"/>
+          <w:color w:val="000000"/>
+          <w:sz w:val="20"/>
+        </w:rPr>
+        <w:t xml:space="preserve">  )</w:t>
+      </w:r>
+      <w:proofErr w:type="gramEnd"/>
+      <w:r>
+        <w:rPr>
+          <w:rFonts w:ascii="Arial" w:hAnsi="Arial" w:cs="Arial"/>
+          <w:color w:val="000000"/>
+          <w:sz w:val="20"/>
+        </w:rPr>
+        <w:t xml:space="preserve"> por kg.</w:t>
+      </w:r>
+    </w:p>
+    <w:p>
+      <w:r>
+        <w:t>{/s_jato}</w:t>
+      </w:r>
+    </w:p>
+    <w:p>
+      <w:pPr>
+        <w:rPr>
+          <w:rFonts w:ascii="Arial" w:hAnsi="Arial" w:cs="Arial"/>
           <w:color w:val="EE0000"/>
           <w:sz w:val="20"/>
         </w:rPr>
-        <w:t>- Peças: XXXXXX;</w:t>
-      </w:r>
-    </w:p>
-    <w:p>
-      <w:pPr>
-        <w:rPr>
-          <w:rFonts w:ascii="Arial" w:hAnsi="Arial" w:cs="Arial"/>
-          <w:color w:val="EE0000"/>
-          <w:sz w:val="20"/>
-        </w:rPr>
-      </w:pPr>
-      <w:r>
-        <w:rPr>
-          <w:rFonts w:ascii="Arial" w:hAnsi="Arial" w:cs="Arial"/>
-          <w:color w:val="EE0000"/>
-          <w:sz w:val="20"/>
-        </w:rPr>
-        <w:t>- Quantidade: XXXXXX;</w:t>
-      </w:r>
-    </w:p>
-    <w:p>
-      <w:pPr>
-        <w:rPr>
-          <w:rFonts w:ascii="Arial" w:hAnsi="Arial" w:cs="Arial"/>
-          <w:color w:val="EE0000"/>
-          <w:sz w:val="20"/>
-        </w:rPr>
-      </w:pPr>
-      <w:r>
-        <w:rPr>
-          <w:rFonts w:ascii="Arial" w:hAnsi="Arial" w:cs="Arial"/>
-          <w:color w:val="EE0000"/>
-          <w:sz w:val="20"/>
-        </w:rPr>
-        <w:t xml:space="preserve">- Modalidade de medição: </w:t>
-      </w:r>
-      <w:proofErr w:type="gramStart"/>
-      <w:r>
-        <w:rPr>
-          <w:rFonts w:ascii="Arial" w:hAnsi="Arial" w:cs="Arial"/>
-          <w:color w:val="EE0000"/>
-          <w:sz w:val="20"/>
-        </w:rPr>
-        <w:t xml:space="preserve">(  </w:t>
-      </w:r>
-      <w:proofErr w:type="gramEnd"/>
-      <w:r>
-        <w:rPr>
-          <w:rFonts w:ascii="Arial" w:hAnsi="Arial" w:cs="Arial"/>
-          <w:color w:val="EE0000"/>
-          <w:sz w:val="20"/>
-        </w:rPr>
-        <w:t xml:space="preserve"> ) por peça</w:t>
-      </w:r>
-      <w:proofErr w:type="gramStart"/>
-      <w:r>
-        <w:rPr>
-          <w:rFonts w:ascii="Arial" w:hAnsi="Arial" w:cs="Arial"/>
-          <w:color w:val="EE0000"/>
-          <w:sz w:val="20"/>
-        </w:rPr>
-        <w:t xml:space="preserve">   (</w:t>
-      </w:r>
-      <w:proofErr w:type="gramEnd"/>
-      <w:r>
-        <w:rPr>
-          <w:rFonts w:ascii="Arial" w:hAnsi="Arial" w:cs="Arial"/>
-          <w:color w:val="EE0000"/>
-          <w:sz w:val="20"/>
-        </w:rPr>
-        <w:t xml:space="preserve"> </w:t>
-      </w:r>
-      <w:proofErr w:type="gramStart"/>
-      <w:r>
-        <w:rPr>
-          <w:rFonts w:ascii="Arial" w:hAnsi="Arial" w:cs="Arial"/>
-          <w:color w:val="EE0000"/>
-          <w:sz w:val="20"/>
-        </w:rPr>
-        <w:t xml:space="preserve">  )</w:t>
-      </w:r>
-      <w:proofErr w:type="gramEnd"/>
-      <w:r>
-        <w:rPr>
-          <w:rFonts w:ascii="Arial" w:hAnsi="Arial" w:cs="Arial"/>
-          <w:color w:val="EE0000"/>
-          <w:sz w:val="20"/>
-        </w:rPr>
-        <w:t xml:space="preserve"> por kg.</w:t>
-      </w:r>
-    </w:p>
-    <w:p>
-      <w:pPr>
-        <w:rPr>
-          <w:rFonts w:ascii="Arial" w:hAnsi="Arial" w:cs="Arial"/>
-          <w:color w:val="EE0000"/>
-          <w:sz w:val="20"/>
-        </w:rPr>
-      </w:pPr>
+      </w:pPr>
+    </w:p>
+    <w:p>
+      <w:r>
+        <w:t>{#s_pintura}</w:t>
+      </w:r>
     </w:p>
     <w:p>
       <w:pPr>
@@ -1999,11 +2037,20 @@
         <w:rPr>
           <w:rFonts w:ascii="Arial" w:hAnsi="Arial" w:cs="Arial"/>
           <w:b/>
+          <w:color w:val="000000"/>
+          <w:sz w:val="20"/>
+        </w:rPr>
+        <w:t>PINTURA</w:t>
+      </w:r>
+    </w:p>
+    <w:p>
+      <w:pPr>
+        <w:rPr>
+          <w:rFonts w:ascii="Arial" w:hAnsi="Arial" w:cs="Arial"/>
           <w:color w:val="EE0000"/>
           <w:sz w:val="20"/>
         </w:rPr>
-        <w:t>PINTURA</w:t>
-      </w:r>
+      </w:pPr>
     </w:p>
     <w:p>
       <w:pPr>
@@ -2013,6 +2060,14 @@
           <w:sz w:val="20"/>
         </w:rPr>
       </w:pPr>
+      <w:r>
+        <w:rPr>
+          <w:rFonts w:ascii="Arial" w:hAnsi="Arial" w:cs="Arial"/>
+          <w:color w:val="000000"/>
+          <w:sz w:val="20"/>
+        </w:rPr>
+        <w:t>Serviço de pintura industrial de peças metálicas, conforme sistema de pintura descrito abaixo.</w:t>
+      </w:r>
     </w:p>
     <w:p>
       <w:pPr>
@@ -2022,13 +2077,22 @@
           <w:sz w:val="20"/>
         </w:rPr>
       </w:pPr>
-      <w:r>
+    </w:p>
+    <w:p>
+      <w:pPr>
         <w:rPr>
           <w:rFonts w:ascii="Arial" w:hAnsi="Arial" w:cs="Arial"/>
           <w:color w:val="EE0000"/>
           <w:sz w:val="20"/>
         </w:rPr>
-        <w:t>Serviço de pintura industrial de peças metálicas, conforme sistema de pintura descrito abaixo.</w:t>
+      </w:pPr>
+      <w:r>
+        <w:rPr>
+          <w:rFonts w:ascii="Arial" w:hAnsi="Arial" w:cs="Arial"/>
+          <w:color w:val="000000"/>
+          <w:sz w:val="20"/>
+        </w:rPr>
+        <w:t>Sistema de pintura a ser adotado:</w:t>
       </w:r>
     </w:p>
     <w:p>
@@ -2039,6 +2103,14 @@
           <w:sz w:val="20"/>
         </w:rPr>
       </w:pPr>
+      <w:r>
+        <w:rPr>
+          <w:rFonts w:ascii="Arial" w:hAnsi="Arial" w:cs="Arial"/>
+          <w:color w:val="000000"/>
+          <w:sz w:val="20"/>
+        </w:rPr>
+        <w:t>- Preparo da superfície: XXXXXX;</w:t>
+      </w:r>
     </w:p>
     <w:p>
       <w:pPr>
@@ -2051,10 +2123,63 @@
       <w:r>
         <w:rPr>
           <w:rFonts w:ascii="Arial" w:hAnsi="Arial" w:cs="Arial"/>
+          <w:color w:val="000000"/>
+          <w:sz w:val="20"/>
+        </w:rPr>
+        <w:t xml:space="preserve">- Tinta de fundo (primer): XXXXXX – espessura </w:t>
+      </w:r>
+      <w:proofErr w:type="spellStart"/>
+      <w:r>
+        <w:rPr>
+          <w:rFonts w:ascii="Arial" w:hAnsi="Arial" w:cs="Arial"/>
+          <w:color w:val="000000"/>
+          <w:sz w:val="20"/>
+        </w:rPr>
+        <w:t>XXXμm</w:t>
+      </w:r>
+      <w:proofErr w:type="spellEnd"/>
+      <w:r>
+        <w:rPr>
+          <w:rFonts w:ascii="Arial" w:hAnsi="Arial" w:cs="Arial"/>
+          <w:color w:val="000000"/>
+          <w:sz w:val="20"/>
+        </w:rPr>
+        <w:t xml:space="preserve"> de película seca;</w:t>
+      </w:r>
+    </w:p>
+    <w:p>
+      <w:pPr>
+        <w:rPr>
+          <w:rFonts w:ascii="Arial" w:hAnsi="Arial" w:cs="Arial"/>
           <w:color w:val="EE0000"/>
           <w:sz w:val="20"/>
         </w:rPr>
-        <w:t>Sistema de pintura a ser adotado:</w:t>
+      </w:pPr>
+      <w:r>
+        <w:rPr>
+          <w:rFonts w:ascii="Arial" w:hAnsi="Arial" w:cs="Arial"/>
+          <w:color w:val="000000"/>
+          <w:sz w:val="20"/>
+        </w:rPr>
+        <w:t xml:space="preserve">- Tinta de acabamento: XXXXXX – espessura </w:t>
+      </w:r>
+      <w:proofErr w:type="spellStart"/>
+      <w:r>
+        <w:rPr>
+          <w:rFonts w:ascii="Arial" w:hAnsi="Arial" w:cs="Arial"/>
+          <w:color w:val="000000"/>
+          <w:sz w:val="20"/>
+        </w:rPr>
+        <w:t>XXXμm</w:t>
+      </w:r>
+      <w:proofErr w:type="spellEnd"/>
+      <w:r>
+        <w:rPr>
+          <w:rFonts w:ascii="Arial" w:hAnsi="Arial" w:cs="Arial"/>
+          <w:color w:val="000000"/>
+          <w:sz w:val="20"/>
+        </w:rPr>
+        <w:t xml:space="preserve"> de película seca;</w:t>
       </w:r>
     </w:p>
     <w:p>
@@ -2068,10 +2193,45 @@
       <w:r>
         <w:rPr>
           <w:rFonts w:ascii="Arial" w:hAnsi="Arial" w:cs="Arial"/>
+          <w:color w:val="000000"/>
+          <w:sz w:val="20"/>
+        </w:rPr>
+        <w:t xml:space="preserve">- Espessura total: </w:t>
+      </w:r>
+      <w:proofErr w:type="spellStart"/>
+      <w:r>
+        <w:rPr>
+          <w:rFonts w:ascii="Arial" w:hAnsi="Arial" w:cs="Arial"/>
+          <w:color w:val="000000"/>
+          <w:sz w:val="20"/>
+        </w:rPr>
+        <w:t>XXXμm</w:t>
+      </w:r>
+      <w:proofErr w:type="spellEnd"/>
+      <w:r>
+        <w:rPr>
+          <w:rFonts w:ascii="Arial" w:hAnsi="Arial" w:cs="Arial"/>
+          <w:color w:val="000000"/>
+          <w:sz w:val="20"/>
+        </w:rPr>
+        <w:t>;</w:t>
+      </w:r>
+    </w:p>
+    <w:p>
+      <w:pPr>
+        <w:rPr>
+          <w:rFonts w:ascii="Arial" w:hAnsi="Arial" w:cs="Arial"/>
           <w:color w:val="EE0000"/>
           <w:sz w:val="20"/>
         </w:rPr>
-        <w:t>- Preparo da superfície: XXXXXX;</w:t>
+      </w:pPr>
+      <w:r>
+        <w:rPr>
+          <w:rFonts w:ascii="Arial" w:hAnsi="Arial" w:cs="Arial"/>
+          <w:color w:val="000000"/>
+          <w:sz w:val="20"/>
+        </w:rPr>
+        <w:t>- Cor: XXXXXX;</w:t>
       </w:r>
     </w:p>
     <w:p>
@@ -2085,129 +2245,7 @@
       <w:r>
         <w:rPr>
           <w:rFonts w:ascii="Arial" w:hAnsi="Arial" w:cs="Arial"/>
-          <w:color w:val="EE0000"/>
-          <w:sz w:val="20"/>
-        </w:rPr>
-        <w:t xml:space="preserve">- Tinta de fundo (primer): XXXXXX – espessura </w:t>
-      </w:r>
-      <w:proofErr w:type="spellStart"/>
-      <w:r>
-        <w:rPr>
-          <w:rFonts w:ascii="Arial" w:hAnsi="Arial" w:cs="Arial"/>
-          <w:color w:val="EE0000"/>
-          <w:sz w:val="20"/>
-        </w:rPr>
-        <w:t>XXXμm</w:t>
-      </w:r>
-      <w:proofErr w:type="spellEnd"/>
-      <w:r>
-        <w:rPr>
-          <w:rFonts w:ascii="Arial" w:hAnsi="Arial" w:cs="Arial"/>
-          <w:color w:val="EE0000"/>
-          <w:sz w:val="20"/>
-        </w:rPr>
-        <w:t xml:space="preserve"> de película seca;</w:t>
-      </w:r>
-    </w:p>
-    <w:p>
-      <w:pPr>
-        <w:rPr>
-          <w:rFonts w:ascii="Arial" w:hAnsi="Arial" w:cs="Arial"/>
-          <w:color w:val="EE0000"/>
-          <w:sz w:val="20"/>
-        </w:rPr>
-      </w:pPr>
-      <w:r>
-        <w:rPr>
-          <w:rFonts w:ascii="Arial" w:hAnsi="Arial" w:cs="Arial"/>
-          <w:color w:val="EE0000"/>
-          <w:sz w:val="20"/>
-        </w:rPr>
-        <w:t xml:space="preserve">- Tinta de acabamento: XXXXXX – espessura </w:t>
-      </w:r>
-      <w:proofErr w:type="spellStart"/>
-      <w:r>
-        <w:rPr>
-          <w:rFonts w:ascii="Arial" w:hAnsi="Arial" w:cs="Arial"/>
-          <w:color w:val="EE0000"/>
-          <w:sz w:val="20"/>
-        </w:rPr>
-        <w:t>XXXμm</w:t>
-      </w:r>
-      <w:proofErr w:type="spellEnd"/>
-      <w:r>
-        <w:rPr>
-          <w:rFonts w:ascii="Arial" w:hAnsi="Arial" w:cs="Arial"/>
-          <w:color w:val="EE0000"/>
-          <w:sz w:val="20"/>
-        </w:rPr>
-        <w:t xml:space="preserve"> de película seca;</w:t>
-      </w:r>
-    </w:p>
-    <w:p>
-      <w:pPr>
-        <w:rPr>
-          <w:rFonts w:ascii="Arial" w:hAnsi="Arial" w:cs="Arial"/>
-          <w:color w:val="EE0000"/>
-          <w:sz w:val="20"/>
-        </w:rPr>
-      </w:pPr>
-      <w:r>
-        <w:rPr>
-          <w:rFonts w:ascii="Arial" w:hAnsi="Arial" w:cs="Arial"/>
-          <w:color w:val="EE0000"/>
-          <w:sz w:val="20"/>
-        </w:rPr>
-        <w:t xml:space="preserve">- Espessura total: </w:t>
-      </w:r>
-      <w:proofErr w:type="spellStart"/>
-      <w:r>
-        <w:rPr>
-          <w:rFonts w:ascii="Arial" w:hAnsi="Arial" w:cs="Arial"/>
-          <w:color w:val="EE0000"/>
-          <w:sz w:val="20"/>
-        </w:rPr>
-        <w:t>XXXμm</w:t>
-      </w:r>
-      <w:proofErr w:type="spellEnd"/>
-      <w:r>
-        <w:rPr>
-          <w:rFonts w:ascii="Arial" w:hAnsi="Arial" w:cs="Arial"/>
-          <w:color w:val="EE0000"/>
-          <w:sz w:val="20"/>
-        </w:rPr>
-        <w:t>;</w:t>
-      </w:r>
-    </w:p>
-    <w:p>
-      <w:pPr>
-        <w:rPr>
-          <w:rFonts w:ascii="Arial" w:hAnsi="Arial" w:cs="Arial"/>
-          <w:color w:val="EE0000"/>
-          <w:sz w:val="20"/>
-        </w:rPr>
-      </w:pPr>
-      <w:r>
-        <w:rPr>
-          <w:rFonts w:ascii="Arial" w:hAnsi="Arial" w:cs="Arial"/>
-          <w:color w:val="EE0000"/>
-          <w:sz w:val="20"/>
-        </w:rPr>
-        <w:t>- Cor: XXXXXX;</w:t>
-      </w:r>
-    </w:p>
-    <w:p>
-      <w:pPr>
-        <w:rPr>
-          <w:rFonts w:ascii="Arial" w:hAnsi="Arial" w:cs="Arial"/>
-          <w:color w:val="EE0000"/>
-          <w:sz w:val="20"/>
-        </w:rPr>
-      </w:pPr>
-      <w:r>
-        <w:rPr>
-          <w:rFonts w:ascii="Arial" w:hAnsi="Arial" w:cs="Arial"/>
-          <w:color w:val="EE0000"/>
+          <w:color w:val="000000"/>
           <w:sz w:val="20"/>
         </w:rPr>
         <w:t xml:space="preserve">- Modalidade de medição: </w:t>
@@ -2216,7 +2254,7 @@
       <w:r>
         <w:rPr>
           <w:rFonts w:ascii="Arial" w:hAnsi="Arial" w:cs="Arial"/>
-          <w:color w:val="EE0000"/>
+          <w:color w:val="000000"/>
           <w:sz w:val="20"/>
         </w:rPr>
         <w:t xml:space="preserve">(  </w:t>
@@ -2225,7 +2263,7 @@
       <w:r>
         <w:rPr>
           <w:rFonts w:ascii="Arial" w:hAnsi="Arial" w:cs="Arial"/>
-          <w:color w:val="EE0000"/>
+          <w:color w:val="000000"/>
           <w:sz w:val="20"/>
         </w:rPr>
         <w:t xml:space="preserve"> ) por peça</w:t>
@@ -2234,7 +2272,7 @@
       <w:r>
         <w:rPr>
           <w:rFonts w:ascii="Arial" w:hAnsi="Arial" w:cs="Arial"/>
-          <w:color w:val="EE0000"/>
+          <w:color w:val="000000"/>
           <w:sz w:val="20"/>
         </w:rPr>
         <w:t xml:space="preserve">   (</w:t>
@@ -2243,7 +2281,7 @@
       <w:r>
         <w:rPr>
           <w:rFonts w:ascii="Arial" w:hAnsi="Arial" w:cs="Arial"/>
-          <w:color w:val="EE0000"/>
+          <w:color w:val="000000"/>
           <w:sz w:val="20"/>
         </w:rPr>
         <w:t xml:space="preserve"> </w:t>
@@ -2252,7 +2290,7 @@
       <w:r>
         <w:rPr>
           <w:rFonts w:ascii="Arial" w:hAnsi="Arial" w:cs="Arial"/>
-          <w:color w:val="EE0000"/>
+          <w:color w:val="000000"/>
           <w:sz w:val="20"/>
         </w:rPr>
         <w:t xml:space="preserve">  )</w:t>
@@ -2261,10 +2299,15 @@
       <w:r>
         <w:rPr>
           <w:rFonts w:ascii="Arial" w:hAnsi="Arial" w:cs="Arial"/>
-          <w:color w:val="EE0000"/>
+          <w:color w:val="000000"/>
           <w:sz w:val="20"/>
         </w:rPr>
         <w:t xml:space="preserve"> por kg.</w:t>
+      </w:r>
+    </w:p>
+    <w:p>
+      <w:r>
+        <w:t>{/s_pintura}</w:t>
       </w:r>
     </w:p>
     <w:p>
@@ -2330,6 +2373,7 @@
       <w:r>
         <w:rPr>
           <w:rFonts w:ascii="Arial" w:hAnsi="Arial" w:cs="Arial"/>
+          <w:color w:val="000000"/>
           <w:sz w:val="20"/>
           <w:szCs w:val="20"/>
         </w:rPr>
@@ -2352,6 +2396,7 @@
       <w:r>
         <w:rPr>
           <w:rFonts w:ascii="Arial" w:hAnsi="Arial" w:cs="Arial"/>
+          <w:color w:val="000000"/>
           <w:sz w:val="20"/>
           <w:szCs w:val="20"/>
         </w:rPr>
@@ -2361,6 +2406,7 @@
       <w:r>
         <w:rPr>
           <w:rFonts w:ascii="Arial" w:hAnsi="Arial" w:cs="Arial"/>
+          <w:color w:val="000000"/>
           <w:sz w:val="20"/>
           <w:szCs w:val="20"/>
         </w:rPr>
@@ -2369,6 +2415,7 @@
       <w:r>
         <w:rPr>
           <w:rFonts w:ascii="Arial" w:hAnsi="Arial" w:cs="Arial"/>
+          <w:color w:val="000000"/>
           <w:sz w:val="20"/>
           <w:szCs w:val="20"/>
         </w:rPr>
@@ -2377,6 +2424,7 @@
       <w:r>
         <w:rPr>
           <w:rFonts w:ascii="Arial" w:hAnsi="Arial" w:cs="Arial"/>
+          <w:color w:val="000000"/>
           <w:sz w:val="20"/>
           <w:szCs w:val="20"/>
         </w:rPr>
@@ -2386,6 +2434,7 @@
       <w:r>
         <w:rPr>
           <w:rFonts w:ascii="Arial" w:hAnsi="Arial" w:cs="Arial"/>
+          <w:color w:val="000000"/>
           <w:sz w:val="20"/>
           <w:szCs w:val="20"/>
         </w:rPr>
@@ -2408,6 +2457,7 @@
       <w:r>
         <w:rPr>
           <w:rFonts w:ascii="Arial" w:hAnsi="Arial" w:cs="Arial"/>
+          <w:color w:val="000000"/>
           <w:sz w:val="20"/>
           <w:szCs w:val="20"/>
         </w:rPr>
@@ -2476,49 +2526,45 @@
           <w:sz w:val="20"/>
           <w:szCs w:val="20"/>
         </w:rPr>
-        <w:t xml:space="preserve">São efetuados em nossa linha de produção inspeção visual de </w:t>
+        <w:t>{cq}</w:t>
       </w:r>
       <w:r>
         <w:rPr>
           <w:rFonts w:ascii="Arial" w:hAnsi="Arial" w:cs="Arial"/>
           <w:bCs/>
-          <w:color w:val="EE0000"/>
-          <w:sz w:val="20"/>
-          <w:szCs w:val="20"/>
-        </w:rPr>
-        <w:t xml:space="preserve">soldagem, dimensional e inspeção de </w:t>
+          <w:color w:val="000000"/>
+          <w:sz w:val="20"/>
+          <w:szCs w:val="20"/>
+        </w:rPr>
       </w:r>
       <w:proofErr w:type="spellStart"/>
       <w:r>
         <w:rPr>
           <w:rFonts w:ascii="Arial" w:hAnsi="Arial" w:cs="Arial"/>
           <w:bCs/>
-          <w:color w:val="EE0000"/>
-          <w:sz w:val="20"/>
-          <w:szCs w:val="20"/>
-        </w:rPr>
-        <w:t>micragem</w:t>
+          <w:color w:val="000000"/>
+          <w:sz w:val="20"/>
+          <w:szCs w:val="20"/>
+        </w:rPr>
       </w:r>
       <w:proofErr w:type="spellEnd"/>
       <w:r>
         <w:rPr>
           <w:rFonts w:ascii="Arial" w:hAnsi="Arial" w:cs="Arial"/>
           <w:bCs/>
-          <w:color w:val="EE0000"/>
-          <w:sz w:val="20"/>
-          <w:szCs w:val="20"/>
-        </w:rPr>
-        <w:t xml:space="preserve"> de </w:t>
+          <w:color w:val="000000"/>
+          <w:sz w:val="20"/>
+          <w:szCs w:val="20"/>
+        </w:rPr>
       </w:r>
       <w:r>
         <w:rPr>
           <w:rFonts w:ascii="Arial" w:hAnsi="Arial" w:cs="Arial"/>
           <w:bCs/>
-          <w:color w:val="EE0000"/>
-          <w:sz w:val="20"/>
-          <w:szCs w:val="20"/>
-        </w:rPr>
-        <w:t>tratamento superfície.</w:t>
+          <w:color w:val="000000"/>
+          <w:sz w:val="20"/>
+          <w:szCs w:val="20"/>
+        </w:rPr>
       </w:r>
     </w:p>
     <w:p>
@@ -2551,6 +2597,7 @@
         <w:rPr>
           <w:rFonts w:ascii="Arial" w:hAnsi="Arial" w:cs="Arial"/>
           <w:b/>
+          <w:color w:val="000000"/>
           <w:sz w:val="20"/>
           <w:szCs w:val="20"/>
         </w:rPr>
@@ -2572,6 +2619,7 @@
         <w:rPr>
           <w:rFonts w:ascii="Arial" w:hAnsi="Arial" w:cs="Arial"/>
           <w:bCs/>
+          <w:color w:val="000000"/>
           <w:sz w:val="20"/>
           <w:szCs w:val="20"/>
         </w:rPr>
@@ -2608,6 +2656,7 @@
         <w:rPr>
           <w:rFonts w:ascii="Arial" w:hAnsi="Arial" w:cs="Arial"/>
           <w:b/>
+          <w:color w:val="000000"/>
           <w:sz w:val="20"/>
           <w:szCs w:val="20"/>
         </w:rPr>
@@ -2631,7 +2680,7 @@
       <w:r>
         <w:rPr>
           <w:rFonts w:ascii="Arial" w:hAnsi="Arial" w:cs="Arial"/>
-          <w:color w:val="EE0000"/>
+          <w:color w:val="000000"/>
           <w:sz w:val="20"/>
           <w:szCs w:val="20"/>
         </w:rPr>
@@ -2655,7 +2704,7 @@
       <w:r>
         <w:rPr>
           <w:rFonts w:ascii="Arial" w:hAnsi="Arial" w:cs="Arial"/>
-          <w:color w:val="EE0000"/>
+          <w:color w:val="000000"/>
           <w:sz w:val="20"/>
           <w:szCs w:val="20"/>
         </w:rPr>
@@ -2664,7 +2713,7 @@
       <w:r>
         <w:rPr>
           <w:rFonts w:ascii="Arial" w:hAnsi="Arial" w:cs="Arial"/>
-          <w:color w:val="EE0000"/>
+          <w:color w:val="000000"/>
           <w:sz w:val="20"/>
           <w:szCs w:val="20"/>
         </w:rPr>
@@ -2688,7 +2737,7 @@
       <w:r>
         <w:rPr>
           <w:rFonts w:ascii="Arial" w:hAnsi="Arial" w:cs="Arial"/>
-          <w:color w:val="EE0000"/>
+          <w:color w:val="000000"/>
           <w:sz w:val="20"/>
           <w:szCs w:val="20"/>
         </w:rPr>
@@ -2697,7 +2746,7 @@
       <w:r>
         <w:rPr>
           <w:rFonts w:ascii="Arial" w:hAnsi="Arial" w:cs="Arial"/>
-          <w:color w:val="EE0000"/>
+          <w:color w:val="000000"/>
           <w:sz w:val="20"/>
           <w:szCs w:val="20"/>
         </w:rPr>
@@ -2721,7 +2770,7 @@
       <w:r>
         <w:rPr>
           <w:rFonts w:ascii="Arial" w:hAnsi="Arial" w:cs="Arial"/>
-          <w:color w:val="FF0000"/>
+          <w:color w:val="000000"/>
           <w:sz w:val="20"/>
           <w:szCs w:val="20"/>
         </w:rPr>
@@ -2730,7 +2779,7 @@
       <w:r>
         <w:rPr>
           <w:rFonts w:ascii="Arial" w:hAnsi="Arial" w:cs="Arial"/>
-          <w:color w:val="FF0000"/>
+          <w:color w:val="000000"/>
           <w:sz w:val="20"/>
           <w:szCs w:val="20"/>
         </w:rPr>
@@ -2739,7 +2788,7 @@
       <w:r>
         <w:rPr>
           <w:rFonts w:ascii="Arial" w:hAnsi="Arial" w:cs="Arial"/>
-          <w:color w:val="FF0000"/>
+          <w:color w:val="000000"/>
           <w:sz w:val="20"/>
           <w:szCs w:val="20"/>
         </w:rPr>
@@ -2776,6 +2825,7 @@
         <w:rPr>
           <w:rFonts w:ascii="Arial" w:hAnsi="Arial" w:cs="Arial"/>
           <w:b/>
+          <w:color w:val="000000"/>
           <w:sz w:val="20"/>
           <w:szCs w:val="20"/>
         </w:rPr>
@@ -2798,6 +2848,7 @@
       <w:r>
         <w:rPr>
           <w:rFonts w:ascii="Arial" w:hAnsi="Arial" w:cs="Arial"/>
+          <w:color w:val="000000"/>
           <w:sz w:val="20"/>
           <w:szCs w:val="20"/>
         </w:rPr>
@@ -2806,6 +2857,7 @@
       <w:r>
         <w:rPr>
           <w:rFonts w:ascii="Arial" w:hAnsi="Arial" w:cs="Arial"/>
+          <w:color w:val="000000"/>
           <w:sz w:val="20"/>
           <w:szCs w:val="20"/>
         </w:rPr>
@@ -2828,6 +2880,7 @@
       <w:r>
         <w:rPr>
           <w:rFonts w:ascii="Arial" w:hAnsi="Arial" w:cs="Arial"/>
+          <w:color w:val="000000"/>
           <w:sz w:val="20"/>
           <w:szCs w:val="20"/>
         </w:rPr>
@@ -2836,6 +2889,7 @@
       <w:r>
         <w:rPr>
           <w:rFonts w:ascii="Arial" w:hAnsi="Arial" w:cs="Arial"/>
+          <w:color w:val="000000"/>
           <w:sz w:val="20"/>
           <w:szCs w:val="20"/>
         </w:rPr>
@@ -2858,6 +2912,7 @@
       <w:r>
         <w:rPr>
           <w:rFonts w:ascii="Arial" w:hAnsi="Arial" w:cs="Arial"/>
+          <w:color w:val="000000"/>
           <w:sz w:val="20"/>
           <w:szCs w:val="20"/>
         </w:rPr>
@@ -2866,6 +2921,7 @@
       <w:r>
         <w:rPr>
           <w:rFonts w:ascii="Arial" w:hAnsi="Arial" w:cs="Arial"/>
+          <w:color w:val="000000"/>
           <w:sz w:val="20"/>
           <w:szCs w:val="20"/>
         </w:rPr>
@@ -2874,6 +2930,7 @@
       <w:r>
         <w:rPr>
           <w:rFonts w:ascii="Arial" w:hAnsi="Arial" w:cs="Arial"/>
+          <w:color w:val="000000"/>
           <w:sz w:val="20"/>
           <w:szCs w:val="20"/>
         </w:rPr>
@@ -2896,6 +2953,7 @@
       <w:r>
         <w:rPr>
           <w:rFonts w:ascii="Arial" w:hAnsi="Arial" w:cs="Arial"/>
+          <w:color w:val="000000"/>
           <w:sz w:val="20"/>
           <w:szCs w:val="20"/>
         </w:rPr>
@@ -2918,6 +2976,7 @@
       <w:r>
         <w:rPr>
           <w:rFonts w:ascii="Arial" w:hAnsi="Arial" w:cs="Arial"/>
+          <w:color w:val="000000"/>
           <w:sz w:val="20"/>
           <w:szCs w:val="20"/>
         </w:rPr>
@@ -2940,6 +2999,7 @@
       <w:r>
         <w:rPr>
           <w:rFonts w:ascii="Arial" w:hAnsi="Arial" w:cs="Arial"/>
+          <w:color w:val="000000"/>
           <w:sz w:val="20"/>
           <w:szCs w:val="20"/>
         </w:rPr>
@@ -2962,6 +3022,7 @@
       <w:r>
         <w:rPr>
           <w:rFonts w:ascii="Arial" w:hAnsi="Arial" w:cs="Arial"/>
+          <w:color w:val="000000"/>
           <w:sz w:val="20"/>
           <w:szCs w:val="20"/>
         </w:rPr>
@@ -2984,6 +3045,7 @@
       <w:r>
         <w:rPr>
           <w:rFonts w:ascii="Arial" w:hAnsi="Arial" w:cs="Arial"/>
+          <w:color w:val="000000"/>
           <w:sz w:val="20"/>
           <w:szCs w:val="20"/>
         </w:rPr>
@@ -3045,6 +3107,7 @@
       <w:r>
         <w:rPr>
           <w:rFonts w:ascii="Arial" w:hAnsi="Arial" w:cs="Arial"/>
+          <w:color w:val="000000"/>
           <w:sz w:val="20"/>
           <w:szCs w:val="20"/>
         </w:rPr>
@@ -3054,6 +3117,7 @@
       <w:r>
         <w:rPr>
           <w:rFonts w:ascii="Arial" w:hAnsi="Arial" w:cs="Arial"/>
+          <w:color w:val="000000"/>
           <w:sz w:val="20"/>
           <w:szCs w:val="20"/>
         </w:rPr>
@@ -3063,6 +3127,7 @@
       <w:r>
         <w:rPr>
           <w:rFonts w:ascii="Arial" w:hAnsi="Arial" w:cs="Arial"/>
+          <w:color w:val="000000"/>
           <w:sz w:val="20"/>
           <w:szCs w:val="20"/>
         </w:rPr>
@@ -3085,6 +3150,7 @@
       <w:r>
         <w:rPr>
           <w:rFonts w:ascii="Arial" w:hAnsi="Arial" w:cs="Arial"/>
+          <w:color w:val="000000"/>
           <w:sz w:val="20"/>
           <w:szCs w:val="20"/>
         </w:rPr>
@@ -3108,6 +3174,7 @@
       <w:r>
         <w:rPr>
           <w:rFonts w:ascii="Arial" w:hAnsi="Arial" w:cs="Arial"/>
+          <w:color w:val="000000"/>
           <w:sz w:val="20"/>
           <w:szCs w:val="20"/>
         </w:rPr>
@@ -3117,6 +3184,7 @@
       <w:r>
         <w:rPr>
           <w:rFonts w:ascii="Arial" w:hAnsi="Arial" w:cs="Arial"/>
+          <w:color w:val="000000"/>
           <w:sz w:val="20"/>
           <w:szCs w:val="20"/>
         </w:rPr>
@@ -3126,6 +3194,7 @@
       <w:r>
         <w:rPr>
           <w:rFonts w:ascii="Arial" w:hAnsi="Arial" w:cs="Arial"/>
+          <w:color w:val="000000"/>
           <w:sz w:val="20"/>
           <w:szCs w:val="20"/>
         </w:rPr>
@@ -3135,6 +3204,7 @@
       <w:r>
         <w:rPr>
           <w:rFonts w:ascii="Arial" w:hAnsi="Arial" w:cs="Arial"/>
+          <w:color w:val="000000"/>
           <w:sz w:val="20"/>
           <w:szCs w:val="20"/>
         </w:rPr>
@@ -3157,6 +3227,7 @@
       <w:r>
         <w:rPr>
           <w:rFonts w:ascii="Arial" w:hAnsi="Arial" w:cs="Arial"/>
+          <w:color w:val="000000"/>
           <w:sz w:val="20"/>
           <w:szCs w:val="20"/>
         </w:rPr>
@@ -3179,6 +3250,7 @@
       <w:r>
         <w:rPr>
           <w:rFonts w:ascii="Arial" w:hAnsi="Arial" w:cs="Arial"/>
+          <w:color w:val="000000"/>
           <w:sz w:val="20"/>
           <w:szCs w:val="20"/>
         </w:rPr>
@@ -3187,6 +3259,7 @@
       <w:r>
         <w:rPr>
           <w:rFonts w:ascii="Arial" w:hAnsi="Arial" w:cs="Arial"/>
+          <w:color w:val="000000"/>
           <w:sz w:val="20"/>
           <w:szCs w:val="20"/>
         </w:rPr>
@@ -3224,6 +3297,7 @@
         <w:rPr>
           <w:rFonts w:ascii="Arial" w:hAnsi="Arial" w:cs="Arial"/>
           <w:b/>
+          <w:color w:val="000000"/>
           <w:sz w:val="20"/>
           <w:szCs w:val="20"/>
         </w:rPr>
@@ -3262,7 +3336,7 @@
         <w:rPr>
           <w:rFonts w:ascii="Arial" w:hAnsi="Arial" w:cs="Arial"/>
           <w:b/>
-          <w:color w:val="auto"/>
+          <w:color w:val="000000"/>
           <w:sz w:val="20"/>
           <w:szCs w:val="20"/>
         </w:rPr>
@@ -3279,6 +3353,7 @@
       <w:r>
         <w:rPr>
           <w:rFonts w:ascii="Arial" w:hAnsi="Arial" w:cs="Arial"/>
+          <w:color w:val="000000"/>
           <w:sz w:val="20"/>
         </w:rPr>
         <w:t>Os valores serão apresentados por peça ou por quilograma (kg), conforme a modalidade de medição escolhida pelo cliente:</w:t>
@@ -3315,6 +3390,7 @@
               <w:rPr>
                 <w:rFonts w:ascii="Arial" w:hAnsi="Arial" w:cs="Arial"/>
                 <w:b/>
+                <w:color w:val="000000"/>
                 <w:sz w:val="20"/>
               </w:rPr>
               <w:t>Item</w:t>
@@ -3337,6 +3413,7 @@
               <w:rPr>
                 <w:rFonts w:ascii="Arial" w:hAnsi="Arial" w:cs="Arial"/>
                 <w:b/>
+                <w:color w:val="000000"/>
                 <w:sz w:val="20"/>
               </w:rPr>
               <w:t>Serviço</w:t>
@@ -3359,6 +3436,7 @@
               <w:rPr>
                 <w:rFonts w:ascii="Arial" w:hAnsi="Arial" w:cs="Arial"/>
                 <w:b/>
+                <w:color w:val="000000"/>
                 <w:sz w:val="20"/>
               </w:rPr>
               <w:t>Unid. (peça/kg)</w:t>
@@ -3382,6 +3460,7 @@
               <w:rPr>
                 <w:rFonts w:ascii="Arial" w:hAnsi="Arial" w:cs="Arial"/>
                 <w:b/>
+                <w:color w:val="000000"/>
                 <w:sz w:val="20"/>
               </w:rPr>
               <w:t>Qtd</w:t>
@@ -3391,6 +3470,7 @@
               <w:rPr>
                 <w:rFonts w:ascii="Arial" w:hAnsi="Arial" w:cs="Arial"/>
                 <w:b/>
+                <w:color w:val="000000"/>
                 <w:sz w:val="20"/>
               </w:rPr>
               <w:t>.</w:t>
@@ -3413,6 +3493,7 @@
               <w:rPr>
                 <w:rFonts w:ascii="Arial" w:hAnsi="Arial" w:cs="Arial"/>
                 <w:b/>
+                <w:color w:val="000000"/>
                 <w:sz w:val="20"/>
               </w:rPr>
               <w:t>Valor unitário (R$)</w:t>
@@ -3435,6 +3516,7 @@
               <w:rPr>
                 <w:rFonts w:ascii="Arial" w:hAnsi="Arial" w:cs="Arial"/>
                 <w:b/>
+                <w:color w:val="000000"/>
                 <w:sz w:val="20"/>
               </w:rPr>
               <w:t>Valor total (R$)</w:t>
@@ -3457,9 +3539,10 @@
             <w:r>
               <w:rPr>
                 <w:rFonts w:ascii="Arial" w:hAnsi="Arial" w:cs="Arial"/>
+                <w:color w:val="000000"/>
                 <w:sz w:val="20"/>
               </w:rPr>
-              <w:t>01</w:t>
+              <w:t>{#servicos}{item}</w:t>
             </w:r>
           </w:p>
         </w:tc>
@@ -3477,9 +3560,10 @@
             <w:r>
               <w:rPr>
                 <w:rFonts w:ascii="Arial" w:hAnsi="Arial" w:cs="Arial"/>
+                <w:color w:val="000000"/>
                 <w:sz w:val="20"/>
               </w:rPr>
-              <w:t>Corte a laser</w:t>
+              <w:t>{nome}</w:t>
             </w:r>
           </w:p>
         </w:tc>
@@ -3495,7 +3579,7 @@
               </w:rPr>
             </w:pPr>
             <w:r>
-              <w:t>{corte_unid}</w:t>
+              <w:t>{unid}</w:t>
             </w:r>
           </w:p>
         </w:tc>
@@ -3511,7 +3595,7 @@
               </w:rPr>
             </w:pPr>
             <w:r>
-              <w:t>{corte_qtd_tab}</w:t>
+              <w:t>{qtd}</w:t>
             </w:r>
           </w:p>
         </w:tc>
@@ -3527,7 +3611,7 @@
               </w:rPr>
             </w:pPr>
             <w:r>
-              <w:t>{corte_vu}</w:t>
+              <w:t>{vu}</w:t>
             </w:r>
           </w:p>
         </w:tc>
@@ -3543,290 +3627,8 @@
               </w:rPr>
             </w:pPr>
             <w:r>
-              <w:t>{corte_vt}</w:t>
+              <w:t>{vt}{/servicos}</w:t>
             </w:r>
-          </w:p>
-        </w:tc>
-      </w:tr>
-      <w:tr>
-        <w:tc>
-          <w:tcPr>
-            <w:tcW w:w="1742" w:type="dxa"/>
-          </w:tcPr>
-          <w:p>
-            <w:pPr>
-              <w:rPr>
-                <w:rFonts w:ascii="Arial" w:hAnsi="Arial" w:cs="Arial"/>
-                <w:sz w:val="20"/>
-              </w:rPr>
-            </w:pPr>
-            <w:r>
-              <w:rPr>
-                <w:rFonts w:ascii="Arial" w:hAnsi="Arial" w:cs="Arial"/>
-                <w:sz w:val="20"/>
-              </w:rPr>
-              <w:t>02</w:t>
-            </w:r>
-          </w:p>
-        </w:tc>
-        <w:tc>
-          <w:tcPr>
-            <w:tcW w:w="1742" w:type="dxa"/>
-          </w:tcPr>
-          <w:p>
-            <w:pPr>
-              <w:rPr>
-                <w:rFonts w:ascii="Arial" w:hAnsi="Arial" w:cs="Arial"/>
-                <w:sz w:val="20"/>
-              </w:rPr>
-            </w:pPr>
-            <w:r>
-              <w:rPr>
-                <w:rFonts w:ascii="Arial" w:hAnsi="Arial" w:cs="Arial"/>
-                <w:sz w:val="20"/>
-              </w:rPr>
-              <w:t>Solda</w:t>
-            </w:r>
-          </w:p>
-        </w:tc>
-        <w:tc>
-          <w:tcPr>
-            <w:tcW w:w="1743" w:type="dxa"/>
-          </w:tcPr>
-          <w:p>
-            <w:pPr>
-              <w:rPr>
-                <w:rFonts w:ascii="Arial" w:hAnsi="Arial" w:cs="Arial"/>
-                <w:sz w:val="20"/>
-              </w:rPr>
-            </w:pPr>
-          </w:p>
-        </w:tc>
-        <w:tc>
-          <w:tcPr>
-            <w:tcW w:w="1743" w:type="dxa"/>
-          </w:tcPr>
-          <w:p>
-            <w:pPr>
-              <w:rPr>
-                <w:rFonts w:ascii="Arial" w:hAnsi="Arial" w:cs="Arial"/>
-                <w:sz w:val="20"/>
-              </w:rPr>
-            </w:pPr>
-          </w:p>
-        </w:tc>
-        <w:tc>
-          <w:tcPr>
-            <w:tcW w:w="1743" w:type="dxa"/>
-          </w:tcPr>
-          <w:p>
-            <w:pPr>
-              <w:rPr>
-                <w:rFonts w:ascii="Arial" w:hAnsi="Arial" w:cs="Arial"/>
-                <w:sz w:val="20"/>
-              </w:rPr>
-            </w:pPr>
-          </w:p>
-        </w:tc>
-        <w:tc>
-          <w:tcPr>
-            <w:tcW w:w="1743" w:type="dxa"/>
-          </w:tcPr>
-          <w:p>
-            <w:pPr>
-              <w:rPr>
-                <w:rFonts w:ascii="Arial" w:hAnsi="Arial" w:cs="Arial"/>
-                <w:sz w:val="20"/>
-              </w:rPr>
-            </w:pPr>
-          </w:p>
-        </w:tc>
-      </w:tr>
-      <w:tr>
-        <w:tc>
-          <w:tcPr>
-            <w:tcW w:w="1742" w:type="dxa"/>
-          </w:tcPr>
-          <w:p>
-            <w:pPr>
-              <w:rPr>
-                <w:rFonts w:ascii="Arial" w:hAnsi="Arial" w:cs="Arial"/>
-                <w:sz w:val="20"/>
-              </w:rPr>
-            </w:pPr>
-            <w:r>
-              <w:rPr>
-                <w:rFonts w:ascii="Arial" w:hAnsi="Arial" w:cs="Arial"/>
-                <w:sz w:val="20"/>
-              </w:rPr>
-              <w:t>03</w:t>
-            </w:r>
-          </w:p>
-        </w:tc>
-        <w:tc>
-          <w:tcPr>
-            <w:tcW w:w="1742" w:type="dxa"/>
-          </w:tcPr>
-          <w:p>
-            <w:pPr>
-              <w:rPr>
-                <w:rFonts w:ascii="Arial" w:hAnsi="Arial" w:cs="Arial"/>
-                <w:sz w:val="20"/>
-              </w:rPr>
-            </w:pPr>
-            <w:r>
-              <w:rPr>
-                <w:rFonts w:ascii="Arial" w:hAnsi="Arial" w:cs="Arial"/>
-                <w:sz w:val="20"/>
-              </w:rPr>
-              <w:t>Jateamento</w:t>
-            </w:r>
-          </w:p>
-        </w:tc>
-        <w:tc>
-          <w:tcPr>
-            <w:tcW w:w="1743" w:type="dxa"/>
-          </w:tcPr>
-          <w:p>
-            <w:pPr>
-              <w:rPr>
-                <w:rFonts w:ascii="Arial" w:hAnsi="Arial" w:cs="Arial"/>
-                <w:sz w:val="20"/>
-              </w:rPr>
-            </w:pPr>
-          </w:p>
-        </w:tc>
-        <w:tc>
-          <w:tcPr>
-            <w:tcW w:w="1743" w:type="dxa"/>
-          </w:tcPr>
-          <w:p>
-            <w:pPr>
-              <w:rPr>
-                <w:rFonts w:ascii="Arial" w:hAnsi="Arial" w:cs="Arial"/>
-                <w:sz w:val="20"/>
-              </w:rPr>
-            </w:pPr>
-          </w:p>
-        </w:tc>
-        <w:tc>
-          <w:tcPr>
-            <w:tcW w:w="1743" w:type="dxa"/>
-          </w:tcPr>
-          <w:p>
-            <w:pPr>
-              <w:rPr>
-                <w:rFonts w:ascii="Arial" w:hAnsi="Arial" w:cs="Arial"/>
-                <w:sz w:val="20"/>
-              </w:rPr>
-            </w:pPr>
-          </w:p>
-        </w:tc>
-        <w:tc>
-          <w:tcPr>
-            <w:tcW w:w="1743" w:type="dxa"/>
-          </w:tcPr>
-          <w:p>
-            <w:pPr>
-              <w:rPr>
-                <w:rFonts w:ascii="Arial" w:hAnsi="Arial" w:cs="Arial"/>
-                <w:sz w:val="20"/>
-              </w:rPr>
-            </w:pPr>
-          </w:p>
-        </w:tc>
-      </w:tr>
-      <w:tr>
-        <w:tc>
-          <w:tcPr>
-            <w:tcW w:w="1742" w:type="dxa"/>
-          </w:tcPr>
-          <w:p>
-            <w:pPr>
-              <w:rPr>
-                <w:rFonts w:ascii="Arial" w:hAnsi="Arial" w:cs="Arial"/>
-                <w:sz w:val="20"/>
-              </w:rPr>
-            </w:pPr>
-            <w:r>
-              <w:rPr>
-                <w:rFonts w:ascii="Arial" w:hAnsi="Arial" w:cs="Arial"/>
-                <w:sz w:val="20"/>
-              </w:rPr>
-              <w:t>04</w:t>
-            </w:r>
-          </w:p>
-        </w:tc>
-        <w:tc>
-          <w:tcPr>
-            <w:tcW w:w="1742" w:type="dxa"/>
-          </w:tcPr>
-          <w:p>
-            <w:pPr>
-              <w:rPr>
-                <w:rFonts w:ascii="Arial" w:hAnsi="Arial" w:cs="Arial"/>
-                <w:sz w:val="20"/>
-              </w:rPr>
-            </w:pPr>
-            <w:r>
-              <w:rPr>
-                <w:rFonts w:ascii="Arial" w:hAnsi="Arial" w:cs="Arial"/>
-                <w:sz w:val="20"/>
-              </w:rPr>
-              <w:t>Pintura</w:t>
-            </w:r>
-          </w:p>
-        </w:tc>
-        <w:tc>
-          <w:tcPr>
-            <w:tcW w:w="1743" w:type="dxa"/>
-          </w:tcPr>
-          <w:p>
-            <w:pPr>
-              <w:rPr>
-                <w:rFonts w:ascii="Arial" w:hAnsi="Arial" w:cs="Arial"/>
-                <w:sz w:val="20"/>
-              </w:rPr>
-            </w:pPr>
-          </w:p>
-        </w:tc>
-        <w:tc>
-          <w:tcPr>
-            <w:tcW w:w="1743" w:type="dxa"/>
-          </w:tcPr>
-          <w:p>
-            <w:pPr>
-              <w:rPr>
-                <w:rFonts w:ascii="Arial" w:hAnsi="Arial" w:cs="Arial"/>
-                <w:sz w:val="20"/>
-              </w:rPr>
-            </w:pPr>
-          </w:p>
-        </w:tc>
-        <w:tc>
-          <w:tcPr>
-            <w:tcW w:w="1743" w:type="dxa"/>
-          </w:tcPr>
-          <w:p>
-            <w:pPr>
-              <w:rPr>
-                <w:rFonts w:ascii="Arial" w:hAnsi="Arial" w:cs="Arial"/>
-                <w:sz w:val="20"/>
-              </w:rPr>
-            </w:pPr>
-          </w:p>
-        </w:tc>
-        <w:tc>
-          <w:tcPr>
-            <w:tcW w:w="1743" w:type="dxa"/>
-          </w:tcPr>
-          <w:p>
-            <w:pPr>
-              <w:rPr>
-                <w:rFonts w:ascii="Arial" w:hAnsi="Arial" w:cs="Arial"/>
-                <w:sz w:val="20"/>
-              </w:rPr>
-            </w:pPr>
           </w:p>
         </w:tc>
       </w:tr>
@@ -3861,6 +3663,7 @@
               <w:rPr>
                 <w:rFonts w:ascii="Arial" w:hAnsi="Arial" w:cs="Arial"/>
                 <w:b/>
+                <w:color w:val="000000"/>
                 <w:sz w:val="20"/>
               </w:rPr>
               <w:t>VALOR TOTAL</w:t>
@@ -4795,7 +4598,7 @@
         <w:rPr>
           <w:rFonts w:ascii="Arial" w:hAnsi="Arial" w:cs="Arial"/>
           <w:b/>
-          <w:color w:val="auto"/>
+          <w:color w:val="000000"/>
           <w:sz w:val="20"/>
           <w:szCs w:val="20"/>
         </w:rPr>
@@ -4805,7 +4608,7 @@
         <w:rPr>
           <w:rFonts w:ascii="Arial" w:hAnsi="Arial" w:cs="Arial"/>
           <w:b/>
-          <w:color w:val="auto"/>
+          <w:color w:val="000000"/>
           <w:sz w:val="20"/>
           <w:szCs w:val="20"/>
         </w:rPr>
@@ -4829,7 +4632,7 @@
       <w:r>
         <w:rPr>
           <w:rFonts w:ascii="Arial" w:hAnsi="Arial" w:cs="Arial"/>
-          <w:color w:val="FF0000"/>
+          <w:color w:val="000000"/>
           <w:sz w:val="20"/>
           <w:szCs w:val="20"/>
         </w:rPr>
@@ -4838,7 +4641,7 @@
       <w:r>
         <w:rPr>
           <w:rFonts w:ascii="Arial" w:hAnsi="Arial" w:cs="Arial"/>
-          <w:color w:val="FF0000"/>
+          <w:color w:val="000000"/>
           <w:sz w:val="20"/>
           <w:szCs w:val="20"/>
         </w:rPr>
@@ -4876,6 +4679,7 @@
         <w:rPr>
           <w:rFonts w:ascii="Arial" w:hAnsi="Arial" w:cs="Arial"/>
           <w:b/>
+          <w:color w:val="000000"/>
           <w:sz w:val="20"/>
           <w:szCs w:val="20"/>
         </w:rPr>
@@ -4900,33 +4704,31 @@
           <w:rFonts w:ascii="Arial" w:hAnsi="Arial" w:cs="Arial"/>
           <w:i/>
           <w:iCs/>
-          <w:color w:val="FF0000"/>
-          <w:sz w:val="20"/>
-          <w:szCs w:val="20"/>
-        </w:rPr>
-        <w:t xml:space="preserve">Material </w:t>
+          <w:color w:val="000000"/>
+          <w:sz w:val="20"/>
+          <w:szCs w:val="20"/>
+        </w:rPr>
+        <w:t>Material finalizado para embarque, vencíveis em {dias} dias a contar da data de emissão da NF respectiva</w:t>
       </w:r>
       <w:r>
         <w:rPr>
           <w:rFonts w:ascii="Arial" w:hAnsi="Arial" w:cs="Arial"/>
           <w:i/>
           <w:iCs/>
-          <w:color w:val="FF0000"/>
-          <w:sz w:val="20"/>
-          <w:szCs w:val="20"/>
-        </w:rPr>
-        <w:t>finalizado para embarque,</w:t>
+          <w:color w:val="000000"/>
+          <w:sz w:val="20"/>
+          <w:szCs w:val="20"/>
+        </w:rPr>
       </w:r>
       <w:r>
         <w:rPr>
           <w:rFonts w:ascii="Arial" w:hAnsi="Arial" w:cs="Arial"/>
           <w:i/>
           <w:iCs/>
-          <w:color w:val="FF0000"/>
-          <w:sz w:val="20"/>
-          <w:szCs w:val="20"/>
-        </w:rPr>
-        <w:t xml:space="preserve"> vencíveis em 15 dias a contar da data de emissão da NF respectiva</w:t>
+          <w:color w:val="000000"/>
+          <w:sz w:val="20"/>
+          <w:szCs w:val="20"/>
+        </w:rPr>
       </w:r>
     </w:p>
     <w:p>
@@ -4961,7 +4763,7 @@
         <w:rPr>
           <w:rFonts w:ascii="Arial" w:hAnsi="Arial" w:cs="Arial"/>
           <w:b/>
-          <w:color w:val="auto"/>
+          <w:color w:val="000000"/>
           <w:sz w:val="20"/>
           <w:szCs w:val="20"/>
         </w:rPr>
@@ -4984,6 +4786,7 @@
       <w:r>
         <w:rPr>
           <w:rFonts w:ascii="Arial" w:hAnsi="Arial" w:cs="Arial"/>
+          <w:color w:val="000000"/>
           <w:sz w:val="20"/>
           <w:szCs w:val="20"/>
         </w:rPr>
@@ -5022,7 +4825,7 @@
         <w:rPr>
           <w:rFonts w:ascii="Arial" w:hAnsi="Arial" w:cs="Arial"/>
           <w:b/>
-          <w:color w:val="auto"/>
+          <w:color w:val="000000"/>
           <w:sz w:val="20"/>
           <w:szCs w:val="20"/>
         </w:rPr>
@@ -5046,7 +4849,7 @@
       <w:r>
         <w:rPr>
           <w:rFonts w:ascii="Arial" w:hAnsi="Arial" w:cs="Arial"/>
-          <w:color w:val="FF0000"/>
+          <w:color w:val="000000"/>
           <w:sz w:val="20"/>
           <w:szCs w:val="20"/>
         </w:rPr>
@@ -5055,7 +4858,7 @@
       <w:r>
         <w:rPr>
           <w:rFonts w:ascii="Arial" w:hAnsi="Arial" w:cs="Arial"/>
-          <w:color w:val="FF0000"/>
+          <w:color w:val="000000"/>
           <w:sz w:val="20"/>
           <w:szCs w:val="20"/>
         </w:rPr>
@@ -5064,7 +4867,7 @@
       <w:r>
         <w:rPr>
           <w:rFonts w:ascii="Arial" w:hAnsi="Arial" w:cs="Arial"/>
-          <w:color w:val="FF0000"/>
+          <w:color w:val="000000"/>
           <w:sz w:val="20"/>
           <w:szCs w:val="20"/>
         </w:rPr>
@@ -5291,6 +5094,7 @@
               <w:rPr>
                 <w:rFonts w:ascii="Arial" w:hAnsi="Arial" w:cs="Arial"/>
                 <w:b/>
+                <w:color w:val="000000"/>
                 <w:sz w:val="20"/>
                 <w:szCs w:val="20"/>
               </w:rPr>
@@ -5316,6 +5120,7 @@
               <w:rPr>
                 <w:rFonts w:ascii="Arial" w:hAnsi="Arial" w:cs="Arial"/>
                 <w:b/>
+                <w:color w:val="000000"/>
                 <w:sz w:val="20"/>
                 <w:szCs w:val="20"/>
               </w:rPr>
@@ -5343,6 +5148,7 @@
             <w:r>
               <w:rPr>
                 <w:rFonts w:ascii="Arial" w:hAnsi="Arial" w:cs="Arial"/>
+                <w:color w:val="000000"/>
                 <w:sz w:val="20"/>
                 <w:szCs w:val="20"/>
               </w:rPr>
@@ -5365,6 +5171,7 @@
             <w:r>
               <w:rPr>
                 <w:rFonts w:ascii="Arial" w:hAnsi="Arial" w:cs="Arial"/>
+                <w:color w:val="000000"/>
                 <w:sz w:val="20"/>
                 <w:szCs w:val="20"/>
               </w:rPr>
@@ -5392,6 +5199,7 @@
             <w:r>
               <w:rPr>
                 <w:rFonts w:ascii="Arial" w:hAnsi="Arial" w:cs="Arial"/>
+                <w:color w:val="000000"/>
                 <w:sz w:val="20"/>
                 <w:szCs w:val="20"/>
               </w:rPr>
@@ -5414,6 +5222,7 @@
             <w:r>
               <w:rPr>
                 <w:rFonts w:ascii="Arial" w:hAnsi="Arial" w:cs="Arial"/>
+                <w:color w:val="000000"/>
                 <w:sz w:val="20"/>
                 <w:szCs w:val="20"/>
               </w:rPr>
@@ -5494,6 +5303,7 @@
       <w:r>
         <w:rPr>
           <w:noProof/>
+          <w:color w:val="000000"/>
         </w:rPr>
         <w:object w:dxaOrig="1440" w:dyaOrig="1440" w14:anchorId="134D0B9E">
           <v:shapetype id="_x0000_t75" coordsize="21600,21600" o:spt="75" o:preferrelative="t" path="m@4@5l@4@11@9@11@9@5xe" filled="f" stroked="f">
@@ -5526,6 +5336,7 @@
         <w:rPr>
           <w:b/>
           <w:bCs/>
+          <w:color w:val="000000"/>
         </w:rPr>
         <w:t>ANEXO I – PLANO DE INSPEÇÃO E TESTES</w:t>
       </w:r>

</xml_diff>

<commit_message>
fix(comercial): proposta — marcadores de lista em preto + remover ANEXO I (PIT)
- Bullets dos "documentos referentes" e o número da seção (1.2.1 etc.) estavam
  em vermelho: cor do marcador vem do paragraph-mark rPr, não do run — agora
  forçada em preto (000000).
- Remove o ANEXO I – Plano de Inspeção e Testes (PIT): vamos mandar só a
  proposta. Bloco de assinaturas preservado.

Co-Authored-By: Claude Opus 4.8 (1M context) <noreply@anthropic.com>
</commit_message>
<xml_diff>
--- a/templates/proposta-servico.docx
+++ b/templates/proposta-servico.docx
@@ -7,9 +7,9 @@
         <w:pStyle w:val="Ttulo5"/>
         <w:rPr>
           <w:rFonts w:ascii="Arial" w:hAnsi="Arial" w:cs="Arial"/>
-          <w:color w:val="FF0000"/>
           <w:sz w:val="20"/>
           <w:lang w:val="pt-BR"/>
+          <w:color w:val="000000"/>
         </w:rPr>
       </w:pPr>
       <w:r>
@@ -63,9 +63,9 @@
         <w:pStyle w:val="Ttulo5"/>
         <w:rPr>
           <w:rFonts w:ascii="Arial" w:hAnsi="Arial" w:cs="Arial"/>
-          <w:color w:val="FF0000"/>
           <w:sz w:val="20"/>
           <w:lang w:val="pt-BR"/>
+          <w:color w:val="000000"/>
         </w:rPr>
       </w:pPr>
       <w:r>
@@ -106,20 +106,20 @@
         <w:jc w:val="both"/>
         <w:rPr>
           <w:rFonts w:ascii="Arial" w:hAnsi="Arial" w:cs="Arial"/>
-          <w:color w:val="FF0000"/>
-          <w:sz w:val="20"/>
-          <w:szCs w:val="20"/>
-        </w:rPr>
-      </w:pPr>
-    </w:p>
-    <w:p>
-      <w:pPr>
-        <w:jc w:val="both"/>
-        <w:rPr>
-          <w:rFonts w:ascii="Arial" w:hAnsi="Arial" w:cs="Arial"/>
-          <w:color w:val="FF0000"/>
-          <w:sz w:val="20"/>
-          <w:szCs w:val="20"/>
+          <w:sz w:val="20"/>
+          <w:szCs w:val="20"/>
+          <w:color w:val="000000"/>
+        </w:rPr>
+      </w:pPr>
+    </w:p>
+    <w:p>
+      <w:pPr>
+        <w:jc w:val="both"/>
+        <w:rPr>
+          <w:rFonts w:ascii="Arial" w:hAnsi="Arial" w:cs="Arial"/>
+          <w:sz w:val="20"/>
+          <w:szCs w:val="20"/>
+          <w:color w:val="000000"/>
         </w:rPr>
       </w:pPr>
     </w:p>
@@ -134,6 +134,7 @@
           <w:rFonts w:ascii="Arial" w:hAnsi="Arial" w:cs="Arial"/>
           <w:sz w:val="20"/>
           <w:szCs w:val="20"/>
+          <w:color w:val="000000"/>
         </w:rPr>
       </w:pPr>
       <w:r>
@@ -157,9 +158,9 @@
           <w:rFonts w:ascii="Arial" w:hAnsi="Arial" w:cs="Arial"/>
           <w:b/>
           <w:bCs/>
-          <w:color w:val="FF0000"/>
-          <w:sz w:val="20"/>
-          <w:szCs w:val="20"/>
+          <w:sz w:val="20"/>
+          <w:szCs w:val="20"/>
+          <w:color w:val="000000"/>
         </w:rPr>
       </w:pPr>
       <w:r>
@@ -183,9 +184,9 @@
         <w:jc w:val="both"/>
         <w:rPr>
           <w:rFonts w:ascii="Arial" w:hAnsi="Arial" w:cs="Arial"/>
-          <w:color w:val="FF0000"/>
-          <w:sz w:val="20"/>
-          <w:szCs w:val="20"/>
+          <w:sz w:val="20"/>
+          <w:szCs w:val="20"/>
+          <w:color w:val="000000"/>
         </w:rPr>
       </w:pPr>
       <w:r>
@@ -207,9 +208,9 @@
         <w:jc w:val="both"/>
         <w:rPr>
           <w:rFonts w:ascii="Arial" w:hAnsi="Arial" w:cs="Arial"/>
-          <w:color w:val="FF0000"/>
-          <w:sz w:val="20"/>
-          <w:szCs w:val="20"/>
+          <w:sz w:val="20"/>
+          <w:szCs w:val="20"/>
+          <w:color w:val="000000"/>
         </w:rPr>
       </w:pPr>
       <w:r>
@@ -231,9 +232,9 @@
         <w:jc w:val="both"/>
         <w:rPr>
           <w:rFonts w:ascii="Arial" w:hAnsi="Arial" w:cs="Arial"/>
-          <w:color w:val="FF0000"/>
-          <w:sz w:val="20"/>
-          <w:szCs w:val="20"/>
+          <w:sz w:val="20"/>
+          <w:szCs w:val="20"/>
+          <w:color w:val="000000"/>
         </w:rPr>
       </w:pPr>
     </w:p>
@@ -246,9 +247,9 @@
         <w:jc w:val="both"/>
         <w:rPr>
           <w:rFonts w:ascii="Arial" w:hAnsi="Arial" w:cs="Arial"/>
-          <w:color w:val="FF0000"/>
-          <w:sz w:val="20"/>
-          <w:szCs w:val="20"/>
+          <w:sz w:val="20"/>
+          <w:szCs w:val="20"/>
+          <w:color w:val="000000"/>
         </w:rPr>
       </w:pPr>
     </w:p>
@@ -261,9 +262,9 @@
         <w:jc w:val="both"/>
         <w:rPr>
           <w:rFonts w:ascii="Arial" w:hAnsi="Arial" w:cs="Arial"/>
-          <w:color w:val="FF0000"/>
-          <w:sz w:val="20"/>
-          <w:szCs w:val="20"/>
+          <w:sz w:val="20"/>
+          <w:szCs w:val="20"/>
+          <w:color w:val="000000"/>
         </w:rPr>
       </w:pPr>
     </w:p>
@@ -292,9 +293,9 @@
                 <w:rFonts w:ascii="Arial" w:hAnsi="Arial" w:cs="Arial"/>
                 <w:bCs/>
                 <w:iCs/>
-                <w:color w:val="FF0000"/>
                 <w:sz w:val="20"/>
                 <w:szCs w:val="20"/>
+                <w:color w:val="000000"/>
               </w:rPr>
             </w:pPr>
             <w:r>
@@ -324,9 +325,9 @@
               <w:rPr>
                 <w:rFonts w:ascii="Arial" w:hAnsi="Arial" w:cs="Arial"/>
                 <w:bCs/>
-                <w:color w:val="FF0000"/>
                 <w:sz w:val="20"/>
                 <w:szCs w:val="20"/>
+                <w:color w:val="000000"/>
               </w:rPr>
             </w:pPr>
             <w:r>
@@ -358,9 +359,9 @@
                 <w:rFonts w:ascii="Arial" w:hAnsi="Arial" w:cs="Arial"/>
                 <w:bCs/>
                 <w:iCs/>
-                <w:color w:val="FF0000"/>
                 <w:sz w:val="20"/>
                 <w:szCs w:val="20"/>
+                <w:color w:val="000000"/>
               </w:rPr>
             </w:pPr>
           </w:p>
@@ -380,9 +381,9 @@
                 <w:rFonts w:ascii="Arial" w:hAnsi="Arial" w:cs="Arial"/>
                 <w:bCs/>
                 <w:iCs/>
-                <w:color w:val="FF0000"/>
                 <w:sz w:val="20"/>
                 <w:szCs w:val="20"/>
+                <w:color w:val="000000"/>
               </w:rPr>
             </w:pPr>
             <w:r>
@@ -414,9 +415,9 @@
                 <w:rFonts w:ascii="Arial" w:hAnsi="Arial" w:cs="Arial"/>
                 <w:bCs/>
                 <w:iCs/>
-                <w:color w:val="FF0000"/>
                 <w:sz w:val="20"/>
                 <w:szCs w:val="20"/>
+                <w:color w:val="000000"/>
               </w:rPr>
             </w:pPr>
           </w:p>
@@ -436,9 +437,9 @@
                 <w:rFonts w:ascii="Arial" w:hAnsi="Arial" w:cs="Arial"/>
                 <w:bCs/>
                 <w:iCs/>
-                <w:color w:val="FF0000"/>
                 <w:sz w:val="20"/>
                 <w:szCs w:val="20"/>
+                <w:color w:val="000000"/>
               </w:rPr>
             </w:pPr>
             <w:r>
@@ -472,6 +473,7 @@
           <w:rFonts w:ascii="Arial" w:hAnsi="Arial" w:cs="Arial"/>
           <w:sz w:val="20"/>
           <w:szCs w:val="20"/>
+          <w:color w:val="000000"/>
         </w:rPr>
       </w:pPr>
       <w:r>
@@ -502,9 +504,9 @@
         <w:jc w:val="both"/>
         <w:rPr>
           <w:rFonts w:ascii="Arial" w:hAnsi="Arial" w:cs="Arial"/>
-          <w:color w:val="FF0000"/>
-          <w:sz w:val="20"/>
-          <w:szCs w:val="20"/>
+          <w:sz w:val="20"/>
+          <w:szCs w:val="20"/>
+          <w:color w:val="000000"/>
         </w:rPr>
       </w:pPr>
     </w:p>
@@ -517,9 +519,9 @@
         <w:jc w:val="both"/>
         <w:rPr>
           <w:rFonts w:ascii="Arial" w:hAnsi="Arial" w:cs="Arial"/>
-          <w:color w:val="FF0000"/>
-          <w:sz w:val="20"/>
-          <w:szCs w:val="20"/>
+          <w:sz w:val="20"/>
+          <w:szCs w:val="20"/>
+          <w:color w:val="000000"/>
         </w:rPr>
       </w:pPr>
     </w:p>
@@ -550,6 +552,7 @@
                 <w:iCs/>
                 <w:sz w:val="20"/>
                 <w:szCs w:val="20"/>
+                <w:color w:val="000000"/>
               </w:rPr>
             </w:pPr>
             <w:r>
@@ -580,9 +583,9 @@
                 <w:rFonts w:ascii="Arial" w:hAnsi="Arial" w:cs="Arial"/>
                 <w:bCs/>
                 <w:iCs/>
-                <w:color w:val="FF0000"/>
                 <w:sz w:val="20"/>
                 <w:szCs w:val="20"/>
+                <w:color w:val="000000"/>
               </w:rPr>
             </w:pPr>
             <w:r>
@@ -615,6 +618,7 @@
                 <w:iCs/>
                 <w:sz w:val="20"/>
                 <w:szCs w:val="20"/>
+                <w:color w:val="000000"/>
               </w:rPr>
             </w:pPr>
           </w:p>
@@ -632,9 +636,9 @@
               <w:jc w:val="both"/>
               <w:rPr>
                 <w:rFonts w:ascii="Arial" w:hAnsi="Arial" w:cs="Arial"/>
-                <w:color w:val="FF0000"/>
                 <w:sz w:val="20"/>
                 <w:szCs w:val="20"/>
+                <w:color w:val="000000"/>
               </w:rPr>
             </w:pPr>
             <w:r>
@@ -677,6 +681,7 @@
           <w:rFonts w:ascii="Century Gothic" w:hAnsi="Century Gothic"/>
           <w:sz w:val="20"/>
           <w:szCs w:val="20"/>
+          <w:color w:val="000000"/>
         </w:rPr>
       </w:pPr>
     </w:p>
@@ -691,6 +696,7 @@
           <w:rFonts w:ascii="Century Gothic" w:hAnsi="Century Gothic"/>
           <w:sz w:val="20"/>
           <w:szCs w:val="20"/>
+          <w:color w:val="000000"/>
         </w:rPr>
       </w:pPr>
     </w:p>
@@ -705,6 +711,7 @@
           <w:rFonts w:ascii="Century Gothic" w:hAnsi="Century Gothic"/>
           <w:sz w:val="20"/>
           <w:szCs w:val="20"/>
+          <w:color w:val="000000"/>
         </w:rPr>
       </w:pPr>
     </w:p>
@@ -732,9 +739,9 @@
               <w:rPr>
                 <w:rFonts w:ascii="Arial" w:hAnsi="Arial" w:cs="Arial"/>
                 <w:b/>
-                <w:color w:val="FF0000"/>
                 <w:sz w:val="20"/>
                 <w:szCs w:val="20"/>
+                <w:color w:val="000000"/>
               </w:rPr>
             </w:pPr>
             <w:r>
@@ -762,9 +769,9 @@
               <w:rPr>
                 <w:rFonts w:ascii="Arial" w:hAnsi="Arial" w:cs="Arial"/>
                 <w:b/>
-                <w:color w:val="FF0000"/>
                 <w:sz w:val="20"/>
                 <w:szCs w:val="20"/>
+                <w:color w:val="000000"/>
               </w:rPr>
             </w:pPr>
             <w:r>
@@ -792,9 +799,9 @@
               <w:rPr>
                 <w:rFonts w:ascii="Arial" w:hAnsi="Arial" w:cs="Arial"/>
                 <w:b/>
-                <w:color w:val="FF0000"/>
                 <w:sz w:val="20"/>
                 <w:szCs w:val="20"/>
+                <w:color w:val="000000"/>
               </w:rPr>
             </w:pPr>
             <w:r>
@@ -824,9 +831,9 @@
               <w:jc w:val="both"/>
               <w:rPr>
                 <w:rFonts w:ascii="Arial" w:hAnsi="Arial" w:cs="Arial"/>
-                <w:color w:val="FF0000"/>
                 <w:sz w:val="20"/>
                 <w:szCs w:val="20"/>
+                <w:color w:val="000000"/>
               </w:rPr>
             </w:pPr>
             <w:r>
@@ -853,9 +860,9 @@
               <w:jc w:val="both"/>
               <w:rPr>
                 <w:rFonts w:ascii="Arial" w:hAnsi="Arial" w:cs="Arial"/>
-                <w:color w:val="FF0000"/>
                 <w:sz w:val="20"/>
                 <w:szCs w:val="20"/>
+                <w:color w:val="000000"/>
               </w:rPr>
             </w:pPr>
             <w:r>
@@ -882,9 +889,9 @@
               <w:jc w:val="both"/>
               <w:rPr>
                 <w:rFonts w:ascii="Arial" w:hAnsi="Arial" w:cs="Arial"/>
-                <w:color w:val="FF0000"/>
                 <w:sz w:val="20"/>
                 <w:szCs w:val="20"/>
+                <w:color w:val="000000"/>
               </w:rPr>
             </w:pPr>
             <w:r>
@@ -903,30 +910,37 @@
     <w:p>
       <w:pPr>
         <w:jc w:val="both"/>
-      </w:pPr>
-    </w:p>
-    <w:p>
-      <w:pPr>
-        <w:jc w:val="both"/>
+        <w:rPr>
+          <w:color w:val="000000"/>
+        </w:rPr>
+      </w:pPr>
+    </w:p>
+    <w:p>
+      <w:pPr>
+        <w:jc w:val="both"/>
+        <w:rPr>
+          <w:color w:val="000000"/>
+        </w:rPr>
       </w:pPr>
     </w:p>
     <w:p>
       <w:pPr>
         <w:pStyle w:val="Default"/>
         <w:rPr>
-          <w:color w:val="auto"/>
-          <w:sz w:val="20"/>
-          <w:szCs w:val="20"/>
-        </w:rPr>
-      </w:pPr>
-    </w:p>
-    <w:p>
-      <w:pPr>
-        <w:jc w:val="both"/>
-        <w:rPr>
-          <w:rFonts w:ascii="Arial" w:hAnsi="Arial" w:cs="Arial"/>
-          <w:sz w:val="20"/>
-          <w:szCs w:val="20"/>
+          <w:sz w:val="20"/>
+          <w:szCs w:val="20"/>
+          <w:color w:val="000000"/>
+        </w:rPr>
+      </w:pPr>
+    </w:p>
+    <w:p>
+      <w:pPr>
+        <w:jc w:val="both"/>
+        <w:rPr>
+          <w:rFonts w:ascii="Arial" w:hAnsi="Arial" w:cs="Arial"/>
+          <w:sz w:val="20"/>
+          <w:szCs w:val="20"/>
+          <w:color w:val="000000"/>
         </w:rPr>
       </w:pPr>
       <w:r>
@@ -1027,6 +1041,7 @@
           <w:rFonts w:ascii="Arial" w:hAnsi="Arial" w:cs="Arial"/>
           <w:sz w:val="20"/>
           <w:szCs w:val="20"/>
+          <w:color w:val="000000"/>
         </w:rPr>
       </w:pPr>
       <w:r>
@@ -1046,16 +1061,18 @@
           <w:rFonts w:ascii="Arial" w:hAnsi="Arial" w:cs="Arial"/>
           <w:sz w:val="20"/>
           <w:szCs w:val="20"/>
-        </w:rPr>
-      </w:pPr>
-    </w:p>
-    <w:p>
-      <w:pPr>
-        <w:jc w:val="both"/>
-        <w:rPr>
-          <w:rFonts w:ascii="Arial" w:hAnsi="Arial" w:cs="Arial"/>
-          <w:sz w:val="20"/>
-          <w:szCs w:val="20"/>
+          <w:color w:val="000000"/>
+        </w:rPr>
+      </w:pPr>
+    </w:p>
+    <w:p>
+      <w:pPr>
+        <w:jc w:val="both"/>
+        <w:rPr>
+          <w:rFonts w:ascii="Arial" w:hAnsi="Arial" w:cs="Arial"/>
+          <w:sz w:val="20"/>
+          <w:szCs w:val="20"/>
+          <w:color w:val="000000"/>
         </w:rPr>
       </w:pPr>
     </w:p>
@@ -1072,6 +1089,7 @@
           <w:b/>
           <w:sz w:val="20"/>
           <w:szCs w:val="20"/>
+          <w:color w:val="000000"/>
         </w:rPr>
       </w:pPr>
       <w:r>
@@ -1093,6 +1111,7 @@
           <w:b/>
           <w:sz w:val="20"/>
           <w:szCs w:val="20"/>
+          <w:color w:val="000000"/>
         </w:rPr>
       </w:pPr>
     </w:p>
@@ -1109,6 +1128,7 @@
           <w:b/>
           <w:sz w:val="20"/>
           <w:szCs w:val="20"/>
+          <w:color w:val="000000"/>
         </w:rPr>
       </w:pPr>
       <w:r>
@@ -1130,6 +1150,7 @@
           <w:rFonts w:ascii="Arial" w:hAnsi="Arial" w:cs="Arial"/>
           <w:sz w:val="20"/>
           <w:szCs w:val="20"/>
+          <w:color w:val="000000"/>
         </w:rPr>
       </w:pPr>
       <w:r>
@@ -1214,6 +1235,7 @@
           <w:rFonts w:ascii="Arial" w:hAnsi="Arial" w:cs="Arial"/>
           <w:sz w:val="20"/>
           <w:szCs w:val="20"/>
+          <w:color w:val="000000"/>
         </w:rPr>
       </w:pPr>
     </w:p>
@@ -1225,6 +1247,7 @@
           <w:rFonts w:ascii="Arial" w:hAnsi="Arial" w:cs="Arial"/>
           <w:sz w:val="20"/>
           <w:szCs w:val="20"/>
+          <w:color w:val="000000"/>
         </w:rPr>
       </w:pPr>
     </w:p>
@@ -1236,6 +1259,7 @@
           <w:rFonts w:ascii="Arial" w:hAnsi="Arial" w:cs="Arial"/>
           <w:sz w:val="20"/>
           <w:szCs w:val="20"/>
+          <w:color w:val="000000"/>
         </w:rPr>
       </w:pPr>
       <w:r>
@@ -1274,6 +1298,7 @@
           <w:rFonts w:ascii="Arial" w:hAnsi="Arial" w:cs="Arial"/>
           <w:sz w:val="20"/>
           <w:szCs w:val="20"/>
+          <w:color w:val="000000"/>
         </w:rPr>
       </w:pPr>
     </w:p>
@@ -1287,6 +1312,7 @@
           <w:sz w:val="20"/>
           <w:szCs w:val="20"/>
           <w:u w:val="single"/>
+          <w:color w:val="000000"/>
         </w:rPr>
       </w:pPr>
       <w:r>
@@ -1311,6 +1337,7 @@
           <w:sz w:val="20"/>
           <w:szCs w:val="20"/>
           <w:u w:val="single"/>
+          <w:color w:val="000000"/>
         </w:rPr>
       </w:pPr>
     </w:p>
@@ -1329,9 +1356,9 @@
         <w:jc w:val="both"/>
         <w:rPr>
           <w:rFonts w:ascii="Arial" w:hAnsi="Arial" w:cs="Arial"/>
-          <w:color w:val="FF0000"/>
-          <w:sz w:val="20"/>
-          <w:szCs w:val="20"/>
+          <w:sz w:val="20"/>
+          <w:szCs w:val="20"/>
+          <w:color w:val="000000"/>
         </w:rPr>
       </w:pPr>
       <w:r>
@@ -1354,9 +1381,9 @@
         <w:jc w:val="both"/>
         <w:rPr>
           <w:rFonts w:ascii="Arial" w:hAnsi="Arial" w:cs="Arial"/>
-          <w:color w:val="FF0000"/>
-          <w:sz w:val="20"/>
-          <w:szCs w:val="20"/>
+          <w:sz w:val="20"/>
+          <w:szCs w:val="20"/>
+          <w:color w:val="000000"/>
         </w:rPr>
       </w:pPr>
     </w:p>
@@ -1373,6 +1400,7 @@
           <w:b/>
           <w:sz w:val="20"/>
           <w:szCs w:val="20"/>
+          <w:color w:val="000000"/>
         </w:rPr>
       </w:pPr>
       <w:r>
@@ -1403,6 +1431,7 @@
           <w:rFonts w:ascii="Arial" w:hAnsi="Arial" w:cs="Arial"/>
           <w:sz w:val="20"/>
           <w:szCs w:val="20"/>
+          <w:color w:val="000000"/>
         </w:rPr>
       </w:pPr>
     </w:p>
@@ -1423,10 +1452,10 @@
           <w:rFonts w:ascii="Arial" w:hAnsi="Arial" w:cs="Arial"/>
           <w:b/>
           <w:i/>
-          <w:color w:val="EE0000"/>
           <w:sz w:val="20"/>
           <w:szCs w:val="20"/>
           <w:u w:val="single"/>
+          <w:color w:val="000000"/>
         </w:rPr>
       </w:pPr>
       <w:r>
@@ -1446,17 +1475,17 @@
       <w:pPr>
         <w:rPr>
           <w:rFonts w:ascii="Arial" w:hAnsi="Arial" w:cs="Arial"/>
-          <w:color w:val="EE0000"/>
-          <w:sz w:val="20"/>
-        </w:rPr>
-      </w:pPr>
-    </w:p>
-    <w:p>
-      <w:pPr>
-        <w:rPr>
-          <w:rFonts w:ascii="Arial" w:hAnsi="Arial" w:cs="Arial"/>
-          <w:color w:val="EE0000"/>
-          <w:sz w:val="20"/>
+          <w:sz w:val="20"/>
+          <w:color w:val="000000"/>
+        </w:rPr>
+      </w:pPr>
+    </w:p>
+    <w:p>
+      <w:pPr>
+        <w:rPr>
+          <w:rFonts w:ascii="Arial" w:hAnsi="Arial" w:cs="Arial"/>
+          <w:sz w:val="20"/>
+          <w:color w:val="000000"/>
         </w:rPr>
       </w:pPr>
       <w:r>
@@ -1490,17 +1519,17 @@
       <w:pPr>
         <w:rPr>
           <w:rFonts w:ascii="Arial" w:hAnsi="Arial" w:cs="Arial"/>
-          <w:color w:val="EE0000"/>
-          <w:sz w:val="20"/>
-        </w:rPr>
-      </w:pPr>
-    </w:p>
-    <w:p>
-      <w:pPr>
-        <w:rPr>
-          <w:rFonts w:ascii="Arial" w:hAnsi="Arial" w:cs="Arial"/>
-          <w:color w:val="EE0000"/>
-          <w:sz w:val="20"/>
+          <w:sz w:val="20"/>
+          <w:color w:val="000000"/>
+        </w:rPr>
+      </w:pPr>
+    </w:p>
+    <w:p>
+      <w:pPr>
+        <w:rPr>
+          <w:rFonts w:ascii="Arial" w:hAnsi="Arial" w:cs="Arial"/>
+          <w:sz w:val="20"/>
+          <w:color w:val="000000"/>
         </w:rPr>
       </w:pPr>
       <w:r>
@@ -1516,8 +1545,8 @@
       <w:pPr>
         <w:rPr>
           <w:rFonts w:ascii="Arial" w:hAnsi="Arial" w:cs="Arial"/>
-          <w:color w:val="EE0000"/>
-          <w:sz w:val="20"/>
+          <w:sz w:val="20"/>
+          <w:color w:val="000000"/>
         </w:rPr>
       </w:pPr>
       <w:r>
@@ -1549,8 +1578,8 @@
       <w:pPr>
         <w:rPr>
           <w:rFonts w:ascii="Arial" w:hAnsi="Arial" w:cs="Arial"/>
-          <w:color w:val="EE0000"/>
-          <w:sz w:val="20"/>
+          <w:sz w:val="20"/>
+          <w:color w:val="000000"/>
         </w:rPr>
       </w:pPr>
       <w:r>
@@ -1566,8 +1595,8 @@
       <w:pPr>
         <w:rPr>
           <w:rFonts w:ascii="Arial" w:hAnsi="Arial" w:cs="Arial"/>
-          <w:color w:val="EE0000"/>
-          <w:sz w:val="20"/>
+          <w:sz w:val="20"/>
+          <w:color w:val="000000"/>
         </w:rPr>
       </w:pPr>
       <w:r>
@@ -1636,8 +1665,8 @@
       <w:pPr>
         <w:rPr>
           <w:rFonts w:ascii="Arial" w:hAnsi="Arial" w:cs="Arial"/>
-          <w:color w:val="EE0000"/>
-          <w:sz w:val="20"/>
+          <w:sz w:val="20"/>
+          <w:color w:val="000000"/>
         </w:rPr>
       </w:pPr>
     </w:p>
@@ -1658,10 +1687,10 @@
           <w:rFonts w:ascii="Arial" w:hAnsi="Arial" w:cs="Arial"/>
           <w:b/>
           <w:i/>
-          <w:color w:val="EE0000"/>
           <w:sz w:val="20"/>
           <w:szCs w:val="20"/>
           <w:u w:val="single"/>
+          <w:color w:val="000000"/>
         </w:rPr>
       </w:pPr>
       <w:r>
@@ -1681,17 +1710,17 @@
       <w:pPr>
         <w:rPr>
           <w:rFonts w:ascii="Arial" w:hAnsi="Arial" w:cs="Arial"/>
-          <w:color w:val="EE0000"/>
-          <w:sz w:val="20"/>
-        </w:rPr>
-      </w:pPr>
-    </w:p>
-    <w:p>
-      <w:pPr>
-        <w:rPr>
-          <w:rFonts w:ascii="Arial" w:hAnsi="Arial" w:cs="Arial"/>
-          <w:color w:val="EE0000"/>
-          <w:sz w:val="20"/>
+          <w:sz w:val="20"/>
+          <w:color w:val="000000"/>
+        </w:rPr>
+      </w:pPr>
+    </w:p>
+    <w:p>
+      <w:pPr>
+        <w:rPr>
+          <w:rFonts w:ascii="Arial" w:hAnsi="Arial" w:cs="Arial"/>
+          <w:sz w:val="20"/>
+          <w:color w:val="000000"/>
         </w:rPr>
       </w:pPr>
       <w:r>
@@ -1707,17 +1736,17 @@
       <w:pPr>
         <w:rPr>
           <w:rFonts w:ascii="Arial" w:hAnsi="Arial" w:cs="Arial"/>
-          <w:color w:val="EE0000"/>
-          <w:sz w:val="20"/>
-        </w:rPr>
-      </w:pPr>
-    </w:p>
-    <w:p>
-      <w:pPr>
-        <w:rPr>
-          <w:rFonts w:ascii="Arial" w:hAnsi="Arial" w:cs="Arial"/>
-          <w:color w:val="EE0000"/>
-          <w:sz w:val="20"/>
+          <w:sz w:val="20"/>
+          <w:color w:val="000000"/>
+        </w:rPr>
+      </w:pPr>
+    </w:p>
+    <w:p>
+      <w:pPr>
+        <w:rPr>
+          <w:rFonts w:ascii="Arial" w:hAnsi="Arial" w:cs="Arial"/>
+          <w:sz w:val="20"/>
+          <w:color w:val="000000"/>
         </w:rPr>
       </w:pPr>
       <w:r>
@@ -1733,8 +1762,8 @@
       <w:pPr>
         <w:rPr>
           <w:rFonts w:ascii="Arial" w:hAnsi="Arial" w:cs="Arial"/>
-          <w:color w:val="EE0000"/>
-          <w:sz w:val="20"/>
+          <w:sz w:val="20"/>
+          <w:color w:val="000000"/>
         </w:rPr>
       </w:pPr>
       <w:r>
@@ -1750,8 +1779,8 @@
       <w:pPr>
         <w:rPr>
           <w:rFonts w:ascii="Arial" w:hAnsi="Arial" w:cs="Arial"/>
-          <w:color w:val="EE0000"/>
-          <w:sz w:val="20"/>
+          <w:sz w:val="20"/>
+          <w:color w:val="000000"/>
         </w:rPr>
       </w:pPr>
       <w:r>
@@ -1826,8 +1855,8 @@
       <w:pPr>
         <w:rPr>
           <w:rFonts w:ascii="Arial" w:hAnsi="Arial" w:cs="Arial"/>
-          <w:color w:val="EE0000"/>
-          <w:sz w:val="20"/>
+          <w:sz w:val="20"/>
+          <w:color w:val="000000"/>
         </w:rPr>
       </w:pPr>
     </w:p>
@@ -1846,8 +1875,8 @@
         <w:rPr>
           <w:rFonts w:ascii="Arial" w:hAnsi="Arial" w:cs="Arial"/>
           <w:b/>
-          <w:color w:val="EE0000"/>
-          <w:sz w:val="20"/>
+          <w:sz w:val="20"/>
+          <w:color w:val="000000"/>
         </w:rPr>
       </w:pPr>
       <w:r>
@@ -1864,17 +1893,17 @@
       <w:pPr>
         <w:rPr>
           <w:rFonts w:ascii="Arial" w:hAnsi="Arial" w:cs="Arial"/>
-          <w:color w:val="EE0000"/>
-          <w:sz w:val="20"/>
-        </w:rPr>
-      </w:pPr>
-    </w:p>
-    <w:p>
-      <w:pPr>
-        <w:rPr>
-          <w:rFonts w:ascii="Arial" w:hAnsi="Arial" w:cs="Arial"/>
-          <w:color w:val="EE0000"/>
-          <w:sz w:val="20"/>
+          <w:sz w:val="20"/>
+          <w:color w:val="000000"/>
+        </w:rPr>
+      </w:pPr>
+    </w:p>
+    <w:p>
+      <w:pPr>
+        <w:rPr>
+          <w:rFonts w:ascii="Arial" w:hAnsi="Arial" w:cs="Arial"/>
+          <w:sz w:val="20"/>
+          <w:color w:val="000000"/>
         </w:rPr>
       </w:pPr>
       <w:r>
@@ -1890,17 +1919,17 @@
       <w:pPr>
         <w:rPr>
           <w:rFonts w:ascii="Arial" w:hAnsi="Arial" w:cs="Arial"/>
-          <w:color w:val="EE0000"/>
-          <w:sz w:val="20"/>
-        </w:rPr>
-      </w:pPr>
-    </w:p>
-    <w:p>
-      <w:pPr>
-        <w:rPr>
-          <w:rFonts w:ascii="Arial" w:hAnsi="Arial" w:cs="Arial"/>
-          <w:color w:val="EE0000"/>
-          <w:sz w:val="20"/>
+          <w:sz w:val="20"/>
+          <w:color w:val="000000"/>
+        </w:rPr>
+      </w:pPr>
+    </w:p>
+    <w:p>
+      <w:pPr>
+        <w:rPr>
+          <w:rFonts w:ascii="Arial" w:hAnsi="Arial" w:cs="Arial"/>
+          <w:sz w:val="20"/>
+          <w:color w:val="000000"/>
         </w:rPr>
       </w:pPr>
       <w:r>
@@ -1916,8 +1945,8 @@
       <w:pPr>
         <w:rPr>
           <w:rFonts w:ascii="Arial" w:hAnsi="Arial" w:cs="Arial"/>
-          <w:color w:val="EE0000"/>
-          <w:sz w:val="20"/>
+          <w:sz w:val="20"/>
+          <w:color w:val="000000"/>
         </w:rPr>
       </w:pPr>
       <w:r>
@@ -1933,8 +1962,8 @@
       <w:pPr>
         <w:rPr>
           <w:rFonts w:ascii="Arial" w:hAnsi="Arial" w:cs="Arial"/>
-          <w:color w:val="EE0000"/>
-          <w:sz w:val="20"/>
+          <w:sz w:val="20"/>
+          <w:color w:val="000000"/>
         </w:rPr>
       </w:pPr>
       <w:r>
@@ -2009,8 +2038,8 @@
       <w:pPr>
         <w:rPr>
           <w:rFonts w:ascii="Arial" w:hAnsi="Arial" w:cs="Arial"/>
-          <w:color w:val="EE0000"/>
-          <w:sz w:val="20"/>
+          <w:sz w:val="20"/>
+          <w:color w:val="000000"/>
         </w:rPr>
       </w:pPr>
     </w:p>
@@ -2029,8 +2058,8 @@
         <w:rPr>
           <w:rFonts w:ascii="Arial" w:hAnsi="Arial" w:cs="Arial"/>
           <w:b/>
-          <w:color w:val="EE0000"/>
-          <w:sz w:val="20"/>
+          <w:sz w:val="20"/>
+          <w:color w:val="000000"/>
         </w:rPr>
       </w:pPr>
       <w:r>
@@ -2047,17 +2076,17 @@
       <w:pPr>
         <w:rPr>
           <w:rFonts w:ascii="Arial" w:hAnsi="Arial" w:cs="Arial"/>
-          <w:color w:val="EE0000"/>
-          <w:sz w:val="20"/>
-        </w:rPr>
-      </w:pPr>
-    </w:p>
-    <w:p>
-      <w:pPr>
-        <w:rPr>
-          <w:rFonts w:ascii="Arial" w:hAnsi="Arial" w:cs="Arial"/>
-          <w:color w:val="EE0000"/>
-          <w:sz w:val="20"/>
+          <w:sz w:val="20"/>
+          <w:color w:val="000000"/>
+        </w:rPr>
+      </w:pPr>
+    </w:p>
+    <w:p>
+      <w:pPr>
+        <w:rPr>
+          <w:rFonts w:ascii="Arial" w:hAnsi="Arial" w:cs="Arial"/>
+          <w:sz w:val="20"/>
+          <w:color w:val="000000"/>
         </w:rPr>
       </w:pPr>
       <w:r>
@@ -2073,17 +2102,17 @@
       <w:pPr>
         <w:rPr>
           <w:rFonts w:ascii="Arial" w:hAnsi="Arial" w:cs="Arial"/>
-          <w:color w:val="EE0000"/>
-          <w:sz w:val="20"/>
-        </w:rPr>
-      </w:pPr>
-    </w:p>
-    <w:p>
-      <w:pPr>
-        <w:rPr>
-          <w:rFonts w:ascii="Arial" w:hAnsi="Arial" w:cs="Arial"/>
-          <w:color w:val="EE0000"/>
-          <w:sz w:val="20"/>
+          <w:sz w:val="20"/>
+          <w:color w:val="000000"/>
+        </w:rPr>
+      </w:pPr>
+    </w:p>
+    <w:p>
+      <w:pPr>
+        <w:rPr>
+          <w:rFonts w:ascii="Arial" w:hAnsi="Arial" w:cs="Arial"/>
+          <w:sz w:val="20"/>
+          <w:color w:val="000000"/>
         </w:rPr>
       </w:pPr>
       <w:r>
@@ -2099,8 +2128,8 @@
       <w:pPr>
         <w:rPr>
           <w:rFonts w:ascii="Arial" w:hAnsi="Arial" w:cs="Arial"/>
-          <w:color w:val="EE0000"/>
-          <w:sz w:val="20"/>
+          <w:sz w:val="20"/>
+          <w:color w:val="000000"/>
         </w:rPr>
       </w:pPr>
       <w:r>
@@ -2116,8 +2145,8 @@
       <w:pPr>
         <w:rPr>
           <w:rFonts w:ascii="Arial" w:hAnsi="Arial" w:cs="Arial"/>
-          <w:color w:val="EE0000"/>
-          <w:sz w:val="20"/>
+          <w:sz w:val="20"/>
+          <w:color w:val="000000"/>
         </w:rPr>
       </w:pPr>
       <w:r>
@@ -2151,8 +2180,8 @@
       <w:pPr>
         <w:rPr>
           <w:rFonts w:ascii="Arial" w:hAnsi="Arial" w:cs="Arial"/>
-          <w:color w:val="EE0000"/>
-          <w:sz w:val="20"/>
+          <w:sz w:val="20"/>
+          <w:color w:val="000000"/>
         </w:rPr>
       </w:pPr>
       <w:r>
@@ -2186,8 +2215,8 @@
       <w:pPr>
         <w:rPr>
           <w:rFonts w:ascii="Arial" w:hAnsi="Arial" w:cs="Arial"/>
-          <w:color w:val="EE0000"/>
-          <w:sz w:val="20"/>
+          <w:sz w:val="20"/>
+          <w:color w:val="000000"/>
         </w:rPr>
       </w:pPr>
       <w:r>
@@ -2221,8 +2250,8 @@
       <w:pPr>
         <w:rPr>
           <w:rFonts w:ascii="Arial" w:hAnsi="Arial" w:cs="Arial"/>
-          <w:color w:val="EE0000"/>
-          <w:sz w:val="20"/>
+          <w:sz w:val="20"/>
+          <w:color w:val="000000"/>
         </w:rPr>
       </w:pPr>
       <w:r>
@@ -2238,8 +2267,8 @@
       <w:pPr>
         <w:rPr>
           <w:rFonts w:ascii="Arial" w:hAnsi="Arial" w:cs="Arial"/>
-          <w:color w:val="EE0000"/>
-          <w:sz w:val="20"/>
+          <w:sz w:val="20"/>
+          <w:color w:val="000000"/>
         </w:rPr>
       </w:pPr>
       <w:r>
@@ -2315,18 +2344,19 @@
         <w:rPr>
           <w:rFonts w:ascii="Arial" w:hAnsi="Arial" w:cs="Arial"/>
           <w:sz w:val="20"/>
-        </w:rPr>
-      </w:pPr>
-    </w:p>
-    <w:p>
-      <w:pPr>
-        <w:jc w:val="both"/>
-        <w:rPr>
-          <w:rFonts w:ascii="Arial" w:hAnsi="Arial" w:cs="Arial"/>
-          <w:color w:val="FF0000"/>
+          <w:color w:val="000000"/>
+        </w:rPr>
+      </w:pPr>
+    </w:p>
+    <w:p>
+      <w:pPr>
+        <w:jc w:val="both"/>
+        <w:rPr>
+          <w:rFonts w:ascii="Arial" w:hAnsi="Arial" w:cs="Arial"/>
           <w:sz w:val="20"/>
           <w:szCs w:val="20"/>
           <w:lang w:val="en-US"/>
+          <w:color w:val="000000"/>
         </w:rPr>
       </w:pPr>
     </w:p>
@@ -2341,9 +2371,9 @@
         <w:rPr>
           <w:rFonts w:ascii="Arial" w:hAnsi="Arial" w:cs="Arial"/>
           <w:b/>
-          <w:color w:val="000000"/>
-          <w:sz w:val="20"/>
-          <w:szCs w:val="20"/>
+          <w:sz w:val="20"/>
+          <w:szCs w:val="20"/>
+          <w:color w:val="000000"/>
         </w:rPr>
       </w:pPr>
       <w:r>
@@ -2368,6 +2398,7 @@
           <w:rFonts w:ascii="Arial" w:hAnsi="Arial" w:cs="Arial"/>
           <w:sz w:val="20"/>
           <w:szCs w:val="20"/>
+          <w:color w:val="000000"/>
         </w:rPr>
       </w:pPr>
       <w:r>
@@ -2391,6 +2422,7 @@
           <w:rFonts w:ascii="Arial" w:hAnsi="Arial" w:cs="Arial"/>
           <w:sz w:val="20"/>
           <w:szCs w:val="20"/>
+          <w:color w:val="000000"/>
         </w:rPr>
       </w:pPr>
       <w:r>
@@ -2452,6 +2484,7 @@
           <w:rFonts w:ascii="Arial" w:hAnsi="Arial" w:cs="Arial"/>
           <w:sz w:val="20"/>
           <w:szCs w:val="20"/>
+          <w:color w:val="000000"/>
         </w:rPr>
       </w:pPr>
       <w:r>
@@ -2470,9 +2503,9 @@
         <w:rPr>
           <w:rFonts w:ascii="Arial" w:hAnsi="Arial" w:cs="Arial"/>
           <w:b/>
-          <w:color w:val="000000"/>
-          <w:sz w:val="20"/>
-          <w:szCs w:val="20"/>
+          <w:sz w:val="20"/>
+          <w:szCs w:val="20"/>
+          <w:color w:val="000000"/>
         </w:rPr>
       </w:pPr>
     </w:p>
@@ -2487,9 +2520,9 @@
         <w:rPr>
           <w:rFonts w:ascii="Arial" w:hAnsi="Arial" w:cs="Arial"/>
           <w:b/>
-          <w:color w:val="000000"/>
-          <w:sz w:val="20"/>
-          <w:szCs w:val="20"/>
+          <w:sz w:val="20"/>
+          <w:szCs w:val="20"/>
+          <w:color w:val="000000"/>
         </w:rPr>
       </w:pPr>
       <w:r>
@@ -2513,9 +2546,9 @@
         <w:rPr>
           <w:rFonts w:ascii="Arial" w:hAnsi="Arial" w:cs="Arial"/>
           <w:bCs/>
-          <w:color w:val="000000"/>
-          <w:sz w:val="20"/>
-          <w:szCs w:val="20"/>
+          <w:sz w:val="20"/>
+          <w:szCs w:val="20"/>
+          <w:color w:val="000000"/>
         </w:rPr>
       </w:pPr>
       <w:r>
@@ -2575,6 +2608,7 @@
           <w:bCs/>
           <w:sz w:val="20"/>
           <w:szCs w:val="20"/>
+          <w:color w:val="000000"/>
         </w:rPr>
       </w:pPr>
     </w:p>
@@ -2591,6 +2625,7 @@
           <w:b/>
           <w:sz w:val="20"/>
           <w:szCs w:val="20"/>
+          <w:color w:val="000000"/>
         </w:rPr>
       </w:pPr>
       <w:r>
@@ -2613,6 +2648,7 @@
           <w:bCs/>
           <w:sz w:val="20"/>
           <w:szCs w:val="20"/>
+          <w:color w:val="000000"/>
         </w:rPr>
       </w:pPr>
       <w:r>
@@ -2634,6 +2670,7 @@
           <w:b/>
           <w:sz w:val="20"/>
           <w:szCs w:val="20"/>
+          <w:color w:val="000000"/>
         </w:rPr>
       </w:pPr>
     </w:p>
@@ -2650,6 +2687,7 @@
           <w:b/>
           <w:sz w:val="20"/>
           <w:szCs w:val="20"/>
+          <w:color w:val="000000"/>
         </w:rPr>
       </w:pPr>
       <w:r>
@@ -2672,9 +2710,9 @@
         <w:jc w:val="both"/>
         <w:rPr>
           <w:rFonts w:ascii="Arial" w:hAnsi="Arial" w:cs="Arial"/>
-          <w:color w:val="EE0000"/>
-          <w:sz w:val="20"/>
-          <w:szCs w:val="20"/>
+          <w:sz w:val="20"/>
+          <w:szCs w:val="20"/>
+          <w:color w:val="000000"/>
         </w:rPr>
       </w:pPr>
       <w:r>
@@ -2696,9 +2734,9 @@
         <w:jc w:val="both"/>
         <w:rPr>
           <w:rFonts w:ascii="Arial" w:hAnsi="Arial" w:cs="Arial"/>
-          <w:color w:val="EE0000"/>
-          <w:sz w:val="20"/>
-          <w:szCs w:val="20"/>
+          <w:sz w:val="20"/>
+          <w:szCs w:val="20"/>
+          <w:color w:val="000000"/>
         </w:rPr>
       </w:pPr>
       <w:r>
@@ -2729,9 +2767,9 @@
         <w:jc w:val="both"/>
         <w:rPr>
           <w:rFonts w:ascii="Arial" w:hAnsi="Arial" w:cs="Arial"/>
-          <w:color w:val="EE0000"/>
-          <w:sz w:val="20"/>
-          <w:szCs w:val="20"/>
+          <w:sz w:val="20"/>
+          <w:szCs w:val="20"/>
+          <w:color w:val="000000"/>
         </w:rPr>
       </w:pPr>
       <w:r>
@@ -2762,9 +2800,9 @@
         <w:jc w:val="both"/>
         <w:rPr>
           <w:rFonts w:ascii="Arial" w:hAnsi="Arial" w:cs="Arial"/>
-          <w:color w:val="FF0000"/>
-          <w:sz w:val="20"/>
-          <w:szCs w:val="20"/>
+          <w:sz w:val="20"/>
+          <w:szCs w:val="20"/>
+          <w:color w:val="000000"/>
         </w:rPr>
       </w:pPr>
       <w:r>
@@ -2803,6 +2841,7 @@
           <w:rFonts w:ascii="Arial" w:hAnsi="Arial" w:cs="Arial"/>
           <w:sz w:val="20"/>
           <w:szCs w:val="20"/>
+          <w:color w:val="000000"/>
         </w:rPr>
       </w:pPr>
     </w:p>
@@ -2819,6 +2858,7 @@
           <w:b/>
           <w:sz w:val="20"/>
           <w:szCs w:val="20"/>
+          <w:color w:val="000000"/>
         </w:rPr>
       </w:pPr>
       <w:r>
@@ -2843,6 +2883,7 @@
           <w:rFonts w:ascii="Arial" w:hAnsi="Arial" w:cs="Arial"/>
           <w:sz w:val="20"/>
           <w:szCs w:val="20"/>
+          <w:color w:val="000000"/>
         </w:rPr>
       </w:pPr>
       <w:r>
@@ -2875,6 +2916,7 @@
           <w:rFonts w:ascii="Arial" w:hAnsi="Arial" w:cs="Arial"/>
           <w:sz w:val="20"/>
           <w:szCs w:val="20"/>
+          <w:color w:val="000000"/>
         </w:rPr>
       </w:pPr>
       <w:r>
@@ -2907,6 +2949,7 @@
           <w:rFonts w:ascii="Arial" w:hAnsi="Arial" w:cs="Arial"/>
           <w:sz w:val="20"/>
           <w:szCs w:val="20"/>
+          <w:color w:val="000000"/>
         </w:rPr>
       </w:pPr>
       <w:r>
@@ -2948,6 +2991,7 @@
           <w:rFonts w:ascii="Arial" w:hAnsi="Arial" w:cs="Arial"/>
           <w:sz w:val="20"/>
           <w:szCs w:val="20"/>
+          <w:color w:val="000000"/>
         </w:rPr>
       </w:pPr>
       <w:r>
@@ -2971,6 +3015,7 @@
           <w:rFonts w:ascii="Arial" w:hAnsi="Arial" w:cs="Arial"/>
           <w:sz w:val="20"/>
           <w:szCs w:val="20"/>
+          <w:color w:val="000000"/>
         </w:rPr>
       </w:pPr>
       <w:r>
@@ -2994,6 +3039,7 @@
           <w:rFonts w:ascii="Arial" w:hAnsi="Arial" w:cs="Arial"/>
           <w:sz w:val="20"/>
           <w:szCs w:val="20"/>
+          <w:color w:val="000000"/>
         </w:rPr>
       </w:pPr>
       <w:r>
@@ -3017,6 +3063,7 @@
           <w:rFonts w:ascii="Arial" w:hAnsi="Arial" w:cs="Arial"/>
           <w:sz w:val="20"/>
           <w:szCs w:val="20"/>
+          <w:color w:val="000000"/>
         </w:rPr>
       </w:pPr>
       <w:r>
@@ -3040,6 +3087,7 @@
           <w:rFonts w:ascii="Arial" w:hAnsi="Arial" w:cs="Arial"/>
           <w:sz w:val="20"/>
           <w:szCs w:val="20"/>
+          <w:color w:val="000000"/>
         </w:rPr>
       </w:pPr>
       <w:r>
@@ -3058,9 +3106,9 @@
         <w:rPr>
           <w:rFonts w:ascii="Arial" w:hAnsi="Arial" w:cs="Arial"/>
           <w:b/>
-          <w:color w:val="000000"/>
-          <w:sz w:val="20"/>
-          <w:szCs w:val="20"/>
+          <w:sz w:val="20"/>
+          <w:szCs w:val="20"/>
+          <w:color w:val="000000"/>
         </w:rPr>
       </w:pPr>
     </w:p>
@@ -3075,9 +3123,9 @@
         <w:rPr>
           <w:rFonts w:ascii="Arial" w:hAnsi="Arial" w:cs="Arial"/>
           <w:b/>
-          <w:color w:val="000000"/>
-          <w:sz w:val="20"/>
-          <w:szCs w:val="20"/>
+          <w:sz w:val="20"/>
+          <w:szCs w:val="20"/>
+          <w:color w:val="000000"/>
         </w:rPr>
       </w:pPr>
       <w:r>
@@ -3102,6 +3150,7 @@
           <w:rFonts w:ascii="Arial" w:hAnsi="Arial" w:cs="Arial"/>
           <w:sz w:val="20"/>
           <w:szCs w:val="20"/>
+          <w:color w:val="000000"/>
         </w:rPr>
       </w:pPr>
       <w:r>
@@ -3145,6 +3194,7 @@
           <w:rFonts w:ascii="Arial" w:hAnsi="Arial" w:cs="Arial"/>
           <w:sz w:val="20"/>
           <w:szCs w:val="20"/>
+          <w:color w:val="000000"/>
         </w:rPr>
       </w:pPr>
       <w:r>
@@ -3168,6 +3218,7 @@
           <w:rFonts w:ascii="Arial" w:hAnsi="Arial" w:cs="Arial"/>
           <w:sz w:val="20"/>
           <w:szCs w:val="20"/>
+          <w:color w:val="000000"/>
         </w:rPr>
       </w:pPr>
       <w:proofErr w:type="spellStart"/>
@@ -3222,6 +3273,7 @@
           <w:rFonts w:ascii="Arial" w:hAnsi="Arial" w:cs="Arial"/>
           <w:sz w:val="20"/>
           <w:szCs w:val="20"/>
+          <w:color w:val="000000"/>
         </w:rPr>
       </w:pPr>
       <w:r>
@@ -3245,6 +3297,7 @@
           <w:rFonts w:ascii="Arial" w:hAnsi="Arial" w:cs="Arial"/>
           <w:sz w:val="20"/>
           <w:szCs w:val="20"/>
+          <w:color w:val="000000"/>
         </w:rPr>
       </w:pPr>
       <w:r>
@@ -3272,9 +3325,9 @@
         <w:rPr>
           <w:rFonts w:ascii="Arial" w:hAnsi="Arial" w:cs="Arial"/>
           <w:bCs/>
-          <w:color w:val="FF0000"/>
-          <w:sz w:val="20"/>
-          <w:szCs w:val="20"/>
+          <w:sz w:val="20"/>
+          <w:szCs w:val="20"/>
+          <w:color w:val="000000"/>
         </w:rPr>
       </w:pPr>
     </w:p>
@@ -3291,6 +3344,7 @@
           <w:b/>
           <w:sz w:val="20"/>
           <w:szCs w:val="20"/>
+          <w:color w:val="000000"/>
         </w:rPr>
       </w:pPr>
       <w:r>
@@ -3312,6 +3366,7 @@
           <w:b/>
           <w:sz w:val="20"/>
           <w:szCs w:val="20"/>
+          <w:color w:val="000000"/>
         </w:rPr>
       </w:pPr>
     </w:p>
@@ -3327,9 +3382,9 @@
         <w:rPr>
           <w:rFonts w:ascii="Arial" w:hAnsi="Arial" w:cs="Arial"/>
           <w:b/>
-          <w:color w:val="auto"/>
-          <w:sz w:val="20"/>
-          <w:szCs w:val="20"/>
+          <w:sz w:val="20"/>
+          <w:szCs w:val="20"/>
+          <w:color w:val="000000"/>
         </w:rPr>
       </w:pPr>
       <w:r>
@@ -3348,6 +3403,7 @@
         <w:rPr>
           <w:rFonts w:ascii="Arial" w:hAnsi="Arial" w:cs="Arial"/>
           <w:sz w:val="20"/>
+          <w:color w:val="000000"/>
         </w:rPr>
       </w:pPr>
       <w:r>
@@ -3384,6 +3440,7 @@
                 <w:rFonts w:ascii="Arial" w:hAnsi="Arial" w:cs="Arial"/>
                 <w:b/>
                 <w:sz w:val="20"/>
+                <w:color w:val="000000"/>
               </w:rPr>
             </w:pPr>
             <w:r>
@@ -3407,6 +3464,7 @@
                 <w:rFonts w:ascii="Arial" w:hAnsi="Arial" w:cs="Arial"/>
                 <w:b/>
                 <w:sz w:val="20"/>
+                <w:color w:val="000000"/>
               </w:rPr>
             </w:pPr>
             <w:r>
@@ -3430,6 +3488,7 @@
                 <w:rFonts w:ascii="Arial" w:hAnsi="Arial" w:cs="Arial"/>
                 <w:b/>
                 <w:sz w:val="20"/>
+                <w:color w:val="000000"/>
               </w:rPr>
             </w:pPr>
             <w:r>
@@ -3453,6 +3512,7 @@
                 <w:rFonts w:ascii="Arial" w:hAnsi="Arial" w:cs="Arial"/>
                 <w:b/>
                 <w:sz w:val="20"/>
+                <w:color w:val="000000"/>
               </w:rPr>
             </w:pPr>
             <w:proofErr w:type="spellStart"/>
@@ -3487,6 +3547,7 @@
                 <w:rFonts w:ascii="Arial" w:hAnsi="Arial" w:cs="Arial"/>
                 <w:b/>
                 <w:sz w:val="20"/>
+                <w:color w:val="000000"/>
               </w:rPr>
             </w:pPr>
             <w:r>
@@ -3510,6 +3571,7 @@
                 <w:rFonts w:ascii="Arial" w:hAnsi="Arial" w:cs="Arial"/>
                 <w:b/>
                 <w:sz w:val="20"/>
+                <w:color w:val="000000"/>
               </w:rPr>
             </w:pPr>
             <w:r>
@@ -3534,6 +3596,7 @@
               <w:rPr>
                 <w:rFonts w:ascii="Arial" w:hAnsi="Arial" w:cs="Arial"/>
                 <w:sz w:val="20"/>
+                <w:color w:val="000000"/>
               </w:rPr>
             </w:pPr>
             <w:r>
@@ -3555,6 +3618,7 @@
               <w:rPr>
                 <w:rFonts w:ascii="Arial" w:hAnsi="Arial" w:cs="Arial"/>
                 <w:sz w:val="20"/>
+                <w:color w:val="000000"/>
               </w:rPr>
             </w:pPr>
             <w:r>
@@ -3576,6 +3640,7 @@
               <w:rPr>
                 <w:rFonts w:ascii="Arial" w:hAnsi="Arial" w:cs="Arial"/>
                 <w:sz w:val="20"/>
+                <w:color w:val="000000"/>
               </w:rPr>
             </w:pPr>
             <w:r>
@@ -3592,6 +3657,7 @@
               <w:rPr>
                 <w:rFonts w:ascii="Arial" w:hAnsi="Arial" w:cs="Arial"/>
                 <w:sz w:val="20"/>
+                <w:color w:val="000000"/>
               </w:rPr>
             </w:pPr>
             <w:r>
@@ -3608,6 +3674,7 @@
               <w:rPr>
                 <w:rFonts w:ascii="Arial" w:hAnsi="Arial" w:cs="Arial"/>
                 <w:sz w:val="20"/>
+                <w:color w:val="000000"/>
               </w:rPr>
             </w:pPr>
             <w:r>
@@ -3624,6 +3691,7 @@
               <w:rPr>
                 <w:rFonts w:ascii="Arial" w:hAnsi="Arial" w:cs="Arial"/>
                 <w:sz w:val="20"/>
+                <w:color w:val="000000"/>
               </w:rPr>
             </w:pPr>
             <w:r>
@@ -3643,6 +3711,7 @@
                 <w:rFonts w:ascii="Arial" w:hAnsi="Arial" w:cs="Arial"/>
                 <w:b/>
                 <w:sz w:val="20"/>
+                <w:color w:val="000000"/>
               </w:rPr>
             </w:pPr>
           </w:p>
@@ -3657,6 +3726,7 @@
                 <w:rFonts w:ascii="Arial" w:hAnsi="Arial" w:cs="Arial"/>
                 <w:b/>
                 <w:sz w:val="20"/>
+                <w:color w:val="000000"/>
               </w:rPr>
             </w:pPr>
             <w:r>
@@ -3680,6 +3750,7 @@
                 <w:rFonts w:ascii="Arial" w:hAnsi="Arial" w:cs="Arial"/>
                 <w:b/>
                 <w:sz w:val="20"/>
+                <w:color w:val="000000"/>
               </w:rPr>
             </w:pPr>
           </w:p>
@@ -3694,6 +3765,7 @@
                 <w:rFonts w:ascii="Arial" w:hAnsi="Arial" w:cs="Arial"/>
                 <w:b/>
                 <w:sz w:val="20"/>
+                <w:color w:val="000000"/>
               </w:rPr>
             </w:pPr>
           </w:p>
@@ -3708,6 +3780,7 @@
                 <w:rFonts w:ascii="Arial" w:hAnsi="Arial" w:cs="Arial"/>
                 <w:b/>
                 <w:sz w:val="20"/>
+                <w:color w:val="000000"/>
               </w:rPr>
             </w:pPr>
           </w:p>
@@ -3722,6 +3795,7 @@
                 <w:rFonts w:ascii="Arial" w:hAnsi="Arial" w:cs="Arial"/>
                 <w:b/>
                 <w:sz w:val="20"/>
+                <w:color w:val="000000"/>
               </w:rPr>
             </w:pPr>
             <w:r>
@@ -3736,14 +3810,16 @@
         <w:rPr>
           <w:rFonts w:ascii="Arial" w:hAnsi="Arial" w:cs="Arial"/>
           <w:sz w:val="20"/>
-        </w:rPr>
-      </w:pPr>
-    </w:p>
-    <w:p>
-      <w:pPr>
-        <w:rPr>
-          <w:rFonts w:ascii="Arial" w:hAnsi="Arial" w:cs="Arial"/>
-          <w:sz w:val="20"/>
+          <w:color w:val="000000"/>
+        </w:rPr>
+      </w:pPr>
+    </w:p>
+    <w:p>
+      <w:pPr>
+        <w:rPr>
+          <w:rFonts w:ascii="Arial" w:hAnsi="Arial" w:cs="Arial"/>
+          <w:sz w:val="20"/>
+          <w:color w:val="000000"/>
         </w:rPr>
       </w:pPr>
     </w:p>
@@ -3753,9 +3829,9 @@
         <w:rPr>
           <w:rFonts w:ascii="Arial" w:hAnsi="Arial" w:cs="Arial"/>
           <w:b/>
-          <w:color w:val="FF0000"/>
-          <w:sz w:val="20"/>
-          <w:szCs w:val="20"/>
+          <w:sz w:val="20"/>
+          <w:szCs w:val="20"/>
+          <w:color w:val="000000"/>
         </w:rPr>
       </w:pPr>
     </w:p>
@@ -3768,10 +3844,10 @@
         <w:rPr>
           <w:rFonts w:ascii="Arial" w:hAnsi="Arial" w:cs="Arial"/>
           <w:bCs/>
-          <w:color w:val="FF0000"/>
           <w:sz w:val="20"/>
           <w:szCs w:val="20"/>
           <w:highlight w:val="yellow"/>
+          <w:color w:val="000000"/>
         </w:rPr>
       </w:pPr>
       <w:bookmarkStart w:id="0" w:name="_MON_1422272720"/>
@@ -4399,9 +4475,9 @@
         <w:rPr>
           <w:rFonts w:ascii="Arial" w:hAnsi="Arial" w:cs="Arial"/>
           <w:b/>
-          <w:color w:val="auto"/>
-          <w:sz w:val="20"/>
-          <w:szCs w:val="20"/>
+          <w:sz w:val="20"/>
+          <w:szCs w:val="20"/>
+          <w:color w:val="000000"/>
         </w:rPr>
       </w:pPr>
       <w:bookmarkStart w:id="306" w:name="_MON_1410325107"/>
@@ -4624,9 +4700,9 @@
         <w:jc w:val="both"/>
         <w:rPr>
           <w:rFonts w:ascii="Arial" w:hAnsi="Arial" w:cs="Arial"/>
-          <w:color w:val="FF0000"/>
-          <w:sz w:val="20"/>
-          <w:szCs w:val="20"/>
+          <w:sz w:val="20"/>
+          <w:szCs w:val="20"/>
+          <w:color w:val="000000"/>
         </w:rPr>
       </w:pPr>
       <w:r>
@@ -4653,9 +4729,9 @@
         <w:jc w:val="both"/>
         <w:rPr>
           <w:rFonts w:ascii="Arial" w:hAnsi="Arial" w:cs="Arial"/>
-          <w:color w:val="000000"/>
-          <w:sz w:val="20"/>
-          <w:szCs w:val="20"/>
+          <w:sz w:val="20"/>
+          <w:szCs w:val="20"/>
+          <w:color w:val="000000"/>
         </w:rPr>
       </w:pPr>
     </w:p>
@@ -4673,6 +4749,7 @@
           <w:b/>
           <w:sz w:val="20"/>
           <w:szCs w:val="20"/>
+          <w:color w:val="000000"/>
         </w:rPr>
       </w:pPr>
       <w:r>
@@ -4697,6 +4774,7 @@
           <w:rFonts w:ascii="Arial" w:hAnsi="Arial" w:cs="Arial"/>
           <w:sz w:val="20"/>
           <w:szCs w:val="20"/>
+          <w:color w:val="000000"/>
         </w:rPr>
       </w:pPr>
       <w:r>
@@ -4739,6 +4817,7 @@
           <w:rFonts w:ascii="Arial" w:hAnsi="Arial" w:cs="Arial"/>
           <w:sz w:val="20"/>
           <w:szCs w:val="20"/>
+          <w:color w:val="000000"/>
         </w:rPr>
       </w:pPr>
     </w:p>
@@ -4754,9 +4833,9 @@
         <w:rPr>
           <w:rFonts w:ascii="Arial" w:hAnsi="Arial" w:cs="Arial"/>
           <w:b/>
-          <w:color w:val="auto"/>
-          <w:sz w:val="20"/>
-          <w:szCs w:val="20"/>
+          <w:sz w:val="20"/>
+          <w:szCs w:val="20"/>
+          <w:color w:val="000000"/>
         </w:rPr>
       </w:pPr>
       <w:r>
@@ -4781,6 +4860,7 @@
           <w:rFonts w:ascii="Arial" w:hAnsi="Arial" w:cs="Arial"/>
           <w:sz w:val="20"/>
           <w:szCs w:val="20"/>
+          <w:color w:val="000000"/>
         </w:rPr>
       </w:pPr>
       <w:r>
@@ -4801,6 +4881,7 @@
           <w:bCs/>
           <w:sz w:val="20"/>
           <w:szCs w:val="20"/>
+          <w:color w:val="000000"/>
         </w:rPr>
       </w:pPr>
     </w:p>
@@ -4816,9 +4897,9 @@
         <w:rPr>
           <w:rFonts w:ascii="Arial" w:hAnsi="Arial" w:cs="Arial"/>
           <w:b/>
-          <w:color w:val="auto"/>
-          <w:sz w:val="20"/>
-          <w:szCs w:val="20"/>
+          <w:sz w:val="20"/>
+          <w:szCs w:val="20"/>
+          <w:color w:val="000000"/>
         </w:rPr>
       </w:pPr>
       <w:r>
@@ -4841,9 +4922,9 @@
         <w:jc w:val="both"/>
         <w:rPr>
           <w:rFonts w:ascii="Arial" w:hAnsi="Arial" w:cs="Arial"/>
-          <w:color w:val="FF0000"/>
-          <w:sz w:val="20"/>
-          <w:szCs w:val="20"/>
+          <w:sz w:val="20"/>
+          <w:szCs w:val="20"/>
+          <w:color w:val="000000"/>
         </w:rPr>
       </w:pPr>
       <w:r>
@@ -4880,9 +4961,9 @@
         <w:rPr>
           <w:rFonts w:ascii="Arial" w:hAnsi="Arial" w:cs="Arial"/>
           <w:bCs/>
-          <w:color w:val="000000"/>
-          <w:sz w:val="20"/>
-          <w:szCs w:val="20"/>
+          <w:sz w:val="20"/>
+          <w:szCs w:val="20"/>
+          <w:color w:val="000000"/>
         </w:rPr>
       </w:pPr>
     </w:p>
@@ -4892,9 +4973,9 @@
         <w:rPr>
           <w:rFonts w:ascii="Arial" w:hAnsi="Arial" w:cs="Arial"/>
           <w:bCs/>
-          <w:color w:val="000000"/>
-          <w:sz w:val="20"/>
-          <w:szCs w:val="20"/>
+          <w:sz w:val="20"/>
+          <w:szCs w:val="20"/>
+          <w:color w:val="000000"/>
         </w:rPr>
       </w:pPr>
     </w:p>
@@ -4904,9 +4985,9 @@
         <w:jc w:val="both"/>
         <w:rPr>
           <w:rFonts w:ascii="Arial" w:hAnsi="Arial" w:cs="Arial"/>
-          <w:color w:val="000000"/>
-          <w:sz w:val="20"/>
-          <w:szCs w:val="20"/>
+          <w:sz w:val="20"/>
+          <w:szCs w:val="20"/>
+          <w:color w:val="000000"/>
         </w:rPr>
       </w:pPr>
       <w:r>
@@ -4925,9 +5006,9 @@
         <w:jc w:val="both"/>
         <w:rPr>
           <w:rFonts w:ascii="Arial" w:hAnsi="Arial" w:cs="Arial"/>
-          <w:color w:val="000000"/>
-          <w:sz w:val="20"/>
-          <w:szCs w:val="20"/>
+          <w:sz w:val="20"/>
+          <w:szCs w:val="20"/>
+          <w:color w:val="000000"/>
         </w:rPr>
       </w:pPr>
     </w:p>
@@ -4937,9 +5018,9 @@
         <w:jc w:val="both"/>
         <w:rPr>
           <w:rFonts w:ascii="Arial" w:hAnsi="Arial" w:cs="Arial"/>
-          <w:color w:val="000000"/>
-          <w:sz w:val="20"/>
-          <w:szCs w:val="20"/>
+          <w:sz w:val="20"/>
+          <w:szCs w:val="20"/>
+          <w:color w:val="000000"/>
         </w:rPr>
       </w:pPr>
     </w:p>
@@ -4949,9 +5030,9 @@
         <w:jc w:val="both"/>
         <w:rPr>
           <w:rFonts w:ascii="Arial" w:hAnsi="Arial" w:cs="Arial"/>
-          <w:color w:val="000000"/>
-          <w:sz w:val="20"/>
-          <w:szCs w:val="20"/>
+          <w:sz w:val="20"/>
+          <w:szCs w:val="20"/>
+          <w:color w:val="000000"/>
         </w:rPr>
       </w:pPr>
       <w:r>
@@ -4979,9 +5060,9 @@
         <w:jc w:val="both"/>
         <w:rPr>
           <w:rFonts w:ascii="Arial" w:hAnsi="Arial" w:cs="Arial"/>
-          <w:color w:val="000000"/>
-          <w:sz w:val="20"/>
-          <w:szCs w:val="20"/>
+          <w:sz w:val="20"/>
+          <w:szCs w:val="20"/>
+          <w:color w:val="000000"/>
         </w:rPr>
       </w:pPr>
     </w:p>
@@ -4991,9 +5072,9 @@
         <w:jc w:val="both"/>
         <w:rPr>
           <w:rFonts w:ascii="Arial" w:hAnsi="Arial" w:cs="Arial"/>
-          <w:color w:val="000000"/>
-          <w:sz w:val="20"/>
-          <w:szCs w:val="20"/>
+          <w:sz w:val="20"/>
+          <w:szCs w:val="20"/>
+          <w:color w:val="000000"/>
         </w:rPr>
       </w:pPr>
     </w:p>
@@ -5003,9 +5084,9 @@
         <w:jc w:val="both"/>
         <w:rPr>
           <w:rFonts w:ascii="Arial" w:hAnsi="Arial" w:cs="Arial"/>
-          <w:color w:val="000000"/>
-          <w:sz w:val="20"/>
-          <w:szCs w:val="20"/>
+          <w:sz w:val="20"/>
+          <w:szCs w:val="20"/>
+          <w:color w:val="000000"/>
         </w:rPr>
       </w:pPr>
     </w:p>
@@ -5028,9 +5109,9 @@
               <w:jc w:val="center"/>
               <w:rPr>
                 <w:rFonts w:ascii="Arial" w:hAnsi="Arial" w:cs="Arial"/>
-                <w:color w:val="FF0000"/>
                 <w:sz w:val="20"/>
                 <w:szCs w:val="20"/>
+                <w:color w:val="000000"/>
               </w:rPr>
             </w:pPr>
             <w:r>
@@ -5054,9 +5135,9 @@
               <w:jc w:val="center"/>
               <w:rPr>
                 <w:rFonts w:ascii="Arial" w:hAnsi="Arial" w:cs="Arial"/>
-                <w:color w:val="FF0000"/>
                 <w:sz w:val="20"/>
                 <w:szCs w:val="20"/>
+                <w:color w:val="000000"/>
               </w:rPr>
             </w:pPr>
             <w:r>
@@ -5088,6 +5169,7 @@
                 <w:b/>
                 <w:sz w:val="20"/>
                 <w:szCs w:val="20"/>
+                <w:color w:val="000000"/>
               </w:rPr>
             </w:pPr>
             <w:r>
@@ -5114,6 +5196,7 @@
                 <w:b/>
                 <w:sz w:val="20"/>
                 <w:szCs w:val="20"/>
+                <w:color w:val="000000"/>
               </w:rPr>
             </w:pPr>
             <w:r>
@@ -5143,6 +5226,7 @@
                 <w:rFonts w:ascii="Arial" w:hAnsi="Arial" w:cs="Arial"/>
                 <w:sz w:val="20"/>
                 <w:szCs w:val="20"/>
+                <w:color w:val="000000"/>
               </w:rPr>
             </w:pPr>
             <w:r>
@@ -5166,6 +5250,7 @@
                 <w:rFonts w:ascii="Arial" w:hAnsi="Arial" w:cs="Arial"/>
                 <w:sz w:val="20"/>
                 <w:szCs w:val="20"/>
+                <w:color w:val="000000"/>
               </w:rPr>
             </w:pPr>
             <w:r>
@@ -5194,6 +5279,7 @@
                 <w:rFonts w:ascii="Arial" w:hAnsi="Arial" w:cs="Arial"/>
                 <w:sz w:val="20"/>
                 <w:szCs w:val="20"/>
+                <w:color w:val="000000"/>
               </w:rPr>
             </w:pPr>
             <w:r>
@@ -5217,6 +5303,7 @@
                 <w:rFonts w:ascii="Arial" w:hAnsi="Arial" w:cs="Arial"/>
                 <w:sz w:val="20"/>
                 <w:szCs w:val="20"/>
+                <w:color w:val="000000"/>
               </w:rPr>
             </w:pPr>
             <w:r>
@@ -5238,9 +5325,9 @@
         <w:jc w:val="both"/>
         <w:rPr>
           <w:rFonts w:ascii="Arial" w:hAnsi="Arial" w:cs="Arial"/>
-          <w:color w:val="000000"/>
-          <w:sz w:val="20"/>
-          <w:szCs w:val="20"/>
+          <w:sz w:val="20"/>
+          <w:szCs w:val="20"/>
+          <w:color w:val="000000"/>
         </w:rPr>
       </w:pPr>
       <w:r>
@@ -5259,9 +5346,9 @@
         <w:rPr>
           <w:rFonts w:ascii="Arial" w:hAnsi="Arial" w:cs="Arial"/>
           <w:bCs/>
-          <w:color w:val="000000"/>
-          <w:sz w:val="20"/>
-          <w:szCs w:val="20"/>
+          <w:sz w:val="20"/>
+          <w:szCs w:val="20"/>
+          <w:color w:val="000000"/>
         </w:rPr>
         <w:sectPr>
           <w:headerReference w:type="even" r:id="rId11"/>
@@ -5286,115 +5373,8 @@
         <w:rPr>
           <w:b/>
           <w:bCs/>
-        </w:rPr>
-      </w:pPr>
-    </w:p>
-    <w:p>
-      <w:pPr>
-        <w:tabs>
-          <w:tab w:val="left" w:pos="2850"/>
-        </w:tabs>
-        <w:jc w:val="center"/>
-        <w:rPr>
-          <w:b/>
-          <w:bCs/>
-        </w:rPr>
-      </w:pPr>
-      <w:r>
-        <w:rPr>
-          <w:noProof/>
-          <w:color w:val="000000"/>
-        </w:rPr>
-        <w:object w:dxaOrig="1440" w:dyaOrig="1440" w14:anchorId="134D0B9E">
-          <v:shapetype id="_x0000_t75" coordsize="21600,21600" o:spt="75" o:preferrelative="t" path="m@4@5l@4@11@9@11@9@5xe" filled="f" stroked="f">
-            <v:stroke joinstyle="miter"/>
-            <v:formulas>
-              <v:f eqn="if lineDrawn pixelLineWidth 0"/>
-              <v:f eqn="sum @0 1 0"/>
-              <v:f eqn="sum 0 0 @1"/>
-              <v:f eqn="prod @2 1 2"/>
-              <v:f eqn="prod @3 21600 pixelWidth"/>
-              <v:f eqn="prod @3 21600 pixelHeight"/>
-              <v:f eqn="sum @0 0 1"/>
-              <v:f eqn="prod @6 1 2"/>
-              <v:f eqn="prod @7 21600 pixelWidth"/>
-              <v:f eqn="sum @8 21600 0"/>
-              <v:f eqn="prod @7 21600 pixelHeight"/>
-              <v:f eqn="sum @10 21600 0"/>
-            </v:formulas>
-            <v:path o:extrusionok="f" gradientshapeok="t" o:connecttype="rect"/>
-            <o:lock v:ext="edit" aspectratio="t"/>
-          </v:shapetype>
-          <v:shape id="_x0000_s2053" type="#_x0000_t75" style="position:absolute;left:0;text-align:left;margin-left:0;margin-top:27.2pt;width:711.35pt;height:339.75pt;z-index:251658240;mso-position-horizontal:center;mso-position-horizontal-relative:text;mso-position-vertical:absolute;mso-position-vertical-relative:text">
-            <v:imagedata r:id="rId17" o:title=""/>
-            <w10:wrap type="square"/>
-          </v:shape>
-          <o:OLEObject Type="Embed" ProgID="Excel.Sheet.12" ShapeID="_x0000_s2053" DrawAspect="Content" ObjectID="_1844955828" r:id="rId18"/>
-        </w:object>
-      </w:r>
-      <w:r>
-        <w:rPr>
-          <w:b/>
-          <w:bCs/>
-          <w:color w:val="000000"/>
-        </w:rPr>
-        <w:t>ANEXO I – PLANO DE INSPEÇÃO E TESTES</w:t>
-      </w:r>
-    </w:p>
-    <w:p>
-      <w:pPr>
-        <w:tabs>
-          <w:tab w:val="left" w:pos="2850"/>
-        </w:tabs>
-      </w:pPr>
-    </w:p>
-    <w:p>
-      <w:pPr>
-        <w:tabs>
-          <w:tab w:val="left" w:pos="2850"/>
-        </w:tabs>
-      </w:pPr>
-    </w:p>
-    <w:p>
-      <w:pPr>
-        <w:tabs>
-          <w:tab w:val="left" w:pos="2850"/>
-        </w:tabs>
-      </w:pPr>
-    </w:p>
-    <w:p>
-      <w:pPr>
-        <w:tabs>
-          <w:tab w:val="left" w:pos="2850"/>
-        </w:tabs>
-      </w:pPr>
-    </w:p>
-    <w:p>
-      <w:pPr>
-        <w:tabs>
-          <w:tab w:val="left" w:pos="2850"/>
-        </w:tabs>
-      </w:pPr>
-    </w:p>
-    <w:p>
-      <w:pPr>
-        <w:tabs>
-          <w:tab w:val="left" w:pos="2850"/>
-        </w:tabs>
-      </w:pPr>
-    </w:p>
-    <w:p>
-      <w:pPr>
-        <w:tabs>
-          <w:tab w:val="left" w:pos="2850"/>
-        </w:tabs>
-      </w:pPr>
-    </w:p>
-    <w:p>
-      <w:pPr>
-        <w:tabs>
-          <w:tab w:val="left" w:pos="2850"/>
-        </w:tabs>
+          <w:color w:val="000000"/>
+        </w:rPr>
       </w:pPr>
     </w:p>
     <w:sectPr>

</xml_diff>

<commit_message>
feat(comercial): enviar proposta ao cliente + revisões
Envio pelo portal (aba Resumo → "Enviar ao cliente"): gera o PDF (CloudConvert)
e manda por e-mail (Resend) com saudação formal, nº da proposta + revisão,
mensagem estratégica editável, CC selecionável do comercial (via
/api/relatorios/emails) e anexo PDF. From "Torg Metal - Comercial" (sendEmail
ganhou fromName — não vai mais como "Workspace"). Endpoint /enviar registra
enviadoEm/status/envios e grava a R00 (Emissão inicial) no 1º envio.

Revisões (só depois de enviado): botão "Criar revisão" exige o motivo; endpoint
/revisao incrementa o número e grava data+motivo no histórico. Reenvio simples
(erro bobo) não precisa de revisão. Tabela de revisão do Word virou loop
({#revisoes}); nº da proposta agora inclui -R00/-R01. Colunas revisao/revisoes/
enviadoEm/envios via SQL.

Co-Authored-By: Claude Opus 4.8 (1M context) <noreply@anthropic.com>
</commit_message>
<xml_diff>
--- a/templates/proposta-servico.docx
+++ b/templates/proposta-servico.docx
@@ -843,7 +843,7 @@
                 <w:sz w:val="20"/>
                 <w:szCs w:val="20"/>
               </w:rPr>
-              <w:t>00</w:t>
+              <w:t>{#revisoes}{rev_num}</w:t>
             </w:r>
           </w:p>
         </w:tc>
@@ -872,7 +872,7 @@
                 <w:sz w:val="20"/>
                 <w:szCs w:val="20"/>
               </w:rPr>
-              <w:t>XX/XX/XXXX</w:t>
+              <w:t>{rev_data}</w:t>
             </w:r>
           </w:p>
         </w:tc>
@@ -901,7 +901,7 @@
                 <w:sz w:val="20"/>
                 <w:szCs w:val="20"/>
               </w:rPr>
-              <w:t>Emissão inicial</w:t>
+              <w:t>{rev_motivo}{/revisoes}</w:t>
             </w:r>
           </w:p>
         </w:tc>

</xml_diff>

<commit_message>
fix(comercial): proposta — justificar descrições (1.2.x) + CC com e-mails livres
- Descrições dos serviços (1.2.1 etc.) ficavam à esquerda enquanto as demais
  cláusulas são justificadas: corpo "Normal" sem alinhamento agora vai
  justificado, igual ao resto.
- Modal de envio: além do checklist do comercial, dá pra digitar e adicionar
  e-mails avulsos (validados) e removê-los — pra mandar a proposta a quem
  quiser além do cliente.

Co-Authored-By: Claude Opus 4.8 (1M context) <noreply@anthropic.com>
</commit_message>
<xml_diff>
--- a/templates/proposta-servico.docx
+++ b/templates/proposta-servico.docx
@@ -1473,15 +1473,17 @@
     </w:p>
     <w:p>
       <w:pPr>
-        <w:rPr>
-          <w:rFonts w:ascii="Arial" w:hAnsi="Arial" w:cs="Arial"/>
-          <w:sz w:val="20"/>
-          <w:color w:val="000000"/>
-        </w:rPr>
-      </w:pPr>
-    </w:p>
-    <w:p>
-      <w:pPr>
+        <w:jc w:val="both"/>
+        <w:rPr>
+          <w:rFonts w:ascii="Arial" w:hAnsi="Arial" w:cs="Arial"/>
+          <w:sz w:val="20"/>
+          <w:color w:val="000000"/>
+        </w:rPr>
+      </w:pPr>
+    </w:p>
+    <w:p>
+      <w:pPr>
+        <w:jc w:val="both"/>
         <w:rPr>
           <w:rFonts w:ascii="Arial" w:hAnsi="Arial" w:cs="Arial"/>
           <w:sz w:val="20"/>
@@ -1517,15 +1519,17 @@
     </w:p>
     <w:p>
       <w:pPr>
-        <w:rPr>
-          <w:rFonts w:ascii="Arial" w:hAnsi="Arial" w:cs="Arial"/>
-          <w:sz w:val="20"/>
-          <w:color w:val="000000"/>
-        </w:rPr>
-      </w:pPr>
-    </w:p>
-    <w:p>
-      <w:pPr>
+        <w:jc w:val="both"/>
+        <w:rPr>
+          <w:rFonts w:ascii="Arial" w:hAnsi="Arial" w:cs="Arial"/>
+          <w:sz w:val="20"/>
+          <w:color w:val="000000"/>
+        </w:rPr>
+      </w:pPr>
+    </w:p>
+    <w:p>
+      <w:pPr>
+        <w:jc w:val="both"/>
         <w:rPr>
           <w:rFonts w:ascii="Arial" w:hAnsi="Arial" w:cs="Arial"/>
           <w:sz w:val="20"/>
@@ -1543,6 +1547,7 @@
     </w:p>
     <w:p>
       <w:pPr>
+        <w:jc w:val="both"/>
         <w:rPr>
           <w:rFonts w:ascii="Arial" w:hAnsi="Arial" w:cs="Arial"/>
           <w:sz w:val="20"/>
@@ -1576,6 +1581,7 @@
     </w:p>
     <w:p>
       <w:pPr>
+        <w:jc w:val="both"/>
         <w:rPr>
           <w:rFonts w:ascii="Arial" w:hAnsi="Arial" w:cs="Arial"/>
           <w:sz w:val="20"/>
@@ -1593,6 +1599,7 @@
     </w:p>
     <w:p>
       <w:pPr>
+        <w:jc w:val="both"/>
         <w:rPr>
           <w:rFonts w:ascii="Arial" w:hAnsi="Arial" w:cs="Arial"/>
           <w:sz w:val="20"/>
@@ -1663,6 +1670,7 @@
     </w:p>
     <w:p>
       <w:pPr>
+        <w:jc w:val="both"/>
         <w:rPr>
           <w:rFonts w:ascii="Arial" w:hAnsi="Arial" w:cs="Arial"/>
           <w:sz w:val="20"/>
@@ -1708,15 +1716,17 @@
     </w:p>
     <w:p>
       <w:pPr>
-        <w:rPr>
-          <w:rFonts w:ascii="Arial" w:hAnsi="Arial" w:cs="Arial"/>
-          <w:sz w:val="20"/>
-          <w:color w:val="000000"/>
-        </w:rPr>
-      </w:pPr>
-    </w:p>
-    <w:p>
-      <w:pPr>
+        <w:jc w:val="both"/>
+        <w:rPr>
+          <w:rFonts w:ascii="Arial" w:hAnsi="Arial" w:cs="Arial"/>
+          <w:sz w:val="20"/>
+          <w:color w:val="000000"/>
+        </w:rPr>
+      </w:pPr>
+    </w:p>
+    <w:p>
+      <w:pPr>
+        <w:jc w:val="both"/>
         <w:rPr>
           <w:rFonts w:ascii="Arial" w:hAnsi="Arial" w:cs="Arial"/>
           <w:sz w:val="20"/>
@@ -1734,15 +1744,17 @@
     </w:p>
     <w:p>
       <w:pPr>
-        <w:rPr>
-          <w:rFonts w:ascii="Arial" w:hAnsi="Arial" w:cs="Arial"/>
-          <w:sz w:val="20"/>
-          <w:color w:val="000000"/>
-        </w:rPr>
-      </w:pPr>
-    </w:p>
-    <w:p>
-      <w:pPr>
+        <w:jc w:val="both"/>
+        <w:rPr>
+          <w:rFonts w:ascii="Arial" w:hAnsi="Arial" w:cs="Arial"/>
+          <w:sz w:val="20"/>
+          <w:color w:val="000000"/>
+        </w:rPr>
+      </w:pPr>
+    </w:p>
+    <w:p>
+      <w:pPr>
+        <w:jc w:val="both"/>
         <w:rPr>
           <w:rFonts w:ascii="Arial" w:hAnsi="Arial" w:cs="Arial"/>
           <w:sz w:val="20"/>
@@ -1760,6 +1772,7 @@
     </w:p>
     <w:p>
       <w:pPr>
+        <w:jc w:val="both"/>
         <w:rPr>
           <w:rFonts w:ascii="Arial" w:hAnsi="Arial" w:cs="Arial"/>
           <w:sz w:val="20"/>
@@ -1777,6 +1790,7 @@
     </w:p>
     <w:p>
       <w:pPr>
+        <w:jc w:val="both"/>
         <w:rPr>
           <w:rFonts w:ascii="Arial" w:hAnsi="Arial" w:cs="Arial"/>
           <w:sz w:val="20"/>
@@ -1853,6 +1867,7 @@
     </w:p>
     <w:p>
       <w:pPr>
+        <w:jc w:val="both"/>
         <w:rPr>
           <w:rFonts w:ascii="Arial" w:hAnsi="Arial" w:cs="Arial"/>
           <w:sz w:val="20"/>
@@ -1891,15 +1906,17 @@
     </w:p>
     <w:p>
       <w:pPr>
-        <w:rPr>
-          <w:rFonts w:ascii="Arial" w:hAnsi="Arial" w:cs="Arial"/>
-          <w:sz w:val="20"/>
-          <w:color w:val="000000"/>
-        </w:rPr>
-      </w:pPr>
-    </w:p>
-    <w:p>
-      <w:pPr>
+        <w:jc w:val="both"/>
+        <w:rPr>
+          <w:rFonts w:ascii="Arial" w:hAnsi="Arial" w:cs="Arial"/>
+          <w:sz w:val="20"/>
+          <w:color w:val="000000"/>
+        </w:rPr>
+      </w:pPr>
+    </w:p>
+    <w:p>
+      <w:pPr>
+        <w:jc w:val="both"/>
         <w:rPr>
           <w:rFonts w:ascii="Arial" w:hAnsi="Arial" w:cs="Arial"/>
           <w:sz w:val="20"/>
@@ -1917,15 +1934,17 @@
     </w:p>
     <w:p>
       <w:pPr>
-        <w:rPr>
-          <w:rFonts w:ascii="Arial" w:hAnsi="Arial" w:cs="Arial"/>
-          <w:sz w:val="20"/>
-          <w:color w:val="000000"/>
-        </w:rPr>
-      </w:pPr>
-    </w:p>
-    <w:p>
-      <w:pPr>
+        <w:jc w:val="both"/>
+        <w:rPr>
+          <w:rFonts w:ascii="Arial" w:hAnsi="Arial" w:cs="Arial"/>
+          <w:sz w:val="20"/>
+          <w:color w:val="000000"/>
+        </w:rPr>
+      </w:pPr>
+    </w:p>
+    <w:p>
+      <w:pPr>
+        <w:jc w:val="both"/>
         <w:rPr>
           <w:rFonts w:ascii="Arial" w:hAnsi="Arial" w:cs="Arial"/>
           <w:sz w:val="20"/>
@@ -1943,6 +1962,7 @@
     </w:p>
     <w:p>
       <w:pPr>
+        <w:jc w:val="both"/>
         <w:rPr>
           <w:rFonts w:ascii="Arial" w:hAnsi="Arial" w:cs="Arial"/>
           <w:sz w:val="20"/>
@@ -1960,6 +1980,7 @@
     </w:p>
     <w:p>
       <w:pPr>
+        <w:jc w:val="both"/>
         <w:rPr>
           <w:rFonts w:ascii="Arial" w:hAnsi="Arial" w:cs="Arial"/>
           <w:sz w:val="20"/>
@@ -2036,6 +2057,7 @@
     </w:p>
     <w:p>
       <w:pPr>
+        <w:jc w:val="both"/>
         <w:rPr>
           <w:rFonts w:ascii="Arial" w:hAnsi="Arial" w:cs="Arial"/>
           <w:sz w:val="20"/>
@@ -2074,15 +2096,17 @@
     </w:p>
     <w:p>
       <w:pPr>
-        <w:rPr>
-          <w:rFonts w:ascii="Arial" w:hAnsi="Arial" w:cs="Arial"/>
-          <w:sz w:val="20"/>
-          <w:color w:val="000000"/>
-        </w:rPr>
-      </w:pPr>
-    </w:p>
-    <w:p>
-      <w:pPr>
+        <w:jc w:val="both"/>
+        <w:rPr>
+          <w:rFonts w:ascii="Arial" w:hAnsi="Arial" w:cs="Arial"/>
+          <w:sz w:val="20"/>
+          <w:color w:val="000000"/>
+        </w:rPr>
+      </w:pPr>
+    </w:p>
+    <w:p>
+      <w:pPr>
+        <w:jc w:val="both"/>
         <w:rPr>
           <w:rFonts w:ascii="Arial" w:hAnsi="Arial" w:cs="Arial"/>
           <w:sz w:val="20"/>
@@ -2100,15 +2124,17 @@
     </w:p>
     <w:p>
       <w:pPr>
-        <w:rPr>
-          <w:rFonts w:ascii="Arial" w:hAnsi="Arial" w:cs="Arial"/>
-          <w:sz w:val="20"/>
-          <w:color w:val="000000"/>
-        </w:rPr>
-      </w:pPr>
-    </w:p>
-    <w:p>
-      <w:pPr>
+        <w:jc w:val="both"/>
+        <w:rPr>
+          <w:rFonts w:ascii="Arial" w:hAnsi="Arial" w:cs="Arial"/>
+          <w:sz w:val="20"/>
+          <w:color w:val="000000"/>
+        </w:rPr>
+      </w:pPr>
+    </w:p>
+    <w:p>
+      <w:pPr>
+        <w:jc w:val="both"/>
         <w:rPr>
           <w:rFonts w:ascii="Arial" w:hAnsi="Arial" w:cs="Arial"/>
           <w:sz w:val="20"/>
@@ -2126,6 +2152,7 @@
     </w:p>
     <w:p>
       <w:pPr>
+        <w:jc w:val="both"/>
         <w:rPr>
           <w:rFonts w:ascii="Arial" w:hAnsi="Arial" w:cs="Arial"/>
           <w:sz w:val="20"/>
@@ -2143,6 +2170,7 @@
     </w:p>
     <w:p>
       <w:pPr>
+        <w:jc w:val="both"/>
         <w:rPr>
           <w:rFonts w:ascii="Arial" w:hAnsi="Arial" w:cs="Arial"/>
           <w:sz w:val="20"/>
@@ -2178,6 +2206,7 @@
     </w:p>
     <w:p>
       <w:pPr>
+        <w:jc w:val="both"/>
         <w:rPr>
           <w:rFonts w:ascii="Arial" w:hAnsi="Arial" w:cs="Arial"/>
           <w:sz w:val="20"/>
@@ -2213,6 +2242,7 @@
     </w:p>
     <w:p>
       <w:pPr>
+        <w:jc w:val="both"/>
         <w:rPr>
           <w:rFonts w:ascii="Arial" w:hAnsi="Arial" w:cs="Arial"/>
           <w:sz w:val="20"/>
@@ -2248,6 +2278,7 @@
     </w:p>
     <w:p>
       <w:pPr>
+        <w:jc w:val="both"/>
         <w:rPr>
           <w:rFonts w:ascii="Arial" w:hAnsi="Arial" w:cs="Arial"/>
           <w:sz w:val="20"/>
@@ -2265,6 +2296,7 @@
     </w:p>
     <w:p>
       <w:pPr>
+        <w:jc w:val="both"/>
         <w:rPr>
           <w:rFonts w:ascii="Arial" w:hAnsi="Arial" w:cs="Arial"/>
           <w:sz w:val="20"/>
@@ -2341,6 +2373,7 @@
     </w:p>
     <w:p>
       <w:pPr>
+        <w:jc w:val="both"/>
         <w:rPr>
           <w:rFonts w:ascii="Arial" w:hAnsi="Arial" w:cs="Arial"/>
           <w:sz w:val="20"/>
@@ -3400,6 +3433,7 @@
     </w:p>
     <w:p>
       <w:pPr>
+        <w:jc w:val="both"/>
         <w:rPr>
           <w:rFonts w:ascii="Arial" w:hAnsi="Arial" w:cs="Arial"/>
           <w:sz w:val="20"/>
@@ -3807,15 +3841,17 @@
     </w:tbl>
     <w:p>
       <w:pPr>
-        <w:rPr>
-          <w:rFonts w:ascii="Arial" w:hAnsi="Arial" w:cs="Arial"/>
-          <w:sz w:val="20"/>
-          <w:color w:val="000000"/>
-        </w:rPr>
-      </w:pPr>
-    </w:p>
-    <w:p>
-      <w:pPr>
+        <w:jc w:val="both"/>
+        <w:rPr>
+          <w:rFonts w:ascii="Arial" w:hAnsi="Arial" w:cs="Arial"/>
+          <w:sz w:val="20"/>
+          <w:color w:val="000000"/>
+        </w:rPr>
+      </w:pPr>
+    </w:p>
+    <w:p>
+      <w:pPr>
+        <w:jc w:val="both"/>
         <w:rPr>
           <w:rFonts w:ascii="Arial" w:hAnsi="Arial" w:cs="Arial"/>
           <w:sz w:val="20"/>

</xml_diff>